<commit_message>
Add revised endurance simulation
</commit_message>
<xml_diff>
--- a/paper/[Opt. Express] Design and Simulation of a Broadband Tunable Transmittance Optical Filter Using Sb2Se3 Phase Change Material.docx
+++ b/paper/[Opt. Express] Design and Simulation of a Broadband Tunable Transmittance Optical Filter Using Sb2Se3 Phase Change Material.docx
@@ -11,6 +11,130 @@
       </w:pPr>
       <w:r>
         <w:rPr>
+          <w:rStyle w:val="Emphasis"/>
+          <w:rFonts w:cs="Times New Roman"/>
+          <w:i w:val="0"/>
+          <w:iCs w:val="0"/>
+          <w:noProof/>
+        </w:rPr>
+        <mc:AlternateContent>
+          <mc:Choice Requires="wps">
+            <w:drawing>
+              <wp:anchor distT="45720" distB="45720" distL="114300" distR="114300" simplePos="0" relativeHeight="251659264" behindDoc="0" locked="0" layoutInCell="1" allowOverlap="1" wp14:anchorId="47919A1C" wp14:editId="77C0DC2B">
+                <wp:simplePos x="0" y="0"/>
+                <wp:positionH relativeFrom="column">
+                  <wp:posOffset>-1414145</wp:posOffset>
+                </wp:positionH>
+                <wp:positionV relativeFrom="paragraph">
+                  <wp:posOffset>-1156970</wp:posOffset>
+                </wp:positionV>
+                <wp:extent cx="1517650" cy="971550"/>
+                <wp:effectExtent l="0" t="0" r="25400" b="19050"/>
+                <wp:wrapNone/>
+                <wp:docPr id="217" name="Text Box 2"/>
+                <wp:cNvGraphicFramePr>
+                  <a:graphicFrameLocks xmlns:a="http://schemas.openxmlformats.org/drawingml/2006/main"/>
+                </wp:cNvGraphicFramePr>
+                <a:graphic xmlns:a="http://schemas.openxmlformats.org/drawingml/2006/main">
+                  <a:graphicData uri="http://schemas.microsoft.com/office/word/2010/wordprocessingShape">
+                    <wps:wsp>
+                      <wps:cNvSpPr txBox="1">
+                        <a:spLocks noChangeArrowheads="1"/>
+                      </wps:cNvSpPr>
+                      <wps:spPr bwMode="auto">
+                        <a:xfrm>
+                          <a:off x="0" y="0"/>
+                          <a:ext cx="1517650" cy="971550"/>
+                        </a:xfrm>
+                        <a:prstGeom prst="rect">
+                          <a:avLst/>
+                        </a:prstGeom>
+                        <a:ln>
+                          <a:headEnd/>
+                          <a:tailEnd/>
+                        </a:ln>
+                      </wps:spPr>
+                      <wps:style>
+                        <a:lnRef idx="2">
+                          <a:schemeClr val="accent5"/>
+                        </a:lnRef>
+                        <a:fillRef idx="1">
+                          <a:schemeClr val="lt1"/>
+                        </a:fillRef>
+                        <a:effectRef idx="0">
+                          <a:schemeClr val="accent5"/>
+                        </a:effectRef>
+                        <a:fontRef idx="minor">
+                          <a:schemeClr val="dk1"/>
+                        </a:fontRef>
+                      </wps:style>
+                      <wps:txbx>
+                        <w:txbxContent>
+                          <w:p>
+                            <w:r>
+                              <w:t>To do:</w:t>
+                            </w:r>
+                          </w:p>
+                          <w:p>
+                            <w:r>
+                              <w:t>1. reduce to 15 pages</w:t>
+                            </w:r>
+                          </w:p>
+                          <w:p>
+                            <w:r>
+                              <w:t>2. Section 4.2</w:t>
+                            </w:r>
+                          </w:p>
+                        </w:txbxContent>
+                      </wps:txbx>
+                      <wps:bodyPr rot="0" vert="horz" wrap="square" lIns="91440" tIns="45720" rIns="91440" bIns="45720" anchor="t" anchorCtr="0">
+                        <a:noAutofit/>
+                      </wps:bodyPr>
+                    </wps:wsp>
+                  </a:graphicData>
+                </a:graphic>
+                <wp14:sizeRelH relativeFrom="margin">
+                  <wp14:pctWidth>0</wp14:pctWidth>
+                </wp14:sizeRelH>
+                <wp14:sizeRelV relativeFrom="margin">
+                  <wp14:pctHeight>0</wp14:pctHeight>
+                </wp14:sizeRelV>
+              </wp:anchor>
+            </w:drawing>
+          </mc:Choice>
+          <mc:Fallback>
+            <w:pict>
+              <v:shapetype w14:anchorId="47919A1C" id="_x0000_t202" coordsize="21600,21600" o:spt="202" path="m,l,21600r21600,l21600,xe">
+                <v:stroke joinstyle="miter"/>
+                <v:path gradientshapeok="t" o:connecttype="rect"/>
+              </v:shapetype>
+              <v:shape id="Text Box 2" o:spid="_x0000_s1026" type="#_x0000_t202" style="position:absolute;margin-left:-111.35pt;margin-top:-91.1pt;width:119.5pt;height:76.5pt;z-index:251659264;visibility:visible;mso-wrap-style:square;mso-width-percent:0;mso-height-percent:0;mso-wrap-distance-left:9pt;mso-wrap-distance-top:3.6pt;mso-wrap-distance-right:9pt;mso-wrap-distance-bottom:3.6pt;mso-position-horizontal:absolute;mso-position-horizontal-relative:text;mso-position-vertical:absolute;mso-position-vertical-relative:text;mso-width-percent:0;mso-height-percent:0;mso-width-relative:margin;mso-height-relative:margin;v-text-anchor:top" o:gfxdata="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" fillcolor="white [3201]" strokecolor="#4bacc6 [3208]" strokeweight="2pt">
+                <v:textbox>
+                  <w:txbxContent>
+                    <w:p>
+                      <w:r>
+                        <w:t>To do:</w:t>
+                      </w:r>
+                    </w:p>
+                    <w:p>
+                      <w:r>
+                        <w:t>1. reduce to 15 pages</w:t>
+                      </w:r>
+                    </w:p>
+                    <w:p>
+                      <w:r>
+                        <w:t>2. Section 4.2</w:t>
+                      </w:r>
+                    </w:p>
+                  </w:txbxContent>
+                </v:textbox>
+              </v:shape>
+            </w:pict>
+          </mc:Fallback>
+        </mc:AlternateContent>
+      </w:r>
+      <w:r>
+        <w:rPr>
           <w:rFonts w:ascii="Times New Roman" w:hAnsi="Times New Roman" w:cs="Times New Roman"/>
         </w:rPr>
         <w:t xml:space="preserve">Design and </w:t>
@@ -50,6 +174,12 @@
           <w:rFonts w:ascii="Times New Roman" w:hAnsi="Times New Roman" w:cs="Times New Roman"/>
         </w:rPr>
         <w:t xml:space="preserve">unable </w:t>
+      </w:r>
+      <w:r>
+        <w:rPr>
+          <w:rFonts w:ascii="Times New Roman" w:hAnsi="Times New Roman" w:cs="Times New Roman"/>
+        </w:rPr>
+        <w:t xml:space="preserve"> </w:t>
       </w:r>
       <w:r>
         <w:rPr>
@@ -248,43 +378,34 @@
       <w:r>
         <w:rPr>
           <w:rFonts w:ascii="Times New Roman" w:hAnsi="Times New Roman" w:cs="Times New Roman"/>
-          <w:highlight w:val="yellow"/>
         </w:rPr>
         <w:t>Nathan Hagen,</w:t>
-      </w:r>
-      <w:r>
-        <w:rPr>
-          <w:rFonts w:ascii="Times New Roman" w:hAnsi="Times New Roman" w:cs="Times New Roman"/>
-          <w:highlight w:val="yellow"/>
-          <w:vertAlign w:val="superscript"/>
-        </w:rPr>
-        <w:t>4</w:t>
-      </w:r>
-      <w:r>
-        <w:rPr>
-          <w:rFonts w:ascii="Times New Roman" w:hAnsi="Times New Roman" w:cs="Times New Roman"/>
-        </w:rPr>
-        <w:t xml:space="preserve"> </w:t>
-      </w:r>
-      <w:r>
-        <w:rPr>
-          <w:rFonts w:ascii="Times New Roman" w:hAnsi="Times New Roman" w:cs="Times New Roman"/>
-        </w:rPr>
-        <w:t xml:space="preserve">and </w:t>
-      </w:r>
-      <w:bookmarkStart w:id="0" w:name="_Hlk173847223"/>
-      <w:r>
-        <w:rPr>
-          <w:rFonts w:ascii="Times New Roman" w:hAnsi="Times New Roman" w:cs="Times New Roman"/>
-        </w:rPr>
-        <w:t>Prathan Buranasiri</w:t>
       </w:r>
       <w:r>
         <w:rPr>
           <w:rFonts w:ascii="Times New Roman" w:hAnsi="Times New Roman" w:cs="Times New Roman"/>
           <w:vertAlign w:val="superscript"/>
         </w:rPr>
-        <w:t>,</w:t>
+        <w:t>4</w:t>
+      </w:r>
+      <w:r>
+        <w:rPr>
+          <w:rFonts w:ascii="Times New Roman" w:hAnsi="Times New Roman" w:cs="Times New Roman"/>
+        </w:rPr>
+        <w:t xml:space="preserve"> </w:t>
+      </w:r>
+      <w:r>
+        <w:rPr>
+          <w:rFonts w:ascii="Times New Roman" w:hAnsi="Times New Roman" w:cs="Times New Roman"/>
+        </w:rPr>
+        <w:t xml:space="preserve">and </w:t>
+      </w:r>
+      <w:bookmarkStart w:id="0" w:name="_Hlk173847223"/>
+      <w:r>
+        <w:rPr>
+          <w:rFonts w:ascii="Times New Roman" w:hAnsi="Times New Roman" w:cs="Times New Roman"/>
+        </w:rPr>
+        <w:t>Prathan Buranasiri</w:t>
       </w:r>
       <w:r>
         <w:rPr>
@@ -370,12 +491,13 @@
         <w:pStyle w:val="04Email"/>
         <w:rPr>
           <w:rFonts w:cs="Times New Roman"/>
+          <w:color w:val="auto"/>
         </w:rPr>
       </w:pPr>
       <w:r>
         <w:rPr>
           <w:rFonts w:cs="Times New Roman"/>
-          <w:highlight w:val="yellow"/>
+          <w:color w:val="auto"/>
           <w:vertAlign w:val="superscript"/>
         </w:rPr>
         <w:t>4</w:t>
@@ -383,9 +505,9 @@
       <w:r>
         <w:rPr>
           <w:rFonts w:cs="Times New Roman"/>
-          <w:highlight w:val="yellow"/>
-        </w:rPr>
-        <w:t xml:space="preserve"> XXX</w:t>
+          <w:color w:val="auto"/>
+        </w:rPr>
+        <w:t xml:space="preserve"> Center of Optical Research and Education &amp; School of Engineering, Utsunomiya University, Utsunomiya, Japan.</w:t>
       </w:r>
     </w:p>
     <w:p>
@@ -411,9 +533,6 @@
     <w:p>
       <w:pPr>
         <w:pStyle w:val="09BodyFirstParagraph"/>
-        <w:rPr>
-          <w:rFonts w:cs="Times New Roman"/>
-        </w:rPr>
       </w:pPr>
       <w:r>
         <w:rPr>
@@ -432,13 +551,159 @@
         <w:rPr>
           <w:rStyle w:val="06AbstractBodyChar"/>
         </w:rPr>
-        <w:t xml:space="preserve">We propose a switchable optical filter design using antimony triselenide (Sb2Se3) to operate around 1064-nm wavelength. Sb2Se3 is a phase change material (PCM) which has low absorption in infrared (IR) spectrum, has high and stable refractive index contrast between the two phases from visible through IR spectrum, and a high phase switching optical endurance in an order of 106 cycles. We give the reasoning for selecting long-pass edge filter design and compares its performance to other planar thin-film designs. At 1064-nm, the selected 5-unit-cells edge-filter design has an transmittance of 93.6% in amorphous phase and 0.2% in crystalline phase, a 93.4% transmittance contrast with ~200 nm FWHM, and has minimal degradation after enduring over 1.5×10⁶ phase switching cycles. We also show the tunability of this design and increase the optical performance across 900-1200 nm range using a simple optimization. </w:t>
+        <w:t xml:space="preserve">We propose a </w:t>
       </w:r>
       <w:r>
         <w:rPr>
           <w:rStyle w:val="06AbstractBodyChar"/>
         </w:rPr>
-        <w:t>Introduction</w:t>
+        <w:t>switchable</w:t>
+      </w:r>
+      <w:r>
+        <w:rPr>
+          <w:rStyle w:val="06AbstractBodyChar"/>
+        </w:rPr>
+        <w:t xml:space="preserve"> optical filter design to </w:t>
+      </w:r>
+      <w:r>
+        <w:rPr>
+          <w:rStyle w:val="06AbstractBodyChar"/>
+        </w:rPr>
+        <w:t xml:space="preserve">be </w:t>
+      </w:r>
+      <w:r>
+        <w:rPr>
+          <w:rStyle w:val="06AbstractBodyChar"/>
+        </w:rPr>
+        <w:t>operated</w:t>
+      </w:r>
+      <w:r>
+        <w:rPr>
+          <w:rStyle w:val="06AbstractBodyChar"/>
+        </w:rPr>
+        <w:t xml:space="preserve"> around 1064-nm wavelength</w:t>
+      </w:r>
+      <w:r>
+        <w:rPr>
+          <w:rStyle w:val="06AbstractBodyChar"/>
+        </w:rPr>
+        <w:t xml:space="preserve">s </w:t>
+      </w:r>
+      <w:r>
+        <w:rPr>
+          <w:rStyle w:val="06AbstractBodyChar"/>
+        </w:rPr>
+        <w:t>using antimony triselenide (Sb2Se3)</w:t>
+      </w:r>
+      <w:r>
+        <w:rPr>
+          <w:rStyle w:val="06AbstractBodyChar"/>
+        </w:rPr>
+        <w:t xml:space="preserve">. Sb2Se3 is a phase change material (PCM) which has low absorption in infrared (IR) spectrum, high and stable refractive index contrast between the two phases from visible through IR spectrum, and a high optical endurance in an order of 106 cycles. We give the reasoning for selecting long-pass edge filter design and compares its performance to other </w:t>
+      </w:r>
+      <w:r>
+        <w:rPr>
+          <w:rStyle w:val="06AbstractBodyChar"/>
+        </w:rPr>
+        <w:t xml:space="preserve">common </w:t>
+      </w:r>
+      <w:r>
+        <w:rPr>
+          <w:rStyle w:val="06AbstractBodyChar"/>
+        </w:rPr>
+        <w:t xml:space="preserve">planar thin-film designs. At 1064-nm, the selected 5-unit-cells edge-filter design has 93.6% </w:t>
+      </w:r>
+      <w:r>
+        <w:rPr>
+          <w:rStyle w:val="06AbstractBodyChar"/>
+        </w:rPr>
+        <w:t xml:space="preserve">transmittance </w:t>
+      </w:r>
+      <w:r>
+        <w:rPr>
+          <w:rStyle w:val="06AbstractBodyChar"/>
+        </w:rPr>
+        <w:t xml:space="preserve">in amorphous phase and 0.2% in crystalline phase, a 93.4% transmittance contrast with ~200 nm FWHM, </w:t>
+      </w:r>
+      <w:r>
+        <w:rPr>
+          <w:rStyle w:val="06AbstractBodyChar"/>
+        </w:rPr>
+        <w:t>with</w:t>
+      </w:r>
+      <w:r>
+        <w:rPr>
+          <w:rStyle w:val="06AbstractBodyChar"/>
+        </w:rPr>
+        <w:t xml:space="preserve"> minimal</w:t>
+      </w:r>
+      <w:r>
+        <w:rPr>
+          <w:rStyle w:val="06AbstractBodyChar"/>
+        </w:rPr>
+        <w:t xml:space="preserve"> optical</w:t>
+      </w:r>
+      <w:r>
+        <w:rPr>
+          <w:rStyle w:val="06AbstractBodyChar"/>
+        </w:rPr>
+        <w:t xml:space="preserve"> degradation after enduring over 1.5×10⁶ phase switching cycles. We also show the tunability of this design </w:t>
+      </w:r>
+      <w:r>
+        <w:rPr>
+          <w:rStyle w:val="06AbstractBodyChar"/>
+        </w:rPr>
+        <w:t xml:space="preserve">by phase transition of </w:t>
+      </w:r>
+      <w:r>
+        <w:rPr>
+          <w:rStyle w:val="06AbstractBodyChar"/>
+        </w:rPr>
+        <w:t>each Sb</w:t>
+      </w:r>
+      <w:r>
+        <w:rPr>
+          <w:rStyle w:val="06AbstractBodyChar"/>
+          <w:vertAlign w:val="subscript"/>
+        </w:rPr>
+        <w:t>2</w:t>
+      </w:r>
+      <w:r>
+        <w:rPr>
+          <w:rStyle w:val="06AbstractBodyChar"/>
+        </w:rPr>
+        <w:t>Se</w:t>
+      </w:r>
+      <w:r>
+        <w:rPr>
+          <w:rStyle w:val="06AbstractBodyChar"/>
+          <w:vertAlign w:val="subscript"/>
+        </w:rPr>
+        <w:t>3</w:t>
+      </w:r>
+      <w:r>
+        <w:rPr>
+          <w:rStyle w:val="06AbstractBodyChar"/>
+        </w:rPr>
+        <w:t xml:space="preserve"> </w:t>
+      </w:r>
+      <w:r>
+        <w:rPr>
+          <w:rStyle w:val="06AbstractBodyChar"/>
+        </w:rPr>
+        <w:t>layer and</w:t>
+      </w:r>
+      <w:r>
+        <w:rPr>
+          <w:rStyle w:val="06AbstractBodyChar"/>
+        </w:rPr>
+        <w:t xml:space="preserve"> increase the optical performance across 900-1200 nm range </w:t>
+      </w:r>
+      <w:r>
+        <w:rPr>
+          <w:rStyle w:val="06AbstractBodyChar"/>
+        </w:rPr>
+        <w:t>by optimizing each layer thickness.</w:t>
       </w:r>
     </w:p>
     <w:p>
@@ -2077,7 +2342,31 @@
         <w:rPr>
           <w:rFonts w:cs="Times New Roman"/>
         </w:rPr>
-        <w:t>. Non-volatile PCM can be turned back to its pre-transitioned phase by increasing the temperature to melting temperature and then quenched at a speed faster than the molecules can organize into crystal structure.</w:t>
+        <w:t xml:space="preserve">. Non-volatile PCM can be turned back to its pre-transitioned phase by melting </w:t>
+      </w:r>
+      <w:r>
+        <w:rPr>
+          <w:rFonts w:cs="Times New Roman"/>
+        </w:rPr>
+        <w:t>it</w:t>
+      </w:r>
+      <w:r>
+        <w:rPr>
+          <w:rFonts w:cs="Times New Roman"/>
+        </w:rPr>
+        <w:t xml:space="preserve"> and then quenched at a speed faster than the molecules can organize into </w:t>
+      </w:r>
+      <w:r>
+        <w:rPr>
+          <w:rFonts w:cs="Times New Roman"/>
+        </w:rPr>
+        <w:t>an orderly</w:t>
+      </w:r>
+      <w:r>
+        <w:rPr>
+          <w:rFonts w:cs="Times New Roman"/>
+        </w:rPr>
+        <w:t xml:space="preserve"> structure.</w:t>
       </w:r>
       <w:r>
         <w:rPr>
@@ -2089,7 +2378,31 @@
         <w:rPr>
           <w:rFonts w:cs="Times New Roman"/>
         </w:rPr>
-        <w:t xml:space="preserve">xamples of </w:t>
+        <w:t xml:space="preserve">xamples of non-volatile </w:t>
+      </w:r>
+      <w:r>
+        <w:rPr>
+          <w:rFonts w:cs="Times New Roman"/>
+        </w:rPr>
+        <w:t>PCMs</w:t>
+      </w:r>
+      <w:r>
+        <w:rPr>
+          <w:rFonts w:cs="Times New Roman"/>
+        </w:rPr>
+        <w:t xml:space="preserve"> </w:t>
+      </w:r>
+      <w:r>
+        <w:rPr>
+          <w:rFonts w:cs="Times New Roman"/>
+        </w:rPr>
+        <w:t>are</w:t>
+      </w:r>
+      <w:r>
+        <w:rPr>
+          <w:rFonts w:cs="Times New Roman"/>
+        </w:rPr>
+        <w:t xml:space="preserve"> </w:t>
       </w:r>
       <w:r>
         <w:rPr>
@@ -2101,19 +2414,13 @@
         <w:rPr>
           <w:rFonts w:cs="Times New Roman"/>
         </w:rPr>
-        <w:t xml:space="preserve">glass </w:t>
-      </w:r>
-      <w:r>
-        <w:rPr>
-          <w:rFonts w:cs="Times New Roman"/>
-        </w:rPr>
-        <w:t xml:space="preserve">non-volatile phase change materials </w:t>
-      </w:r>
-      <w:r>
-        <w:rPr>
-          <w:rFonts w:cs="Times New Roman"/>
-        </w:rPr>
-        <w:t>are</w:t>
+        <w:t>glass</w:t>
+      </w:r>
+      <w:r>
+        <w:rPr>
+          <w:rFonts w:cs="Times New Roman"/>
+        </w:rPr>
+        <w:t>es called</w:t>
       </w:r>
       <w:r>
         <w:rPr>
@@ -2158,7 +2465,19 @@
         <w:rPr>
           <w:rFonts w:cs="Times New Roman"/>
         </w:rPr>
-        <w:t xml:space="preserve"> (GST) or Ge</w:t>
+        <w:t xml:space="preserve"> (GST) </w:t>
+      </w:r>
+      <w:r>
+        <w:rPr>
+          <w:rFonts w:cs="Times New Roman"/>
+        </w:rPr>
+        <w:t>and</w:t>
+      </w:r>
+      <w:r>
+        <w:rPr>
+          <w:rFonts w:cs="Times New Roman"/>
+        </w:rPr>
+        <w:t xml:space="preserve"> Ge</w:t>
       </w:r>
       <w:r>
         <w:rPr>
@@ -2197,7 +2516,19 @@
         <w:rPr>
           <w:rFonts w:cs="Times New Roman"/>
         </w:rPr>
-        <w:t xml:space="preserve">Te  (GSST), with GST being one of the earliest and most studied PCM </w:t>
+        <w:t>Te  (GSST)</w:t>
+      </w:r>
+      <w:r>
+        <w:rPr>
+          <w:rFonts w:cs="Times New Roman"/>
+        </w:rPr>
+        <w:t>. GST is one of the earliest and most studied PCM</w:t>
+      </w:r>
+      <w:r>
+        <w:rPr>
+          <w:rFonts w:cs="Times New Roman"/>
+        </w:rPr>
+        <w:t xml:space="preserve"> </w:t>
       </w:r>
       <w:r>
         <w:rPr>
@@ -2234,7 +2565,19 @@
         <w:rPr>
           <w:rFonts w:cs="Times New Roman"/>
         </w:rPr>
-        <w:t xml:space="preserve">. GST has large refractive index contrast between amorphous and crystalline phases, low </w:t>
+        <w:t>.</w:t>
+      </w:r>
+      <w:r>
+        <w:rPr>
+          <w:rFonts w:cs="Times New Roman"/>
+        </w:rPr>
+        <w:t xml:space="preserve"> It has large refractive index contrast between amorphous and </w:t>
+      </w:r>
+      <w:r>
+        <w:rPr>
+          <w:rFonts w:cs="Times New Roman"/>
+        </w:rPr>
+        <w:t xml:space="preserve">crystalline phases, low </w:t>
       </w:r>
       <w:r>
         <w:rPr>
@@ -2291,7 +2634,19 @@
         <w:rPr>
           <w:rFonts w:cs="Times New Roman"/>
         </w:rPr>
-        <w:t xml:space="preserve">~145 °C for cubical phase, and </w:t>
+        <w:t xml:space="preserve">~145 °C </w:t>
+      </w:r>
+      <w:r>
+        <w:rPr>
+          <w:rFonts w:cs="Times New Roman"/>
+        </w:rPr>
+        <w:t>to</w:t>
+      </w:r>
+      <w:r>
+        <w:rPr>
+          <w:rFonts w:cs="Times New Roman"/>
+        </w:rPr>
+        <w:t xml:space="preserve"> cubical phase, and </w:t>
       </w:r>
       <w:r>
         <w:rPr>
@@ -2314,7 +2669,19 @@
         <w:rPr>
           <w:rFonts w:cs="Times New Roman"/>
         </w:rPr>
-        <w:t xml:space="preserve"> ~200 °C for hexagonal phase </w:t>
+        <w:t xml:space="preserve"> ~200 °C </w:t>
+      </w:r>
+      <w:r>
+        <w:rPr>
+          <w:rFonts w:cs="Times New Roman"/>
+        </w:rPr>
+        <w:t>to</w:t>
+      </w:r>
+      <w:r>
+        <w:rPr>
+          <w:rFonts w:cs="Times New Roman"/>
+        </w:rPr>
+        <w:t xml:space="preserve"> hexagonal phase </w:t>
       </w:r>
       <w:r>
         <w:rPr>
@@ -2489,7 +2856,19 @@
         <w:rPr>
           <w:rFonts w:cs="Times New Roman"/>
         </w:rPr>
-        <w:t>. GST drawback is its large extinction coefficient in both visible and IR spectra which causes high loss from absorption. Meanwhile, GSST (Ge</w:t>
+        <w:t xml:space="preserve">. GST drawback is its large extinction coefficient in both visible and IR spectra which causes high </w:t>
+      </w:r>
+      <w:r>
+        <w:rPr>
+          <w:rFonts w:cs="Times New Roman"/>
+        </w:rPr>
+        <w:t xml:space="preserve">optical </w:t>
+      </w:r>
+      <w:r>
+        <w:rPr>
+          <w:rFonts w:cs="Times New Roman"/>
+        </w:rPr>
+        <w:t>loss from absorption. Meanwhile, GSST (Ge</w:t>
       </w:r>
       <w:r>
         <w:rPr>
@@ -2541,14 +2920,38 @@
         <w:rPr>
           <w:rFonts w:cs="Times New Roman"/>
         </w:rPr>
-        <w:t xml:space="preserve">) which is a derivative of GST that substitutes some part of tellurium with </w:t>
+        <w:t>)</w:t>
+      </w:r>
+      <w:r>
+        <w:rPr>
+          <w:rFonts w:cs="Times New Roman"/>
+        </w:rPr>
+        <w:t>,</w:t>
+      </w:r>
+      <w:r>
+        <w:rPr>
+          <w:rFonts w:cs="Times New Roman"/>
+        </w:rPr>
+        <w:t xml:space="preserve"> which is a derivative of GST that substitutes </w:t>
       </w:r>
       <w:r>
         <w:rPr>
           <w:rFonts w:cs="Times New Roman"/>
         </w:rPr>
         <w:lastRenderedPageBreak/>
-        <w:t xml:space="preserve">selenium also has large refractive index contrast but has a lower extinction coefficiency which helps increase the optical efficiency. But GSST has a higher </w:t>
+        <w:t>some part of tellurium with selenium</w:t>
+      </w:r>
+      <w:r>
+        <w:rPr>
+          <w:rFonts w:cs="Times New Roman"/>
+        </w:rPr>
+        <w:t>,</w:t>
+      </w:r>
+      <w:r>
+        <w:rPr>
+          <w:rFonts w:cs="Times New Roman"/>
+        </w:rPr>
+        <w:t xml:space="preserve"> also has large refractive index contrast but has a lower extinction coefficiency which helps increase the optical efficiency. But GSST has a higher </w:t>
       </w:r>
       <w:r>
         <w:rPr>
@@ -2608,7 +3011,31 @@
         <w:rPr>
           <w:rFonts w:cs="Times New Roman"/>
         </w:rPr>
-        <w:t>. An example of volatile PCM is vanadium dioxide (VO</w:t>
+        <w:t xml:space="preserve">. </w:t>
+      </w:r>
+      <w:r>
+        <w:rPr>
+          <w:rFonts w:cs="Times New Roman"/>
+        </w:rPr>
+        <w:t>An</w:t>
+      </w:r>
+      <w:r>
+        <w:rPr>
+          <w:rFonts w:cs="Times New Roman"/>
+        </w:rPr>
+        <w:t xml:space="preserve"> example of volatile PCM</w:t>
+      </w:r>
+      <w:r>
+        <w:rPr>
+          <w:rFonts w:cs="Times New Roman"/>
+        </w:rPr>
+        <w:t xml:space="preserve"> is</w:t>
+      </w:r>
+      <w:r>
+        <w:rPr>
+          <w:rFonts w:cs="Times New Roman"/>
+        </w:rPr>
+        <w:t xml:space="preserve"> vanadium dioxide (VO</w:t>
       </w:r>
       <w:r>
         <w:rPr>
@@ -2621,43 +3048,54 @@
         <w:rPr>
           <w:rFonts w:cs="Times New Roman"/>
         </w:rPr>
-        <w:t>). In the past 10 years, VO</w:t>
-      </w:r>
-      <w:r>
-        <w:rPr>
-          <w:rFonts w:cs="Times New Roman"/>
+        <w:t>)</w:t>
+      </w:r>
+      <w:r>
+        <w:rPr>
+          <w:rFonts w:cs="Times New Roman"/>
+        </w:rPr>
+        <w:t xml:space="preserve">, which in the past 10 years has gathered attention as a volatile PCM with </w:t>
+      </w:r>
+      <w:r>
+        <w:rPr>
+          <w:rFonts w:cs="Times New Roman"/>
+          <w:i/>
+          <w:iCs/>
+        </w:rPr>
+        <w:t>T</w:t>
+      </w:r>
+      <w:r>
+        <w:rPr>
+          <w:rFonts w:cs="Times New Roman"/>
+          <w:i/>
+          <w:iCs/>
           <w:vertAlign w:val="subscript"/>
         </w:rPr>
-        <w:t>2</w:t>
-      </w:r>
-      <w:r>
-        <w:rPr>
-          <w:rFonts w:cs="Times New Roman"/>
-        </w:rPr>
-        <w:t xml:space="preserve"> has gathered attention as a volatile PCM with </w:t>
-      </w:r>
-      <w:r>
-        <w:rPr>
-          <w:rFonts w:cs="Times New Roman"/>
-          <w:i/>
-          <w:iCs/>
-        </w:rPr>
-        <w:t>T</w:t>
-      </w:r>
-      <w:r>
-        <w:rPr>
-          <w:rFonts w:cs="Times New Roman"/>
-          <w:i/>
-          <w:iCs/>
-          <w:vertAlign w:val="subscript"/>
-        </w:rPr>
         <w:t>trans</w:t>
       </w:r>
       <w:r>
         <w:rPr>
           <w:rFonts w:cs="Times New Roman"/>
         </w:rPr>
-        <w:t xml:space="preserve"> closest to room temperature at 68 °C; it also has a relatively large refractive index contrast starting from near-IR (NIR), with small extinction coefficient (</w:t>
+        <w:t xml:space="preserve"> closest to room temperature at 68 °</w:t>
+      </w:r>
+      <w:r>
+        <w:rPr>
+          <w:rFonts w:cs="Times New Roman"/>
+        </w:rPr>
+        <w:t>.</w:t>
+      </w:r>
+      <w:r>
+        <w:rPr>
+          <w:rFonts w:cs="Times New Roman"/>
+        </w:rPr>
+        <w:t xml:space="preserve"> I</w:t>
+      </w:r>
+      <w:r>
+        <w:rPr>
+          <w:rFonts w:cs="Times New Roman"/>
+        </w:rPr>
+        <w:t>t also has a relatively large refractive index contrast starting from near-IR (NIR), with small extinction coefficient (</w:t>
       </w:r>
       <w:r>
         <w:rPr>
@@ -2767,14 +3205,66 @@
       <w:r>
         <w:rPr>
           <w:rFonts w:cs="Times New Roman"/>
-          <w:highlight w:val="yellow"/>
-        </w:rPr>
-        <w:t>only one review paper related to photonic applications of Sb</w:t>
-      </w:r>
-      <w:r>
-        <w:rPr>
-          <w:rFonts w:cs="Times New Roman"/>
-          <w:highlight w:val="yellow"/>
+        </w:rPr>
+        <w:t>t</w:t>
+      </w:r>
+      <w:r>
+        <w:rPr>
+          <w:rFonts w:cs="Times New Roman"/>
+        </w:rPr>
+        <w:t xml:space="preserve">he initial research is </w:t>
+      </w:r>
+      <w:r>
+        <w:rPr>
+          <w:rFonts w:cs="Times New Roman"/>
+        </w:rPr>
+        <w:t>in</w:t>
+      </w:r>
+      <w:r>
+        <w:rPr>
+          <w:rFonts w:cs="Times New Roman"/>
+        </w:rPr>
+        <w:t xml:space="preserve"> solar-energy applications</w:t>
+      </w:r>
+      <w:r>
+        <w:rPr>
+          <w:rFonts w:cs="Times New Roman"/>
+        </w:rPr>
+        <w:t>.</w:t>
+      </w:r>
+      <w:r>
+        <w:rPr>
+          <w:rFonts w:cs="Times New Roman"/>
+        </w:rPr>
+        <w:t xml:space="preserve"> </w:t>
+      </w:r>
+      <w:r>
+        <w:rPr>
+          <w:rFonts w:cs="Times New Roman"/>
+        </w:rPr>
+        <w:t>B</w:t>
+      </w:r>
+      <w:r>
+        <w:rPr>
+          <w:rFonts w:cs="Times New Roman"/>
+        </w:rPr>
+        <w:t>ut</w:t>
+      </w:r>
+      <w:r>
+        <w:rPr>
+          <w:rFonts w:cs="Times New Roman"/>
+        </w:rPr>
+        <w:t xml:space="preserve"> recently,</w:t>
+      </w:r>
+      <w:r>
+        <w:rPr>
+          <w:rFonts w:cs="Times New Roman"/>
+        </w:rPr>
+        <w:t xml:space="preserve"> Sb</w:t>
+      </w:r>
+      <w:r>
+        <w:rPr>
+          <w:rFonts w:cs="Times New Roman"/>
           <w:vertAlign w:val="subscript"/>
         </w:rPr>
         <w:t>2</w:t>
@@ -2782,14 +3272,12 @@
       <w:r>
         <w:rPr>
           <w:rFonts w:cs="Times New Roman"/>
-          <w:highlight w:val="yellow"/>
         </w:rPr>
         <w:t>Se</w:t>
       </w:r>
       <w:r>
         <w:rPr>
           <w:rFonts w:cs="Times New Roman"/>
-          <w:highlight w:val="yellow"/>
           <w:vertAlign w:val="subscript"/>
         </w:rPr>
         <w:t>3</w:t>
@@ -2797,117 +3285,20 @@
       <w:r>
         <w:rPr>
           <w:rFonts w:cs="Times New Roman"/>
-          <w:highlight w:val="yellow"/>
-        </w:rPr>
-        <w:t xml:space="preserve"> existed</w:t>
-      </w:r>
-      <w:r>
-        <w:rPr>
-          <w:rFonts w:cs="Times New Roman"/>
-        </w:rPr>
-        <w:t xml:space="preserve"> </w:t>
-      </w:r>
-      <w:r>
-        <w:rPr>
-          <w:rFonts w:cs="Times New Roman"/>
-        </w:rPr>
-        <w:fldChar w:fldCharType="begin"/>
-      </w:r>
-      <w:r>
-        <w:rPr>
-          <w:rFonts w:cs="Times New Roman"/>
-        </w:rPr>
-        <w:instrText xml:space="preserve"> ADDIN EN.CITE &lt;EndNote&gt;&lt;Cite&gt;&lt;Author&gt;Chen&lt;/Author&gt;&lt;Year&gt;2024&lt;/Year&gt;&lt;RecNum&gt;54&lt;/RecNum&gt;&lt;DisplayText&gt;[22]&lt;/DisplayText&gt;&lt;record&gt;&lt;rec-number&gt;54&lt;/rec-number&gt;&lt;foreign-keys&gt;&lt;key app="EN" db-id="v920pft06rp9dbex2ap500x99x5rrtswxzss" timestamp="1768052660" guid="91547ba4-338b-4531-8ff3-2a8d6ee4d5f7"&gt;54&lt;/key&gt;&lt;/foreign-keys&gt;&lt;ref-type name="Journal Article"&gt;17&lt;/ref-type&gt;&lt;contributors&gt;&lt;authors&gt;&lt;author&gt;Chen, Xiaojun&lt;/author&gt;&lt;author&gt;Lin, Jiao&lt;/author&gt;&lt;author&gt;Wang, Ke&lt;/author&gt;&lt;/authors&gt;&lt;/contributors&gt;&lt;titles&gt;&lt;title&gt;A Review of Integrated Photonic Devices Using Sb2Se3&lt;/title&gt;&lt;secondary-title&gt;Advanced Physics Research&lt;/secondary-title&gt;&lt;/titles&gt;&lt;periodical&gt;&lt;full-title&gt;Advanced Physics Research&lt;/full-title&gt;&lt;/periodical&gt;&lt;pages&gt;2400080&lt;/pages&gt;&lt;volume&gt;4&lt;/volume&gt;&lt;number&gt;1&lt;/number&gt;&lt;dates&gt;&lt;year&gt;2024&lt;/year&gt;&lt;/dates&gt;&lt;isbn&gt;2751-1200&amp;#xD;2751-1200&lt;/isbn&gt;&lt;urls&gt;&lt;related-urls&gt;&lt;url&gt;https://advanced.onlinelibrary.wiley.com/doi/abs/10.1002/apxr.202400080&lt;/url&gt;&lt;/related-urls&gt;&lt;/urls&gt;&lt;electronic-resource-num&gt;10.1002/apxr.202400080&lt;/electronic-resource-num&gt;&lt;/record&gt;&lt;/Cite&gt;&lt;/EndNote&gt;</w:instrText>
-      </w:r>
-      <w:r>
-        <w:rPr>
-          <w:rFonts w:cs="Times New Roman"/>
-        </w:rPr>
-        <w:fldChar w:fldCharType="separate"/>
-      </w:r>
-      <w:r>
-        <w:rPr>
-          <w:rFonts w:cs="Times New Roman"/>
-          <w:noProof/>
-        </w:rPr>
-        <w:t>[22]</w:t>
-      </w:r>
-      <w:r>
-        <w:rPr>
-          <w:rFonts w:cs="Times New Roman"/>
-        </w:rPr>
-        <w:fldChar w:fldCharType="end"/>
-      </w:r>
-      <w:r>
-        <w:rPr>
-          <w:rFonts w:cs="Times New Roman"/>
-        </w:rPr>
-        <w:t xml:space="preserve">. </w:t>
-      </w:r>
-      <w:r>
-        <w:rPr>
-          <w:rFonts w:cs="Times New Roman"/>
-          <w:highlight w:val="cyan"/>
-        </w:rPr>
-        <w:t>(recheck claims whether it’s still true).</w:t>
-      </w:r>
-      <w:r>
-        <w:rPr>
-          <w:rFonts w:cs="Times New Roman"/>
-        </w:rPr>
-        <w:t xml:space="preserve"> The initial research on Sb</w:t>
-      </w:r>
-      <w:r>
-        <w:rPr>
-          <w:rFonts w:cs="Times New Roman"/>
-          <w:vertAlign w:val="subscript"/>
-        </w:rPr>
-        <w:t>2</w:t>
-      </w:r>
-      <w:r>
-        <w:rPr>
-          <w:rFonts w:cs="Times New Roman"/>
-        </w:rPr>
-        <w:t>Se</w:t>
-      </w:r>
-      <w:r>
-        <w:rPr>
-          <w:rFonts w:cs="Times New Roman"/>
-          <w:vertAlign w:val="subscript"/>
-        </w:rPr>
-        <w:t>3</w:t>
-      </w:r>
-      <w:r>
-        <w:rPr>
-          <w:rFonts w:cs="Times New Roman"/>
-        </w:rPr>
-        <w:t xml:space="preserve"> is in solar-energy applications, but Sb</w:t>
-      </w:r>
-      <w:r>
-        <w:rPr>
-          <w:rFonts w:cs="Times New Roman"/>
-          <w:vertAlign w:val="subscript"/>
-        </w:rPr>
-        <w:t>2</w:t>
-      </w:r>
-      <w:r>
-        <w:rPr>
-          <w:rFonts w:cs="Times New Roman"/>
-        </w:rPr>
-        <w:t>Se</w:t>
-      </w:r>
-      <w:r>
-        <w:rPr>
-          <w:rFonts w:cs="Times New Roman"/>
-          <w:vertAlign w:val="subscript"/>
-        </w:rPr>
-        <w:t>3</w:t>
-      </w:r>
-      <w:r>
-        <w:rPr>
-          <w:rFonts w:cs="Times New Roman"/>
-        </w:rPr>
-        <w:t xml:space="preserve"> has recently gathered interest as a non-volatile PCM for photonic applications because of its near-zero extinction coefficient in the near-IR and IR spectra, its extinction coefficients are also lower than GST in the visible spectrum for both amorphous and crystalline phases, it has a high and stable refractive index contrast from visible to infrared spectra, and the transition temperature of Sb</w:t>
+        </w:rPr>
+        <w:t xml:space="preserve"> has gathered interest as a non-volatile PCM for photonic applications because of its near-zero </w:t>
+      </w:r>
+      <w:r>
+        <w:rPr>
+          <w:rFonts w:cs="Times New Roman"/>
+        </w:rPr>
+        <w:t>absorption</w:t>
+      </w:r>
+      <w:r>
+        <w:rPr>
+          <w:rFonts w:cs="Times New Roman"/>
+        </w:rPr>
+        <w:t xml:space="preserve"> in the near-IR and IR spectra, high and stable refractive index contrast from visible to infrared spectra, and the transition temperature of Sb</w:t>
       </w:r>
       <w:r>
         <w:rPr>
@@ -3076,7 +3467,19 @@
         <w:rPr>
           <w:rFonts w:cs="Times New Roman"/>
         </w:rPr>
-        <w:t>. Sb</w:t>
+        <w:t xml:space="preserve">. </w:t>
+      </w:r>
+      <w:r>
+        <w:rPr>
+          <w:rFonts w:cs="Times New Roman"/>
+        </w:rPr>
+        <w:t xml:space="preserve">Aside from these, </w:t>
+      </w:r>
+      <w:r>
+        <w:rPr>
+          <w:rFonts w:cs="Times New Roman"/>
+        </w:rPr>
+        <w:t>Sb</w:t>
       </w:r>
       <w:r>
         <w:rPr>
@@ -3102,7 +3505,31 @@
         <w:rPr>
           <w:rFonts w:cs="Times New Roman"/>
         </w:rPr>
-        <w:t xml:space="preserve"> has a fast switching speed in a microsecond range </w:t>
+        <w:t xml:space="preserve"> </w:t>
+      </w:r>
+      <w:r>
+        <w:rPr>
+          <w:rFonts w:cs="Times New Roman"/>
+        </w:rPr>
+        <w:t xml:space="preserve">also </w:t>
+      </w:r>
+      <w:r>
+        <w:rPr>
+          <w:rFonts w:cs="Times New Roman"/>
+        </w:rPr>
+        <w:t xml:space="preserve">has a fast </w:t>
+      </w:r>
+      <w:r>
+        <w:rPr>
+          <w:rFonts w:cs="Times New Roman"/>
+        </w:rPr>
+        <w:t>phase-</w:t>
+      </w:r>
+      <w:r>
+        <w:rPr>
+          <w:rFonts w:cs="Times New Roman"/>
+        </w:rPr>
+        <w:t xml:space="preserve">switching speed in a microsecond range </w:t>
       </w:r>
       <w:r>
         <w:rPr>
@@ -3289,7 +3716,13 @@
         <w:rPr>
           <w:rFonts w:cs="Times New Roman"/>
         </w:rPr>
-        <w:t>. Its phase-switching endurance is also high, with experimental demonstrations showing that it can reach as high as 10</w:t>
+        <w:t>, and i</w:t>
+      </w:r>
+      <w:r>
+        <w:rPr>
+          <w:rFonts w:cs="Times New Roman"/>
+        </w:rPr>
+        <w:t>ts phase-switching endurance is also high, with experimental demonstrations showing that it can reach as high as 10</w:t>
       </w:r>
       <w:r>
         <w:rPr>
@@ -3315,7 +3748,7 @@
         <w:rPr>
           <w:rFonts w:cs="Times New Roman"/>
         </w:rPr>
-        <w:t xml:space="preserve"> cycles with an optimized laser schemes for phase transition </w:t>
+        <w:t xml:space="preserve"> cycles </w:t>
       </w:r>
       <w:r>
         <w:rPr>
@@ -3492,7 +3925,19 @@
         <w:rPr>
           <w:rFonts w:cs="Times New Roman"/>
         </w:rPr>
-        <w:t xml:space="preserve"> an attractive material for low-loss, reconfigurable optical switch or optical circuit that are used in optical waveguide </w:t>
+        <w:t xml:space="preserve"> an attractive material for low-loss, reconfigurable optical switch or optical circuit that </w:t>
+      </w:r>
+      <w:r>
+        <w:rPr>
+          <w:rFonts w:cs="Times New Roman"/>
+        </w:rPr>
+        <w:t>can be</w:t>
+      </w:r>
+      <w:r>
+        <w:rPr>
+          <w:rFonts w:cs="Times New Roman"/>
+        </w:rPr>
+        <w:t xml:space="preserve"> used in optical waveguide </w:t>
       </w:r>
       <w:r>
         <w:rPr>
@@ -4427,14 +4872,19 @@
         <w:rPr>
           <w:rFonts w:cs="Times New Roman"/>
         </w:rPr>
-        <w:t xml:space="preserve">) is an orthorhombic chalcogenide non-volatile phase change material (PCM) characterized by quasi-one-dimensional ribbons. While its amorphous state consists of a disordered network of distorted motifs, crystallization restores long-range order </w:t>
-      </w:r>
-      <w:r>
-        <w:rPr>
-          <w:rFonts w:cs="Times New Roman"/>
-        </w:rPr>
-        <w:lastRenderedPageBreak/>
-        <w:t xml:space="preserve">along the ribbon direction. This thermally driven transition can be triggered by nanosecond to microsecond optical or electrical pulses </w:t>
+        <w:t xml:space="preserve">) is an orthorhombic chalcogenide non-volatile phase change material (PCM) characterized by quasi-one-dimensional ribbons. While its amorphous </w:t>
+      </w:r>
+      <w:r>
+        <w:rPr>
+          <w:rFonts w:cs="Times New Roman"/>
+        </w:rPr>
+        <w:t>phase</w:t>
+      </w:r>
+      <w:r>
+        <w:rPr>
+          <w:rFonts w:cs="Times New Roman"/>
+        </w:rPr>
+        <w:t xml:space="preserve"> consists of a disordered network of distorted motifs, crystallization restores long-range order along the ribbon direction. This thermally driven transition can be triggered by nanosecond to microsecond optical or electrical pulses </w:t>
       </w:r>
       <w:r>
         <w:rPr>
@@ -4577,7 +5027,13 @@
         <w:rPr>
           <w:rFonts w:cs="Times New Roman"/>
         </w:rPr>
-        <w:t>. This reversible process supports high endurance, with optical switching reaching 10</w:t>
+        <w:t xml:space="preserve">, the process is reversible and have high endurance, </w:t>
+      </w:r>
+      <w:r>
+        <w:rPr>
+          <w:rFonts w:cs="Times New Roman"/>
+        </w:rPr>
+        <w:t>with optical switching reaching 10</w:t>
       </w:r>
       <w:r>
         <w:rPr>
@@ -4603,7 +5059,192 @@
         <w:rPr>
           <w:rFonts w:cs="Times New Roman"/>
         </w:rPr>
-        <w:t xml:space="preserve">cycles. As an optical device, the material enables repeatable toggling between high and low transmission modes, provided the local heating stays below the melting or ablation threshold </w:t>
+        <w:t>cycles</w:t>
+      </w:r>
+      <w:r>
+        <w:rPr>
+          <w:rFonts w:cs="Times New Roman"/>
+        </w:rPr>
+        <w:t xml:space="preserve"> </w:t>
+      </w:r>
+      <w:r>
+        <w:rPr>
+          <w:rFonts w:cs="Times New Roman"/>
+        </w:rPr>
+        <w:fldChar w:fldCharType="begin">
+          <w:fldData xml:space="preserve">PEVuZE5vdGU+PENpdGU+PEF1dGhvcj5BbGFtPC9BdXRob3I+PFllYXI+MjAyNDwvWWVhcj48UmVj
+TnVtPjgwPC9SZWNOdW0+PERpc3BsYXlUZXh0PlsyMywgMjRdPC9EaXNwbGF5VGV4dD48cmVjb3Jk
+PjxyZWMtbnVtYmVyPjgwPC9yZWMtbnVtYmVyPjxmb3JlaWduLWtleXM+PGtleSBhcHA9IkVOIiBk
+Yi1pZD0idjkyMHBmdDA2cnA5ZGJleDJhcDUwMHg5OXg1cnJ0c3d4enNzIiB0aW1lc3RhbXA9IjE3
+NzM4MzAwMjkiPjgwPC9rZXk+PC9mb3JlaWduLWtleXM+PHJlZi10eXBlIG5hbWU9IkpvdXJuYWwg
+QXJ0aWNsZSI+MTc8L3JlZi10eXBlPjxjb250cmlidXRvcnM+PGF1dGhvcnM+PGF1dGhvcj5BbGFt
+LCBNZCBTaGFoPC9hdXRob3I+PGF1dGhvcj5MYWluZywgUnlhbjwvYXV0aG9yPjxhdXRob3I+Qm9s
+YXRiZWssIFpoYW5pYmVrPC9hdXRob3I+PGF1dGhvcj5IZWVua2VuZGEsIFJlbW9uYTwvYXV0aG9y
+PjxhdXRob3I+R25hd2FsaSwgUnVkcmE8L2F1dGhvcj48YXV0aG9yPlBheW5lLCBUYW1hcmEgRS48
+L2F1dGhvcj48YXV0aG9yPlNhcmFuZ2FuLCBBbmRyZXc8L2F1dGhvcj48YXV0aG9yPkhlbmRyaWNr
+c29uLCBKb3NodWEgUi48L2F1dGhvcj48YXV0aG9yPkFnaGEsIEltYWQ8L2F1dGhvcj48L2F1dGhv
+cnM+PC9jb250cmlidXRvcnM+PHRpdGxlcz48dGl0bGU+RmFzdCBDeWNsaW5nIFNwZWVkIHdpdGgg
+TXVsdGltaWxsaW9uIEN5Y2xpbmcgRW5kdXJhbmNlIG9mIFVsdHJhLUxvdyBMb3NzIFBoYXNlIENo
+YW5nZSBNYXRlcmlhbCAoU2IyU2UzKSBieSBFbmdpbmVlcmVkIExhc2VyIFB1bHNlIElycmFkaWF0
+aW9uPC90aXRsZT48c2Vjb25kYXJ5LXRpdGxlPkFkdmFuY2VkIEZ1bmN0aW9uYWwgTWF0ZXJpYWxz
+PC9zZWNvbmRhcnktdGl0bGU+PC90aXRsZXM+PHBlcmlvZGljYWw+PGZ1bGwtdGl0bGU+QWR2YW5j
+ZWQgRnVuY3Rpb25hbCBNYXRlcmlhbHM8L2Z1bGwtdGl0bGU+PC9wZXJpb2RpY2FsPjxwYWdlcz4y
+MzEwMzA2PC9wYWdlcz48dm9sdW1lPjM0PC92b2x1bWU+PG51bWJlcj4xNDwvbnVtYmVyPjxkYXRl
+cz48eWVhcj4yMDI0PC95ZWFyPjwvZGF0ZXM+PGlzYm4+MTYxNi0zMDFYPC9pc2JuPjx1cmxzPjxy
+ZWxhdGVkLXVybHM+PHVybD5odHRwczovL2FkdmFuY2VkLm9ubGluZWxpYnJhcnkud2lsZXkuY29t
+L2RvaS9hYnMvMTAuMTAwMi9hZGZtLjIwMjMxMDMwNjwvdXJsPjwvcmVsYXRlZC11cmxzPjwvdXJs
+cz48ZWxlY3Ryb25pYy1yZXNvdXJjZS1udW0+aHR0cHM6Ly9kb2kub3JnLzEwLjEwMDIvYWRmbS4y
+MDIzMTAzMDY8L2VsZWN0cm9uaWMtcmVzb3VyY2UtbnVtPjwvcmVjb3JkPjwvQ2l0ZT48Q2l0ZT48
+QXV0aG9yPkxhd3NvbjwvQXV0aG9yPjxZZWFyPjIwMjM8L1llYXI+PFJlY051bT42MDwvUmVjTnVt
+PjxyZWNvcmQ+PHJlYy1udW1iZXI+NjA8L3JlYy1udW1iZXI+PGZvcmVpZ24ta2V5cz48a2V5IGFw
+cD0iRU4iIGRiLWlkPSJ2OTIwcGZ0MDZycDlkYmV4MmFwNTAweDk5eDVycnRzd3h6c3MiIHRpbWVz
+dGFtcD0iMTc2ODA1MjkxMSIgZ3VpZD0iYzg5NTA2MDYtNGZkZC00MTFjLTk4ODItNDkyMzQxYWEw
+NWYzIj42MDwva2V5PjwvZm9yZWlnbi1rZXlzPjxyZWYtdHlwZSBuYW1lPSJKb3VybmFsIEFydGlj
+bGUiPjE3PC9yZWYtdHlwZT48Y29udHJpYnV0b3JzPjxhdXRob3JzPjxhdXRob3I+TGF3c29uLCBE
+YW5pZWw8L2F1dGhvcj48YXV0aG9yPkJsdW5kZWxsLCBTb3BoaWU8L2F1dGhvcj48YXV0aG9yPkVi
+ZXJ0LCBNYXJ0aW48L2F1dGhvcj48YXV0aG9yPk11c2tlbnMsIE90dG8gTC48L2F1dGhvcj48YXV0
+aG9yPlplaW1wZWtpcywgSW9hbm5pczwvYXV0aG9yPjwvYXV0aG9ycz48L2NvbnRyaWJ1dG9ycz48
+dGl0bGVzPjx0aXRsZT5PcHRpY2FsIHN3aXRjaGluZyBiZXlvbmQgYSBtaWxsaW9uIGN5Y2xlcyBv
+ZiBsb3ctbG9zcyBwaGFzZSBjaGFuZ2UgbWF0ZXJpYWwgU2IyU2UzPC90aXRsZT48c2Vjb25kYXJ5
+LXRpdGxlPk9wdGljYWwgTWF0ZXJpYWxzIEV4cHJlc3M8L3NlY29uZGFyeS10aXRsZT48L3RpdGxl
+cz48cGVyaW9kaWNhbD48ZnVsbC10aXRsZT5PcHRpY2FsIE1hdGVyaWFscyBFeHByZXNzPC9mdWxs
+LXRpdGxlPjxhYmJyLTE+T3B0LiBNYXRlci4gRXhwcmVzczwvYWJici0xPjwvcGVyaW9kaWNhbD48
+dm9sdW1lPjE0PC92b2x1bWU+PG51bWJlcj4xPC9udW1iZXI+PHNlY3Rpb24+MjI8L3NlY3Rpb24+
+PGRhdGVzPjx5ZWFyPjIwMjM8L3llYXI+PC9kYXRlcz48aXNibj4yMTU5LTM5MzA8L2lzYm4+PHVy
+bHM+PC91cmxzPjxlbGVjdHJvbmljLXJlc291cmNlLW51bT4xMC4xMzY0L29tZS41MDk0MzQ8L2Vs
+ZWN0cm9uaWMtcmVzb3VyY2UtbnVtPjwvcmVjb3JkPjwvQ2l0ZT48L0VuZE5vdGU+
+</w:fldData>
+        </w:fldChar>
+      </w:r>
+      <w:r>
+        <w:rPr>
+          <w:rFonts w:cs="Times New Roman"/>
+        </w:rPr>
+        <w:instrText xml:space="preserve"> ADDIN EN.CITE </w:instrText>
+      </w:r>
+      <w:r>
+        <w:rPr>
+          <w:rFonts w:cs="Times New Roman"/>
+        </w:rPr>
+        <w:fldChar w:fldCharType="begin">
+          <w:fldData xml:space="preserve">PEVuZE5vdGU+PENpdGU+PEF1dGhvcj5BbGFtPC9BdXRob3I+PFllYXI+MjAyNDwvWWVhcj48UmVj
+TnVtPjgwPC9SZWNOdW0+PERpc3BsYXlUZXh0PlsyMywgMjRdPC9EaXNwbGF5VGV4dD48cmVjb3Jk
+PjxyZWMtbnVtYmVyPjgwPC9yZWMtbnVtYmVyPjxmb3JlaWduLWtleXM+PGtleSBhcHA9IkVOIiBk
+Yi1pZD0idjkyMHBmdDA2cnA5ZGJleDJhcDUwMHg5OXg1cnJ0c3d4enNzIiB0aW1lc3RhbXA9IjE3
+NzM4MzAwMjkiPjgwPC9rZXk+PC9mb3JlaWduLWtleXM+PHJlZi10eXBlIG5hbWU9IkpvdXJuYWwg
+QXJ0aWNsZSI+MTc8L3JlZi10eXBlPjxjb250cmlidXRvcnM+PGF1dGhvcnM+PGF1dGhvcj5BbGFt
+LCBNZCBTaGFoPC9hdXRob3I+PGF1dGhvcj5MYWluZywgUnlhbjwvYXV0aG9yPjxhdXRob3I+Qm9s
+YXRiZWssIFpoYW5pYmVrPC9hdXRob3I+PGF1dGhvcj5IZWVua2VuZGEsIFJlbW9uYTwvYXV0aG9y
+PjxhdXRob3I+R25hd2FsaSwgUnVkcmE8L2F1dGhvcj48YXV0aG9yPlBheW5lLCBUYW1hcmEgRS48
+L2F1dGhvcj48YXV0aG9yPlNhcmFuZ2FuLCBBbmRyZXc8L2F1dGhvcj48YXV0aG9yPkhlbmRyaWNr
+c29uLCBKb3NodWEgUi48L2F1dGhvcj48YXV0aG9yPkFnaGEsIEltYWQ8L2F1dGhvcj48L2F1dGhv
+cnM+PC9jb250cmlidXRvcnM+PHRpdGxlcz48dGl0bGU+RmFzdCBDeWNsaW5nIFNwZWVkIHdpdGgg
+TXVsdGltaWxsaW9uIEN5Y2xpbmcgRW5kdXJhbmNlIG9mIFVsdHJhLUxvdyBMb3NzIFBoYXNlIENo
+YW5nZSBNYXRlcmlhbCAoU2IyU2UzKSBieSBFbmdpbmVlcmVkIExhc2VyIFB1bHNlIElycmFkaWF0
+aW9uPC90aXRsZT48c2Vjb25kYXJ5LXRpdGxlPkFkdmFuY2VkIEZ1bmN0aW9uYWwgTWF0ZXJpYWxz
+PC9zZWNvbmRhcnktdGl0bGU+PC90aXRsZXM+PHBlcmlvZGljYWw+PGZ1bGwtdGl0bGU+QWR2YW5j
+ZWQgRnVuY3Rpb25hbCBNYXRlcmlhbHM8L2Z1bGwtdGl0bGU+PC9wZXJpb2RpY2FsPjxwYWdlcz4y
+MzEwMzA2PC9wYWdlcz48dm9sdW1lPjM0PC92b2x1bWU+PG51bWJlcj4xNDwvbnVtYmVyPjxkYXRl
+cz48eWVhcj4yMDI0PC95ZWFyPjwvZGF0ZXM+PGlzYm4+MTYxNi0zMDFYPC9pc2JuPjx1cmxzPjxy
+ZWxhdGVkLXVybHM+PHVybD5odHRwczovL2FkdmFuY2VkLm9ubGluZWxpYnJhcnkud2lsZXkuY29t
+L2RvaS9hYnMvMTAuMTAwMi9hZGZtLjIwMjMxMDMwNjwvdXJsPjwvcmVsYXRlZC11cmxzPjwvdXJs
+cz48ZWxlY3Ryb25pYy1yZXNvdXJjZS1udW0+aHR0cHM6Ly9kb2kub3JnLzEwLjEwMDIvYWRmbS4y
+MDIzMTAzMDY8L2VsZWN0cm9uaWMtcmVzb3VyY2UtbnVtPjwvcmVjb3JkPjwvQ2l0ZT48Q2l0ZT48
+QXV0aG9yPkxhd3NvbjwvQXV0aG9yPjxZZWFyPjIwMjM8L1llYXI+PFJlY051bT42MDwvUmVjTnVt
+PjxyZWNvcmQ+PHJlYy1udW1iZXI+NjA8L3JlYy1udW1iZXI+PGZvcmVpZ24ta2V5cz48a2V5IGFw
+cD0iRU4iIGRiLWlkPSJ2OTIwcGZ0MDZycDlkYmV4MmFwNTAweDk5eDVycnRzd3h6c3MiIHRpbWVz
+dGFtcD0iMTc2ODA1MjkxMSIgZ3VpZD0iYzg5NTA2MDYtNGZkZC00MTFjLTk4ODItNDkyMzQxYWEw
+NWYzIj42MDwva2V5PjwvZm9yZWlnbi1rZXlzPjxyZWYtdHlwZSBuYW1lPSJKb3VybmFsIEFydGlj
+bGUiPjE3PC9yZWYtdHlwZT48Y29udHJpYnV0b3JzPjxhdXRob3JzPjxhdXRob3I+TGF3c29uLCBE
+YW5pZWw8L2F1dGhvcj48YXV0aG9yPkJsdW5kZWxsLCBTb3BoaWU8L2F1dGhvcj48YXV0aG9yPkVi
+ZXJ0LCBNYXJ0aW48L2F1dGhvcj48YXV0aG9yPk11c2tlbnMsIE90dG8gTC48L2F1dGhvcj48YXV0
+aG9yPlplaW1wZWtpcywgSW9hbm5pczwvYXV0aG9yPjwvYXV0aG9ycz48L2NvbnRyaWJ1dG9ycz48
+dGl0bGVzPjx0aXRsZT5PcHRpY2FsIHN3aXRjaGluZyBiZXlvbmQgYSBtaWxsaW9uIGN5Y2xlcyBv
+ZiBsb3ctbG9zcyBwaGFzZSBjaGFuZ2UgbWF0ZXJpYWwgU2IyU2UzPC90aXRsZT48c2Vjb25kYXJ5
+LXRpdGxlPk9wdGljYWwgTWF0ZXJpYWxzIEV4cHJlc3M8L3NlY29uZGFyeS10aXRsZT48L3RpdGxl
+cz48cGVyaW9kaWNhbD48ZnVsbC10aXRsZT5PcHRpY2FsIE1hdGVyaWFscyBFeHByZXNzPC9mdWxs
+LXRpdGxlPjxhYmJyLTE+T3B0LiBNYXRlci4gRXhwcmVzczwvYWJici0xPjwvcGVyaW9kaWNhbD48
+dm9sdW1lPjE0PC92b2x1bWU+PG51bWJlcj4xPC9udW1iZXI+PHNlY3Rpb24+MjI8L3NlY3Rpb24+
+PGRhdGVzPjx5ZWFyPjIwMjM8L3llYXI+PC9kYXRlcz48aXNibj4yMTU5LTM5MzA8L2lzYm4+PHVy
+bHM+PC91cmxzPjxlbGVjdHJvbmljLXJlc291cmNlLW51bT4xMC4xMzY0L29tZS41MDk0MzQ8L2Vs
+ZWN0cm9uaWMtcmVzb3VyY2UtbnVtPjwvcmVjb3JkPjwvQ2l0ZT48L0VuZE5vdGU+
+</w:fldData>
+        </w:fldChar>
+      </w:r>
+      <w:r>
+        <w:rPr>
+          <w:rFonts w:cs="Times New Roman"/>
+        </w:rPr>
+        <w:instrText xml:space="preserve"> ADDIN EN.CITE.DATA </w:instrText>
+      </w:r>
+      <w:r>
+        <w:rPr>
+          <w:rFonts w:cs="Times New Roman"/>
+        </w:rPr>
+      </w:r>
+      <w:r>
+        <w:rPr>
+          <w:rFonts w:cs="Times New Roman"/>
+        </w:rPr>
+        <w:fldChar w:fldCharType="end"/>
+      </w:r>
+      <w:r>
+        <w:rPr>
+          <w:rFonts w:cs="Times New Roman"/>
+        </w:rPr>
+        <w:fldChar w:fldCharType="separate"/>
+      </w:r>
+      <w:r>
+        <w:rPr>
+          <w:rFonts w:cs="Times New Roman"/>
+          <w:noProof/>
+        </w:rPr>
+        <w:t>[23, 24]</w:t>
+      </w:r>
+      <w:r>
+        <w:rPr>
+          <w:rFonts w:cs="Times New Roman"/>
+        </w:rPr>
+        <w:fldChar w:fldCharType="end"/>
+      </w:r>
+      <w:r>
+        <w:rPr>
+          <w:rFonts w:cs="Times New Roman"/>
+        </w:rPr>
+        <w:t xml:space="preserve">. As an optical device, </w:t>
+      </w:r>
+      <w:r>
+        <w:rPr>
+          <w:rFonts w:cs="Times New Roman"/>
+        </w:rPr>
+        <w:lastRenderedPageBreak/>
+        <w:t>Sb</w:t>
+      </w:r>
+      <w:r>
+        <w:rPr>
+          <w:rFonts w:cs="Times New Roman"/>
+          <w:vertAlign w:val="subscript"/>
+        </w:rPr>
+        <w:t>2</w:t>
+      </w:r>
+      <w:r>
+        <w:rPr>
+          <w:rFonts w:cs="Times New Roman"/>
+        </w:rPr>
+        <w:t>Se</w:t>
+      </w:r>
+      <w:r>
+        <w:rPr>
+          <w:rFonts w:cs="Times New Roman"/>
+          <w:vertAlign w:val="subscript"/>
+        </w:rPr>
+        <w:t>3</w:t>
+      </w:r>
+      <w:r>
+        <w:rPr>
+          <w:rFonts w:cs="Times New Roman"/>
+        </w:rPr>
+        <w:t xml:space="preserve"> enables repeatable toggling between high and low transmission modes, provided the local heating stays below the melting or ablation threshold </w:t>
       </w:r>
       <w:r>
         <w:rPr>
@@ -5178,7 +5819,62 @@
         <w:rPr>
           <w:rFonts w:cs="Times New Roman"/>
         </w:rPr>
-        <w:t xml:space="preserve"> over the spectral range of interest. But in this work, a linear interpolation is used since all the dataset used have the measurement interval of less than 4 nm. The complex refractive index at 1064 nm are: </w:t>
+        <w:t xml:space="preserve"> over the spectral range of interest. But in this work, a linear interpolation is used since all the dataset used have the measurement interval of less than 4 nm. Figure 1 shows their </w:t>
+      </w:r>
+      <w:r>
+        <w:rPr>
+          <w:rFonts w:cs="Times New Roman"/>
+        </w:rPr>
+        <w:t>complex refractive indices</w:t>
+      </w:r>
+      <w:r>
+        <w:rPr>
+          <w:rFonts w:cs="Times New Roman"/>
+        </w:rPr>
+        <w:t xml:space="preserve"> from 300 to 1700 nm using dataset from </w:t>
+      </w:r>
+      <w:r>
+        <w:rPr>
+          <w:rFonts w:cs="Times New Roman"/>
+        </w:rPr>
+        <w:fldChar w:fldCharType="begin"/>
+      </w:r>
+      <w:r>
+        <w:rPr>
+          <w:rFonts w:cs="Times New Roman"/>
+        </w:rPr>
+        <w:instrText xml:space="preserve"> ADDIN EN.CITE &lt;EndNote&gt;&lt;Cite AuthorYear="1"&gt;&lt;Author&gt;Delaney&lt;/Author&gt;&lt;Year&gt;2020&lt;/Year&gt;&lt;RecNum&gt;64&lt;/RecNum&gt;&lt;DisplayText&gt;Delaney, et al. [19]&lt;/DisplayText&gt;&lt;record&gt;&lt;rec-number&gt;64&lt;/rec-number&gt;&lt;foreign-keys&gt;&lt;key app="EN" db-id="v920pft06rp9dbex2ap500x99x5rrtswxzss" timestamp="1768054090" guid="b15b5550-40d7-4ad2-8182-cf6f486a4f50"&gt;64&lt;/key&gt;&lt;/foreign-keys&gt;&lt;ref-type name="Journal Article"&gt;17&lt;/ref-type&gt;&lt;contributors&gt;&lt;authors&gt;&lt;author&gt;Delaney, Matthew&lt;/author&gt;&lt;author&gt;Zeimpekis, Ioannis&lt;/author&gt;&lt;author&gt;Lawson, Daniel&lt;/author&gt;&lt;author&gt;Hewak, Daniel W.&lt;/author&gt;&lt;author&gt;Muskens, Otto L.&lt;/author&gt;&lt;/authors&gt;&lt;/contributors&gt;&lt;titles&gt;&lt;title&gt;A New Family of Ultralow Loss Reversible Phase‐Change Materials for Photonic Integrated Circuits: Sb2S3 and Sb2Se3&lt;/title&gt;&lt;secondary-title&gt;Advanced Functional Materials&lt;/secondary-title&gt;&lt;/titles&gt;&lt;periodical&gt;&lt;full-title&gt;Advanced Functional Materials&lt;/full-title&gt;&lt;/periodical&gt;&lt;volume&gt;30&lt;/volume&gt;&lt;number&gt;36&lt;/number&gt;&lt;dates&gt;&lt;year&gt;2020&lt;/year&gt;&lt;/dates&gt;&lt;isbn&gt;1616-301X&amp;#xD;1616-3028&lt;/isbn&gt;&lt;urls&gt;&lt;/urls&gt;&lt;electronic-resource-num&gt;10.1002/adfm.202002447&lt;/electronic-resource-num&gt;&lt;/record&gt;&lt;/Cite&gt;&lt;/EndNote&gt;</w:instrText>
+      </w:r>
+      <w:r>
+        <w:rPr>
+          <w:rFonts w:cs="Times New Roman"/>
+        </w:rPr>
+        <w:fldChar w:fldCharType="separate"/>
+      </w:r>
+      <w:r>
+        <w:rPr>
+          <w:rFonts w:cs="Times New Roman"/>
+          <w:noProof/>
+        </w:rPr>
+        <w:t>Delaney, et al. [19]</w:t>
+      </w:r>
+      <w:r>
+        <w:rPr>
+          <w:rFonts w:cs="Times New Roman"/>
+        </w:rPr>
+        <w:fldChar w:fldCharType="end"/>
+      </w:r>
+      <w:r>
+        <w:rPr>
+          <w:rFonts w:cs="Times New Roman"/>
+        </w:rPr>
+        <w:t>, its</w:t>
+      </w:r>
+      <w:r>
+        <w:rPr>
+          <w:rFonts w:cs="Times New Roman"/>
+        </w:rPr>
+        <w:t xml:space="preserve"> complex refractive index at 1064 nm are: </w:t>
       </w:r>
       <w:r>
         <w:rPr>
@@ -5240,56 +5936,25 @@
         <w:rPr>
           <w:rFonts w:cs="Times New Roman"/>
         </w:rPr>
-        <w:t xml:space="preserve">4.308 + 0.010i. Figure 1 shows their </w:t>
-      </w:r>
-      <w:r>
-        <w:rPr>
-          <w:rFonts w:cs="Times New Roman"/>
-        </w:rPr>
-        <w:t>complex refractive indices</w:t>
-      </w:r>
-      <w:r>
-        <w:rPr>
-          <w:rFonts w:cs="Times New Roman"/>
-        </w:rPr>
-        <w:t xml:space="preserve"> from 300 to 1700 nm using dataset from </w:t>
-      </w:r>
-      <w:r>
-        <w:rPr>
-          <w:rFonts w:cs="Times New Roman"/>
-        </w:rPr>
-        <w:fldChar w:fldCharType="begin"/>
-      </w:r>
-      <w:r>
-        <w:rPr>
-          <w:rFonts w:cs="Times New Roman"/>
-        </w:rPr>
-        <w:instrText xml:space="preserve"> ADDIN EN.CITE &lt;EndNote&gt;&lt;Cite AuthorYear="1"&gt;&lt;Author&gt;Delaney&lt;/Author&gt;&lt;Year&gt;2020&lt;/Year&gt;&lt;RecNum&gt;64&lt;/RecNum&gt;&lt;DisplayText&gt;Delaney, et al. [19]&lt;/DisplayText&gt;&lt;record&gt;&lt;rec-number&gt;64&lt;/rec-number&gt;&lt;foreign-keys&gt;&lt;key app="EN" db-id="v920pft06rp9dbex2ap500x99x5rrtswxzss" timestamp="1768054090" guid="b15b5550-40d7-4ad2-8182-cf6f486a4f50"&gt;64&lt;/key&gt;&lt;/foreign-keys&gt;&lt;ref-type name="Journal Article"&gt;17&lt;/ref-type&gt;&lt;contributors&gt;&lt;authors&gt;&lt;author&gt;Delaney, Matthew&lt;/author&gt;&lt;author&gt;Zeimpekis, Ioannis&lt;/author&gt;&lt;author&gt;Lawson, Daniel&lt;/author&gt;&lt;author&gt;Hewak, Daniel W.&lt;/author&gt;&lt;author&gt;Muskens, Otto L.&lt;/author&gt;&lt;/authors&gt;&lt;/contributors&gt;&lt;titles&gt;&lt;title&gt;A New Family of Ultralow Loss Reversible Phase‐Change Materials for Photonic Integrated Circuits: Sb2S3 and Sb2Se3&lt;/title&gt;&lt;secondary-title&gt;Advanced Functional Materials&lt;/secondary-title&gt;&lt;/titles&gt;&lt;periodical&gt;&lt;full-title&gt;Advanced Functional Materials&lt;/full-title&gt;&lt;/periodical&gt;&lt;volume&gt;30&lt;/volume&gt;&lt;number&gt;36&lt;/number&gt;&lt;dates&gt;&lt;year&gt;2020&lt;/year&gt;&lt;/dates&gt;&lt;isbn&gt;1616-301X&amp;#xD;1616-3028&lt;/isbn&gt;&lt;urls&gt;&lt;/urls&gt;&lt;electronic-resource-num&gt;10.1002/adfm.202002447&lt;/electronic-resource-num&gt;&lt;/record&gt;&lt;/Cite&gt;&lt;/EndNote&gt;</w:instrText>
-      </w:r>
-      <w:r>
-        <w:rPr>
-          <w:rFonts w:cs="Times New Roman"/>
-        </w:rPr>
-        <w:fldChar w:fldCharType="separate"/>
-      </w:r>
-      <w:r>
-        <w:rPr>
-          <w:rFonts w:cs="Times New Roman"/>
-          <w:noProof/>
-        </w:rPr>
-        <w:t>Delaney, et al. [19]</w:t>
-      </w:r>
-      <w:r>
-        <w:rPr>
-          <w:rFonts w:cs="Times New Roman"/>
-        </w:rPr>
-        <w:fldChar w:fldCharType="end"/>
-      </w:r>
-      <w:r>
-        <w:rPr>
-          <w:rFonts w:cs="Times New Roman"/>
-        </w:rPr>
-        <w:t>. Blue lines represent real refractive index (</w:t>
+        <w:t>4.308 + 0.010i.</w:t>
+      </w:r>
+      <w:r>
+        <w:rPr>
+          <w:rFonts w:cs="Times New Roman"/>
+        </w:rPr>
+        <w:t xml:space="preserve"> </w:t>
+      </w:r>
+      <w:r>
+        <w:rPr>
+          <w:rFonts w:cs="Times New Roman"/>
+        </w:rPr>
+        <w:t>The b</w:t>
+      </w:r>
+      <w:r>
+        <w:rPr>
+          <w:rFonts w:cs="Times New Roman"/>
+        </w:rPr>
+        <w:t>lue lines represent real refractive index (</w:t>
       </w:r>
       <w:r>
         <w:rPr>
@@ -5408,7 +6073,19 @@
         <w:rPr>
           <w:rFonts w:cs="Times New Roman"/>
         </w:rPr>
-        <w:t xml:space="preserve">raphs are plotted from experimental data from </w:t>
+        <w:t xml:space="preserve">raphs are plotted from experimental data </w:t>
+      </w:r>
+      <w:r>
+        <w:rPr>
+          <w:rFonts w:cs="Times New Roman"/>
+        </w:rPr>
+        <w:t>of</w:t>
+      </w:r>
+      <w:r>
+        <w:rPr>
+          <w:rFonts w:cs="Times New Roman"/>
+        </w:rPr>
+        <w:t xml:space="preserve"> </w:t>
       </w:r>
       <w:r>
         <w:rPr>
@@ -5561,14 +6238,7 @@
         <w:rPr>
           <w:rFonts w:cs="Times New Roman"/>
         </w:rPr>
-        <w:t xml:space="preserve"> starting from NIR wavelengths enable a </w:t>
-      </w:r>
-      <w:r>
-        <w:rPr>
-          <w:rFonts w:cs="Times New Roman"/>
-        </w:rPr>
-        <w:lastRenderedPageBreak/>
-        <w:t xml:space="preserve">device to operate in two modes with little to no optical loss, stable </w:t>
+        <w:t xml:space="preserve"> starting from NIR wavelengths enable a device to operate in two modes with little to no optical loss, stable </w:t>
       </w:r>
       <w:r>
         <w:rPr>
@@ -5596,6 +6266,7 @@
         <w:rPr>
           <w:rFonts w:ascii="Times New Roman" w:hAnsi="Times New Roman" w:cs="Times New Roman"/>
         </w:rPr>
+        <w:lastRenderedPageBreak/>
         <w:t>2.2 Single-layer antireflection design</w:t>
       </w:r>
     </w:p>
@@ -8243,7 +8914,6 @@
           <w:rFonts w:cs="Times New Roman"/>
           <w:vertAlign w:val="subscript"/>
         </w:rPr>
-        <w:lastRenderedPageBreak/>
         <w:tab/>
       </w:r>
       <m:oMath>
@@ -8859,6 +9529,7 @@
           <w:rFonts w:cs="Times New Roman"/>
           <w:vertAlign w:val="subscript"/>
         </w:rPr>
+        <w:lastRenderedPageBreak/>
         <w:tab/>
       </w:r>
       <m:oMath>
@@ -10245,7 +10916,6 @@
         <w:rPr>
           <w:rFonts w:cs="Times New Roman"/>
         </w:rPr>
-        <w:lastRenderedPageBreak/>
         <w:t xml:space="preserve">A two-layer </w:t>
       </w:r>
       <w:r>
@@ -10298,6 +10968,7 @@
         <w:rPr>
           <w:rFonts w:cs="Times New Roman"/>
         </w:rPr>
+        <w:lastRenderedPageBreak/>
         <w:tab/>
       </w:r>
       <m:oMath>
@@ -14925,14 +15596,7 @@
         <w:rPr>
           <w:rFonts w:cs="Times New Roman"/>
         </w:rPr>
-        <w:t xml:space="preserve"> </w:t>
-      </w:r>
-      <w:r>
-        <w:rPr>
-          <w:rFonts w:cs="Times New Roman"/>
-        </w:rPr>
-        <w:lastRenderedPageBreak/>
-        <w:t xml:space="preserve">(i.e., 1400 nm and longer) is lower than that of a single </w:t>
+        <w:t xml:space="preserve"> (i.e., 1400 nm and longer) is lower than that of a single </w:t>
       </w:r>
       <w:r>
         <w:rPr>
@@ -15255,7 +15919,14 @@
         <w:rPr>
           <w:rFonts w:cs="Times New Roman"/>
         </w:rPr>
-        <w:t xml:space="preserve"> so that the ideal top layer calculated from Eq. 16 have </w:t>
+        <w:t xml:space="preserve"> so </w:t>
+      </w:r>
+      <w:r>
+        <w:rPr>
+          <w:rFonts w:cs="Times New Roman"/>
+        </w:rPr>
+        <w:lastRenderedPageBreak/>
+        <w:t xml:space="preserve">that the ideal top layer calculated from Eq. 16 have </w:t>
       </w:r>
       <w:r>
         <w:rPr>
@@ -19212,6 +19883,11 @@
         <w:rPr>
           <w:rFonts w:cs="Times New Roman"/>
         </w:rPr>
+      </w:r>
+      <w:r>
+        <w:rPr>
+          <w:rFonts w:cs="Times New Roman"/>
+        </w:rPr>
         <w:fldChar w:fldCharType="separate"/>
       </w:r>
       <w:r>
@@ -19642,6 +20318,11 @@
           <w:rFonts w:cs="Times New Roman"/>
         </w:rPr>
         <w:fldChar w:fldCharType="end"/>
+      </w:r>
+      <w:r>
+        <w:rPr>
+          <w:rFonts w:cs="Times New Roman"/>
+        </w:rPr>
       </w:r>
       <w:r>
         <w:rPr>
@@ -19910,6 +20591,11 @@
         <w:rPr>
           <w:rFonts w:cs="Times New Roman"/>
         </w:rPr>
+      </w:r>
+      <w:r>
+        <w:rPr>
+          <w:rFonts w:cs="Times New Roman"/>
+        </w:rPr>
         <w:fldChar w:fldCharType="separate"/>
       </w:r>
       <w:r>
@@ -20043,7 +20729,19 @@
         <w:rPr>
           <w:rFonts w:cs="Times New Roman"/>
         </w:rPr>
-        <w:t xml:space="preserve">egradation is defined as the reduction in transmittance contrast after </w:t>
+        <w:t xml:space="preserve">egradation is defined as the </w:t>
+      </w:r>
+      <w:r>
+        <w:rPr>
+          <w:rFonts w:cs="Times New Roman"/>
+        </w:rPr>
+        <w:t>change</w:t>
+      </w:r>
+      <w:r>
+        <w:rPr>
+          <w:rFonts w:cs="Times New Roman"/>
+        </w:rPr>
+        <w:t xml:space="preserve"> in transmittance contrast after </w:t>
       </w:r>
       <w:r>
         <w:rPr>
@@ -20057,7 +20755,7 @@
         <w:rPr>
           <w:rFonts w:cs="Times New Roman"/>
         </w:rPr>
-        <w:t xml:space="preserve"> cycles, as in:</w:t>
+        <w:t xml:space="preserve"> cycles:</w:t>
       </w:r>
     </w:p>
     <w:p>
@@ -20381,6 +21079,34 @@
           <w:rFonts w:cs="Times New Roman"/>
         </w:rPr>
         <w:t>)</w:t>
+      </w:r>
+      <w:r>
+        <w:rPr>
+          <w:rFonts w:cs="Times New Roman"/>
+        </w:rPr>
+        <w:t xml:space="preserve">. A negative </w:t>
+      </w:r>
+      <w:r>
+        <w:rPr>
+          <w:rFonts w:cs="Times New Roman"/>
+          <w:i/>
+          <w:iCs/>
+        </w:rPr>
+        <w:t>D</w:t>
+      </w:r>
+      <w:r>
+        <w:rPr>
+          <w:rFonts w:cs="Times New Roman"/>
+          <w:i/>
+          <w:iCs/>
+        </w:rPr>
+        <w:t xml:space="preserve"> </w:t>
+      </w:r>
+      <w:r>
+        <w:rPr>
+          <w:rFonts w:cs="Times New Roman"/>
+        </w:rPr>
+        <w:t>indicates a decrease in contrast.</w:t>
       </w:r>
     </w:p>
     <w:p>
@@ -24170,12 +24896,14 @@
               <w:rPr>
                 <w:rFonts w:cs="Times New Roman"/>
                 <w:szCs w:val="16"/>
+                <w:highlight w:val="yellow"/>
               </w:rPr>
             </w:pPr>
             <w:r>
               <w:rPr>
                 <w:rFonts w:cs="Times New Roman"/>
                 <w:szCs w:val="16"/>
+                <w:highlight w:val="yellow"/>
               </w:rPr>
               <w:t>0.9</w:t>
             </w:r>
@@ -24503,12 +25231,14 @@
               <w:rPr>
                 <w:rFonts w:cs="Times New Roman"/>
                 <w:szCs w:val="16"/>
+                <w:highlight w:val="yellow"/>
               </w:rPr>
             </w:pPr>
             <w:r>
               <w:rPr>
                 <w:rFonts w:cs="Times New Roman"/>
                 <w:szCs w:val="16"/>
+                <w:highlight w:val="yellow"/>
               </w:rPr>
               <w:t>0.2</w:t>
             </w:r>
@@ -26363,391 +27093,732 @@
           <w:rFonts w:cs="Times New Roman"/>
           <w:i w:val="0"/>
           <w:iCs w:val="0"/>
-          <w:highlight w:val="yellow"/>
         </w:rPr>
       </w:pPr>
       <w:r>
         <w:rPr>
           <w:rStyle w:val="Emphasis"/>
           <w:rFonts w:cs="Times New Roman"/>
+          <w:i w:val="0"/>
+          <w:iCs w:val="0"/>
+        </w:rPr>
+        <w:t>Endur</w:t>
+      </w:r>
+      <w:r>
+        <w:rPr>
+          <w:rStyle w:val="Emphasis"/>
+          <w:rFonts w:cs="Times New Roman"/>
+          <w:i w:val="0"/>
+          <w:iCs w:val="0"/>
+        </w:rPr>
+        <w:t xml:space="preserve">ance testing </w:t>
+      </w:r>
+      <w:r>
+        <w:rPr>
+          <w:rStyle w:val="Emphasis"/>
+          <w:rFonts w:cs="Times New Roman"/>
+          <w:i w:val="0"/>
+          <w:iCs w:val="0"/>
+        </w:rPr>
+        <w:t>of the single-layer HWOT-thick Sb</w:t>
+      </w:r>
+      <w:r>
+        <w:rPr>
+          <w:rStyle w:val="Emphasis"/>
+          <w:rFonts w:cs="Times New Roman"/>
+          <w:i w:val="0"/>
+          <w:iCs w:val="0"/>
+          <w:vertAlign w:val="subscript"/>
+        </w:rPr>
+        <w:t>2</w:t>
+      </w:r>
+      <w:r>
+        <w:rPr>
+          <w:rStyle w:val="Emphasis"/>
+          <w:rFonts w:cs="Times New Roman"/>
+          <w:i w:val="0"/>
+          <w:iCs w:val="0"/>
+        </w:rPr>
+        <w:t>Se</w:t>
+      </w:r>
+      <w:r>
+        <w:rPr>
+          <w:rStyle w:val="Emphasis"/>
+          <w:rFonts w:cs="Times New Roman"/>
+          <w:i w:val="0"/>
+          <w:iCs w:val="0"/>
+          <w:vertAlign w:val="subscript"/>
+        </w:rPr>
+        <w:t>3</w:t>
+      </w:r>
+      <w:r>
+        <w:rPr>
+          <w:rStyle w:val="Emphasis"/>
+          <w:rFonts w:cs="Times New Roman"/>
+          <w:i w:val="0"/>
+          <w:iCs w:val="0"/>
+        </w:rPr>
+        <w:t xml:space="preserve"> design, 4-unit-cells </w:t>
+      </w:r>
+      <w:r>
+        <w:rPr>
+          <w:rStyle w:val="Emphasis"/>
+          <w:rFonts w:cs="Times New Roman"/>
+          <w:i w:val="0"/>
+          <w:iCs w:val="0"/>
+        </w:rPr>
+        <w:t xml:space="preserve">design </w:t>
+      </w:r>
+      <w:r>
+        <w:rPr>
+          <w:rStyle w:val="Emphasis"/>
+          <w:rFonts w:cs="Times New Roman"/>
+          <w:i w:val="0"/>
+          <w:iCs w:val="0"/>
+        </w:rPr>
+        <w:t xml:space="preserve">and 5-unit-cells designs at 1064 nm demonstrated that all three resonant optical filters remain operational after </w:t>
+      </w:r>
+      <w:r>
+        <w:rPr>
+          <w:rStyle w:val="Emphasis"/>
+          <w:rFonts w:cs="Times New Roman"/>
+          <w:i w:val="0"/>
+          <w:iCs w:val="0"/>
+        </w:rPr>
+        <w:t>1.5</w:t>
+      </w:r>
+      <w:r>
+        <w:rPr>
+          <w:rStyle w:val="Emphasis"/>
+          <w:rFonts w:cs="Times New Roman"/>
+          <w:i w:val="0"/>
+          <w:iCs w:val="0"/>
+        </w:rPr>
+        <w:t>×10⁶</w:t>
+      </w:r>
+      <w:r>
+        <w:rPr>
+          <w:rStyle w:val="Emphasis"/>
+          <w:rFonts w:cs="Times New Roman"/>
+          <w:i w:val="0"/>
+          <w:iCs w:val="0"/>
+        </w:rPr>
+        <w:t xml:space="preserve"> phase switching cycles, with design-dependent degradation of their transmission metrics. For the single-layer device, the amorphous phase transmittance</w:t>
+      </w:r>
+      <w:r>
+        <w:rPr>
+          <w:rStyle w:val="Emphasis"/>
+          <w:rFonts w:cs="Times New Roman"/>
+          <w:i w:val="0"/>
+          <w:iCs w:val="0"/>
+        </w:rPr>
+        <w:t xml:space="preserve"> (ON mode)</w:t>
+      </w:r>
+      <w:r>
+        <w:rPr>
+          <w:rStyle w:val="Emphasis"/>
+          <w:rFonts w:cs="Times New Roman"/>
+          <w:i w:val="0"/>
+          <w:iCs w:val="0"/>
+        </w:rPr>
+        <w:t xml:space="preserve"> stays close to its initial high value while the crystalline phase transmittance</w:t>
+      </w:r>
+      <w:r>
+        <w:rPr>
+          <w:rStyle w:val="Emphasis"/>
+          <w:rFonts w:cs="Times New Roman"/>
+          <w:i w:val="0"/>
+          <w:iCs w:val="0"/>
+        </w:rPr>
+        <w:t xml:space="preserve"> (OFF mode)</w:t>
+      </w:r>
+      <w:r>
+        <w:rPr>
+          <w:rStyle w:val="Emphasis"/>
+          <w:rFonts w:cs="Times New Roman"/>
+          <w:i w:val="0"/>
+          <w:iCs w:val="0"/>
+        </w:rPr>
+        <w:t xml:space="preserve"> changes</w:t>
+      </w:r>
+      <w:r>
+        <w:rPr>
+          <w:rStyle w:val="Emphasis"/>
+          <w:rFonts w:cs="Times New Roman"/>
+          <w:i w:val="0"/>
+          <w:iCs w:val="0"/>
+        </w:rPr>
+        <w:t xml:space="preserve"> </w:t>
+      </w:r>
+      <w:r>
+        <w:rPr>
+          <w:rStyle w:val="Emphasis"/>
+          <w:rFonts w:cs="Times New Roman"/>
+          <w:i w:val="0"/>
+          <w:iCs w:val="0"/>
+        </w:rPr>
+        <w:t>modestly</w:t>
+      </w:r>
+      <w:r>
+        <w:rPr>
+          <w:rStyle w:val="Emphasis"/>
+          <w:rFonts w:cs="Times New Roman"/>
+          <w:i w:val="0"/>
+          <w:iCs w:val="0"/>
+        </w:rPr>
+        <w:t xml:space="preserve"> (Fig. 8a)</w:t>
+      </w:r>
+      <w:r>
+        <w:rPr>
+          <w:rStyle w:val="Emphasis"/>
+          <w:rFonts w:cs="Times New Roman"/>
+          <w:i w:val="0"/>
+          <w:iCs w:val="0"/>
+        </w:rPr>
+        <w:t>.</w:t>
+      </w:r>
+      <w:r>
+        <w:rPr>
+          <w:rStyle w:val="Emphasis"/>
+          <w:rFonts w:cs="Times New Roman"/>
+          <w:i w:val="0"/>
+          <w:iCs w:val="0"/>
+        </w:rPr>
+        <w:t xml:space="preserve"> Also, the corresponding percentage </w:t>
+      </w:r>
+      <w:r>
+        <w:rPr>
+          <w:rStyle w:val="Emphasis"/>
+          <w:rFonts w:cs="Times New Roman"/>
+          <w:i w:val="0"/>
+          <w:iCs w:val="0"/>
+        </w:rPr>
+        <w:t xml:space="preserve">transmittance </w:t>
+      </w:r>
+      <w:r>
+        <w:rPr>
+          <w:rStyle w:val="Emphasis"/>
+          <w:rFonts w:cs="Times New Roman"/>
+          <w:i w:val="0"/>
+          <w:iCs w:val="0"/>
+        </w:rPr>
+        <w:t>contrast degradation</w:t>
+      </w:r>
+      <w:r>
+        <w:rPr>
+          <w:rStyle w:val="Emphasis"/>
+          <w:rFonts w:cs="Times New Roman"/>
+          <w:i w:val="0"/>
+          <w:iCs w:val="0"/>
+        </w:rPr>
+        <w:t xml:space="preserve"> (Fig. 8d)</w:t>
+      </w:r>
+      <w:r>
+        <w:rPr>
+          <w:rStyle w:val="Emphasis"/>
+          <w:rFonts w:cs="Times New Roman"/>
+          <w:i w:val="0"/>
+          <w:iCs w:val="0"/>
+        </w:rPr>
+        <w:t xml:space="preserve"> and insertion loss</w:t>
+      </w:r>
+      <w:r>
+        <w:rPr>
+          <w:rStyle w:val="Emphasis"/>
+          <w:rFonts w:cs="Times New Roman"/>
+          <w:i w:val="0"/>
+          <w:iCs w:val="0"/>
+        </w:rPr>
+        <w:t xml:space="preserve"> (Fig. 8g)</w:t>
+      </w:r>
+      <w:r>
+        <w:rPr>
+          <w:rStyle w:val="Emphasis"/>
+          <w:rFonts w:cs="Times New Roman"/>
+          <w:i w:val="0"/>
+          <w:iCs w:val="0"/>
+        </w:rPr>
+        <w:t xml:space="preserve"> in amorphous phase increase slowly</w:t>
+      </w:r>
+      <w:r>
+        <w:rPr>
+          <w:rStyle w:val="Emphasis"/>
+          <w:rFonts w:cs="Times New Roman"/>
+          <w:i w:val="0"/>
+          <w:iCs w:val="0"/>
+        </w:rPr>
+        <w:t>.</w:t>
+      </w:r>
+      <w:r>
+        <w:rPr>
+          <w:rStyle w:val="Emphasis"/>
+          <w:rFonts w:cs="Times New Roman"/>
+          <w:i w:val="0"/>
+          <w:iCs w:val="0"/>
+        </w:rPr>
+        <w:t xml:space="preserve"> These confirm that the single-layer design </w:t>
+      </w:r>
+      <w:r>
+        <w:rPr>
+          <w:rStyle w:val="Emphasis"/>
+          <w:rFonts w:cs="Times New Roman"/>
+          <w:i w:val="0"/>
+          <w:iCs w:val="0"/>
+        </w:rPr>
+        <w:t xml:space="preserve">is robust against </w:t>
+      </w:r>
+      <w:r>
+        <w:rPr>
+          <w:rStyle w:val="Emphasis"/>
+          <w:rFonts w:cs="Times New Roman"/>
+          <w:i w:val="0"/>
+          <w:iCs w:val="0"/>
+        </w:rPr>
+        <w:t xml:space="preserve">repeated switching with only minor deterioration of </w:t>
+      </w:r>
+      <w:r>
+        <w:rPr>
+          <w:rStyle w:val="Emphasis"/>
+          <w:rFonts w:cs="Times New Roman"/>
+          <w:i w:val="0"/>
+          <w:iCs w:val="0"/>
+        </w:rPr>
+        <w:t xml:space="preserve">reducing </w:t>
+      </w:r>
+      <w:r>
+        <w:rPr>
+          <w:rStyle w:val="Emphasis"/>
+          <w:rFonts w:cs="Times New Roman"/>
+          <w:i w:val="0"/>
+          <w:iCs w:val="0"/>
+        </w:rPr>
+        <w:t>amorphous phase</w:t>
+      </w:r>
+      <w:r>
+        <w:rPr>
+          <w:rStyle w:val="Emphasis"/>
+          <w:rFonts w:cs="Times New Roman"/>
+          <w:i w:val="0"/>
+          <w:iCs w:val="0"/>
+        </w:rPr>
+        <w:t xml:space="preserve"> transmittance.</w:t>
+      </w:r>
+      <w:r>
+        <w:rPr>
+          <w:rStyle w:val="Emphasis"/>
+          <w:rFonts w:cs="Times New Roman"/>
+          <w:i w:val="0"/>
+          <w:iCs w:val="0"/>
+        </w:rPr>
+        <w:t xml:space="preserve"> </w:t>
+      </w:r>
+      <w:r>
+        <w:rPr>
+          <w:rStyle w:val="Emphasis"/>
+          <w:i w:val="0"/>
+          <w:iCs w:val="0"/>
+          <w:lang w:bidi="th-TH"/>
+        </w:rPr>
+        <w:t>In</w:t>
+      </w:r>
+      <w:r>
+        <w:rPr>
+          <w:rStyle w:val="Emphasis"/>
+          <w:i w:val="0"/>
+          <w:iCs w:val="0"/>
+          <w:lang w:bidi="th-TH"/>
+        </w:rPr>
+        <w:t xml:space="preserve"> the 4-unit-cells edge filter design, the amorphous </w:t>
+      </w:r>
+      <w:r>
+        <w:rPr>
+          <w:rStyle w:val="Emphasis"/>
+          <w:i w:val="0"/>
+          <w:iCs w:val="0"/>
+          <w:lang w:bidi="th-TH"/>
+        </w:rPr>
+        <w:t xml:space="preserve">phase </w:t>
+      </w:r>
+      <w:r>
+        <w:rPr>
+          <w:rStyle w:val="Emphasis"/>
+          <w:i w:val="0"/>
+          <w:iCs w:val="0"/>
+          <w:lang w:bidi="th-TH"/>
+        </w:rPr>
+        <w:t>transmittance also remains high but the crystalline transmittance exhibits</w:t>
+      </w:r>
+      <w:r>
+        <w:rPr>
+          <w:rStyle w:val="Emphasis"/>
+          <w:i w:val="0"/>
+          <w:iCs w:val="0"/>
+          <w:lang w:bidi="th-TH"/>
+        </w:rPr>
+        <w:t xml:space="preserve"> slight increase</w:t>
+      </w:r>
+      <w:r>
+        <w:rPr>
+          <w:rStyle w:val="Emphasis"/>
+          <w:i w:val="0"/>
+          <w:iCs w:val="0"/>
+          <w:lang w:bidi="th-TH"/>
+        </w:rPr>
+        <w:t xml:space="preserve"> (Fig. 8b)</w:t>
+      </w:r>
+      <w:r>
+        <w:rPr>
+          <w:rStyle w:val="Emphasis"/>
+          <w:i w:val="0"/>
+          <w:iCs w:val="0"/>
+          <w:lang w:bidi="th-TH"/>
+        </w:rPr>
+        <w:t xml:space="preserve">. </w:t>
+      </w:r>
+      <w:r>
+        <w:rPr>
+          <w:rStyle w:val="Emphasis"/>
+          <w:i w:val="0"/>
+          <w:iCs w:val="0"/>
+          <w:lang w:bidi="th-TH"/>
+        </w:rPr>
+        <w:t>Which</w:t>
+      </w:r>
+      <w:r>
+        <w:rPr>
+          <w:rStyle w:val="Emphasis"/>
+          <w:i w:val="0"/>
+          <w:iCs w:val="0"/>
+          <w:lang w:bidi="th-TH"/>
+        </w:rPr>
+        <w:t xml:space="preserve"> </w:t>
+      </w:r>
+      <w:r>
+        <w:rPr>
+          <w:rStyle w:val="Emphasis"/>
+          <w:i w:val="0"/>
+          <w:iCs w:val="0"/>
+          <w:lang w:bidi="th-TH"/>
+        </w:rPr>
+        <w:t xml:space="preserve">cause </w:t>
+      </w:r>
+      <w:r>
+        <w:rPr>
+          <w:rStyle w:val="Emphasis"/>
+          <w:i w:val="0"/>
+          <w:iCs w:val="0"/>
+          <w:lang w:bidi="th-TH"/>
+        </w:rPr>
+        <w:t>the contrast degradation</w:t>
+      </w:r>
+      <w:r>
+        <w:rPr>
+          <w:rStyle w:val="Emphasis"/>
+          <w:i w:val="0"/>
+          <w:iCs w:val="0"/>
+          <w:lang w:bidi="th-TH"/>
+        </w:rPr>
+        <w:t xml:space="preserve">, shown in Fig. 8e, </w:t>
+      </w:r>
+      <w:r>
+        <w:rPr>
+          <w:rStyle w:val="Emphasis"/>
+          <w:i w:val="0"/>
+          <w:iCs w:val="0"/>
+          <w:lang w:bidi="th-TH"/>
+        </w:rPr>
+        <w:t xml:space="preserve">to has a </w:t>
+      </w:r>
+      <w:r>
+        <w:rPr>
+          <w:rStyle w:val="Emphasis"/>
+          <w:i w:val="0"/>
+          <w:iCs w:val="0"/>
+          <w:lang w:bidi="th-TH"/>
+        </w:rPr>
+        <w:t xml:space="preserve">noticeably larger </w:t>
+      </w:r>
+      <w:r>
+        <w:rPr>
+          <w:rStyle w:val="Emphasis"/>
+          <w:i w:val="0"/>
+          <w:iCs w:val="0"/>
+          <w:lang w:bidi="th-TH"/>
+        </w:rPr>
+        <w:t xml:space="preserve">change </w:t>
+      </w:r>
+      <w:r>
+        <w:rPr>
+          <w:rStyle w:val="Emphasis"/>
+          <w:i w:val="0"/>
+          <w:iCs w:val="0"/>
+          <w:lang w:bidi="th-TH"/>
+        </w:rPr>
+        <w:t xml:space="preserve">than the single-layer design, </w:t>
+      </w:r>
+      <w:r>
+        <w:rPr>
+          <w:rStyle w:val="Emphasis"/>
+          <w:i w:val="0"/>
+          <w:iCs w:val="0"/>
+          <w:lang w:bidi="th-TH"/>
+        </w:rPr>
+        <w:t>which reflects the higher sensitivity of resonant edge to small changes in Sb</w:t>
+      </w:r>
+      <w:r>
+        <w:rPr>
+          <w:rStyle w:val="Emphasis"/>
+          <w:i w:val="0"/>
+          <w:iCs w:val="0"/>
+          <w:vertAlign w:val="subscript"/>
+          <w:lang w:bidi="th-TH"/>
+        </w:rPr>
+        <w:t>2</w:t>
+      </w:r>
+      <w:r>
+        <w:rPr>
+          <w:rStyle w:val="Emphasis"/>
+          <w:i w:val="0"/>
+          <w:iCs w:val="0"/>
+          <w:lang w:bidi="th-TH"/>
+        </w:rPr>
+        <w:t>Se</w:t>
+      </w:r>
+      <w:r>
+        <w:rPr>
+          <w:rStyle w:val="Emphasis"/>
+          <w:i w:val="0"/>
+          <w:iCs w:val="0"/>
+          <w:vertAlign w:val="subscript"/>
+          <w:lang w:bidi="th-TH"/>
+        </w:rPr>
+        <w:t>3</w:t>
+      </w:r>
+      <w:r>
+        <w:rPr>
+          <w:rStyle w:val="Emphasis"/>
+          <w:i w:val="0"/>
+          <w:iCs w:val="0"/>
+          <w:lang w:bidi="th-TH"/>
+        </w:rPr>
+        <w:t xml:space="preserve"> refractive index.</w:t>
+      </w:r>
+      <w:r>
+        <w:rPr>
+          <w:rStyle w:val="Emphasis"/>
+          <w:i w:val="0"/>
+          <w:iCs w:val="0"/>
+          <w:lang w:bidi="th-TH"/>
+        </w:rPr>
+        <w:t xml:space="preserve"> The insertion loss of amorphous phase </w:t>
+      </w:r>
+      <w:r>
+        <w:rPr>
+          <w:rStyle w:val="Emphasis"/>
+          <w:i w:val="0"/>
+          <w:iCs w:val="0"/>
+          <w:lang w:bidi="th-TH"/>
+        </w:rPr>
+        <w:t xml:space="preserve">(Fig. 8h) </w:t>
+      </w:r>
+      <w:r>
+        <w:rPr>
+          <w:rStyle w:val="Emphasis"/>
+          <w:i w:val="0"/>
+          <w:iCs w:val="0"/>
+          <w:lang w:bidi="th-TH"/>
+        </w:rPr>
+        <w:t xml:space="preserve">also increase more rapidly, </w:t>
+      </w:r>
+      <w:r>
+        <w:rPr>
+          <w:rStyle w:val="Emphasis"/>
+          <w:i w:val="0"/>
+          <w:iCs w:val="0"/>
+          <w:lang w:bidi="th-TH"/>
+        </w:rPr>
+        <w:t>which consists of</w:t>
+      </w:r>
+      <w:r>
+        <w:rPr>
+          <w:rStyle w:val="Emphasis"/>
+          <w:i w:val="0"/>
+          <w:iCs w:val="0"/>
+          <w:lang w:bidi="th-TH"/>
+        </w:rPr>
+        <w:t xml:space="preserve"> a </w:t>
+      </w:r>
+      <w:r>
+        <w:rPr>
+          <w:rStyle w:val="Emphasis"/>
           <w:i w:val="0"/>
           <w:iCs w:val="0"/>
           <w:highlight w:val="yellow"/>
-        </w:rPr>
-        <w:t>The optical endurance</w:t>
+          <w:lang w:bidi="th-TH"/>
+        </w:rPr>
+        <w:t>stronger field confinement and longer effective optical path within the lossy material</w:t>
       </w:r>
       <w:r>
         <w:rPr>
           <w:rStyle w:val="Emphasis"/>
-          <w:rFonts w:cs="Times New Roman"/>
           <w:i w:val="0"/>
           <w:iCs w:val="0"/>
-          <w:highlight w:val="yellow"/>
-        </w:rPr>
-        <w:t xml:space="preserve"> </w:t>
-      </w:r>
-      <w:r>
-        <w:rPr>
-          <w:rFonts w:cs="Times New Roman"/>
-          <w:highlight w:val="yellow"/>
-        </w:rPr>
-        <w:t xml:space="preserve">comparison will be between </w:t>
-      </w:r>
-      <w:r>
-        <w:rPr>
-          <w:rFonts w:cs="Times New Roman"/>
-          <w:highlight w:val="yellow"/>
-        </w:rPr>
-        <w:t xml:space="preserve">the </w:t>
-      </w:r>
-      <w:r>
-        <w:rPr>
-          <w:rFonts w:cs="Times New Roman"/>
-          <w:highlight w:val="yellow"/>
-        </w:rPr>
-        <w:t xml:space="preserve">single-layer </w:t>
-      </w:r>
-      <w:r>
-        <w:rPr>
-          <w:rFonts w:cs="Times New Roman"/>
-          <w:highlight w:val="yellow"/>
-        </w:rPr>
-        <w:t xml:space="preserve">HWOT-thick </w:t>
-      </w:r>
-      <w:r>
-        <w:rPr>
-          <w:rFonts w:cs="Times New Roman"/>
-          <w:highlight w:val="yellow"/>
-        </w:rPr>
-        <w:t>Sb</w:t>
-      </w:r>
-      <w:r>
-        <w:rPr>
-          <w:rFonts w:cs="Times New Roman"/>
-          <w:highlight w:val="yellow"/>
-          <w:vertAlign w:val="subscript"/>
-        </w:rPr>
-        <w:t>2</w:t>
-      </w:r>
-      <w:r>
-        <w:rPr>
-          <w:rFonts w:cs="Times New Roman"/>
-          <w:highlight w:val="yellow"/>
-        </w:rPr>
-        <w:t>Se</w:t>
-      </w:r>
-      <w:r>
-        <w:rPr>
-          <w:rFonts w:cs="Times New Roman"/>
-          <w:highlight w:val="yellow"/>
-          <w:vertAlign w:val="subscript"/>
-        </w:rPr>
-        <w:t>3</w:t>
-      </w:r>
-      <w:r>
-        <w:rPr>
-          <w:rFonts w:cs="Times New Roman"/>
-          <w:highlight w:val="yellow"/>
-        </w:rPr>
-        <w:t xml:space="preserve"> design,</w:t>
-      </w:r>
-      <w:r>
-        <w:rPr>
-          <w:rFonts w:cs="Times New Roman"/>
-          <w:highlight w:val="yellow"/>
-        </w:rPr>
-        <w:t xml:space="preserve"> </w:t>
-      </w:r>
-      <w:r>
-        <w:rPr>
-          <w:rFonts w:cs="Times New Roman"/>
-          <w:highlight w:val="yellow"/>
-        </w:rPr>
-        <w:t xml:space="preserve">and long-pass edge-filter </w:t>
-      </w:r>
-      <w:r>
-        <w:rPr>
-          <w:rFonts w:cs="Times New Roman"/>
-          <w:highlight w:val="yellow"/>
-        </w:rPr>
-        <w:t xml:space="preserve">with </w:t>
-      </w:r>
-      <w:r>
-        <w:rPr>
-          <w:rFonts w:cs="Times New Roman"/>
-          <w:i/>
-          <w:iCs/>
-          <w:highlight w:val="yellow"/>
-        </w:rPr>
-        <w:t>N</w:t>
-      </w:r>
-      <w:r>
-        <w:rPr>
-          <w:rFonts w:cs="Times New Roman"/>
-          <w:highlight w:val="yellow"/>
-        </w:rPr>
-        <w:t xml:space="preserve"> = </w:t>
-      </w:r>
-      <w:r>
-        <w:rPr>
-          <w:rFonts w:cs="Times New Roman"/>
-          <w:highlight w:val="yellow"/>
-        </w:rPr>
-        <w:t xml:space="preserve">4 and </w:t>
-      </w:r>
-      <w:r>
-        <w:rPr>
-          <w:rFonts w:cs="Times New Roman"/>
-          <w:i/>
-          <w:iCs/>
-          <w:highlight w:val="yellow"/>
-        </w:rPr>
-        <w:t>N</w:t>
-      </w:r>
-      <w:r>
-        <w:rPr>
-          <w:rFonts w:cs="Times New Roman"/>
-          <w:highlight w:val="yellow"/>
-        </w:rPr>
-        <w:t xml:space="preserve"> = </w:t>
-      </w:r>
-      <w:r>
-        <w:rPr>
-          <w:rFonts w:cs="Times New Roman"/>
-          <w:highlight w:val="yellow"/>
-        </w:rPr>
-        <w:t>5</w:t>
-      </w:r>
-      <w:r>
-        <w:rPr>
-          <w:rFonts w:cs="Times New Roman"/>
-          <w:highlight w:val="yellow"/>
-        </w:rPr>
-        <w:t xml:space="preserve"> </w:t>
-      </w:r>
-      <w:r>
-        <w:rPr>
-          <w:rFonts w:cs="Times New Roman"/>
-          <w:highlight w:val="yellow"/>
-        </w:rPr>
-        <w:t>design</w:t>
-      </w:r>
-      <w:r>
-        <w:rPr>
-          <w:rFonts w:cs="Times New Roman"/>
-          <w:highlight w:val="yellow"/>
-        </w:rPr>
-        <w:t>s</w:t>
-      </w:r>
-      <w:r>
-        <w:rPr>
-          <w:rFonts w:cs="Times New Roman"/>
-          <w:highlight w:val="yellow"/>
-        </w:rPr>
-        <w:t>. Figure</w:t>
-      </w:r>
-      <w:r>
-        <w:rPr>
-          <w:rFonts w:cs="Times New Roman"/>
-          <w:highlight w:val="yellow"/>
-        </w:rPr>
-        <w:t>s</w:t>
-      </w:r>
-      <w:r>
-        <w:rPr>
-          <w:rFonts w:cs="Times New Roman"/>
-          <w:highlight w:val="yellow"/>
-        </w:rPr>
-        <w:t xml:space="preserve"> </w:t>
-      </w:r>
-      <w:r>
-        <w:rPr>
-          <w:rFonts w:cs="Times New Roman"/>
-          <w:highlight w:val="yellow"/>
-        </w:rPr>
-        <w:t>8(a-c)</w:t>
-      </w:r>
-      <w:r>
-        <w:rPr>
-          <w:rFonts w:cs="Times New Roman"/>
-          <w:highlight w:val="yellow"/>
-        </w:rPr>
-        <w:t xml:space="preserve"> shows the transmittance in amorphous </w:t>
-      </w:r>
-      <w:r>
-        <w:rPr>
-          <w:rFonts w:cs="Times New Roman"/>
-          <w:highlight w:val="yellow"/>
-        </w:rPr>
-        <w:t xml:space="preserve">(ON mode) </w:t>
-      </w:r>
-      <w:r>
-        <w:rPr>
-          <w:rFonts w:cs="Times New Roman"/>
-          <w:highlight w:val="yellow"/>
-        </w:rPr>
-        <w:t xml:space="preserve">or crystalline phases </w:t>
-      </w:r>
-      <w:r>
-        <w:rPr>
-          <w:rFonts w:cs="Times New Roman"/>
-          <w:highlight w:val="yellow"/>
-        </w:rPr>
-        <w:t>(OFF mode) after</w:t>
-      </w:r>
-      <w:r>
-        <w:rPr>
-          <w:rFonts w:cs="Times New Roman"/>
-          <w:highlight w:val="yellow"/>
-        </w:rPr>
-        <w:t xml:space="preserve"> phase switching cycle (</w:t>
-      </w:r>
-      <w:r>
-        <w:rPr>
-          <w:rFonts w:cs="Times New Roman"/>
-          <w:i/>
-          <w:iCs/>
-          <w:highlight w:val="yellow"/>
-        </w:rPr>
-        <w:t>C</w:t>
-      </w:r>
-      <w:r>
-        <w:rPr>
-          <w:rFonts w:cs="Times New Roman"/>
-          <w:highlight w:val="yellow"/>
-        </w:rPr>
-        <w:t xml:space="preserve">). </w:t>
+          <w:lang w:bidi="th-TH"/>
+        </w:rPr>
+        <w:t xml:space="preserve">. </w:t>
       </w:r>
       <w:r>
         <w:rPr>
           <w:rStyle w:val="Emphasis"/>
-          <w:rFonts w:cs="Times New Roman"/>
           <w:i w:val="0"/>
           <w:iCs w:val="0"/>
-          <w:highlight w:val="yellow"/>
-        </w:rPr>
-        <w:t xml:space="preserve">For single-layer design (Fig. </w:t>
+          <w:lang w:bidi="th-TH"/>
+        </w:rPr>
+        <w:t>The</w:t>
       </w:r>
       <w:r>
         <w:rPr>
           <w:rStyle w:val="Emphasis"/>
-          <w:rFonts w:cs="Times New Roman"/>
           <w:i w:val="0"/>
           <w:iCs w:val="0"/>
-          <w:highlight w:val="yellow"/>
-        </w:rPr>
-        <w:t>8</w:t>
+          <w:lang w:bidi="th-TH"/>
+        </w:rPr>
+        <w:t xml:space="preserve"> 5-unit-cells </w:t>
       </w:r>
       <w:r>
         <w:rPr>
           <w:rStyle w:val="Emphasis"/>
-          <w:rFonts w:cs="Times New Roman"/>
           <w:i w:val="0"/>
           <w:iCs w:val="0"/>
-          <w:highlight w:val="yellow"/>
-        </w:rPr>
-        <w:t>a), the amorphous-phase transmittance stays high over most of the cycling window, whereas the crystalline-phase transmittance slowly decreases with cycling number</w:t>
+          <w:lang w:bidi="th-TH"/>
+        </w:rPr>
+        <w:t>structure</w:t>
       </w:r>
       <w:r>
         <w:rPr>
           <w:rStyle w:val="Emphasis"/>
-          <w:rFonts w:cs="Times New Roman"/>
           <w:i w:val="0"/>
           <w:iCs w:val="0"/>
-          <w:highlight w:val="yellow"/>
-        </w:rPr>
-        <w:t xml:space="preserve">. </w:t>
+          <w:lang w:bidi="th-TH"/>
+        </w:rPr>
+        <w:t xml:space="preserve"> further accentuates these trends: its crystalline-phase transmittance</w:t>
       </w:r>
       <w:r>
         <w:rPr>
           <w:rStyle w:val="Emphasis"/>
-          <w:rFonts w:cs="Times New Roman"/>
           <w:i w:val="0"/>
           <w:iCs w:val="0"/>
-          <w:highlight w:val="yellow"/>
-        </w:rPr>
-        <w:t xml:space="preserve">In the two-layers design (Fig. </w:t>
+          <w:lang w:bidi="th-TH"/>
+        </w:rPr>
+        <w:t xml:space="preserve"> (Fig. 8c)</w:t>
       </w:r>
       <w:r>
         <w:rPr>
           <w:rStyle w:val="Emphasis"/>
-          <w:rFonts w:cs="Times New Roman"/>
           <w:i w:val="0"/>
           <w:iCs w:val="0"/>
-          <w:highlight w:val="yellow"/>
-        </w:rPr>
-        <w:t>8</w:t>
+          <w:lang w:bidi="th-TH"/>
+        </w:rPr>
+        <w:t xml:space="preserve"> and transmittance contrast </w:t>
       </w:r>
       <w:r>
         <w:rPr>
           <w:rStyle w:val="Emphasis"/>
-          <w:rFonts w:cs="Times New Roman"/>
           <w:i w:val="0"/>
           <w:iCs w:val="0"/>
-          <w:highlight w:val="yellow"/>
-        </w:rPr>
-        <w:t>b), the addition of TiO</w:t>
+          <w:lang w:bidi="th-TH"/>
+        </w:rPr>
+        <w:t>degradation (Fig. 8f)</w:t>
       </w:r>
       <w:r>
         <w:rPr>
           <w:rStyle w:val="Emphasis"/>
-          <w:rFonts w:cs="Times New Roman"/>
           <w:i w:val="0"/>
           <w:iCs w:val="0"/>
-          <w:highlight w:val="yellow"/>
-          <w:vertAlign w:val="subscript"/>
-        </w:rPr>
-        <w:t>2</w:t>
+          <w:lang w:bidi="th-TH"/>
+        </w:rPr>
+        <w:t xml:space="preserve"> </w:t>
       </w:r>
       <w:r>
         <w:rPr>
           <w:rStyle w:val="Emphasis"/>
-          <w:rFonts w:cs="Times New Roman"/>
           <w:i w:val="0"/>
           <w:iCs w:val="0"/>
-          <w:highlight w:val="yellow"/>
-        </w:rPr>
-        <w:t xml:space="preserve"> layer slightly modifies the absolute transmittance levels but preserves the same qualitative trend of stable high-transmittance amorphous phase and slowly brightening crystalline phase. For the 5-unit-cells long-pass edge-filter design (Fig. </w:t>
+          <w:lang w:bidi="th-TH"/>
+        </w:rPr>
+        <w:t>have the largest change among the three designs</w:t>
       </w:r>
       <w:r>
         <w:rPr>
           <w:rStyle w:val="Emphasis"/>
-          <w:rFonts w:cs="Times New Roman"/>
           <w:i w:val="0"/>
           <w:iCs w:val="0"/>
-          <w:highlight w:val="yellow"/>
-        </w:rPr>
-        <w:t>8</w:t>
+          <w:lang w:bidi="th-TH"/>
+        </w:rPr>
+        <w:t xml:space="preserve">, </w:t>
       </w:r>
       <w:r>
         <w:rPr>
           <w:rStyle w:val="Emphasis"/>
-          <w:rFonts w:cs="Times New Roman"/>
           <w:i w:val="0"/>
           <w:iCs w:val="0"/>
-          <w:highlight w:val="yellow"/>
-        </w:rPr>
-        <w:t xml:space="preserve">c), the transmittance of the crystalline phase increases over cycles instead, and both states show more pronounced evolution because </w:t>
+          <w:lang w:bidi="th-TH"/>
+        </w:rPr>
+        <w:t>and</w:t>
       </w:r>
       <w:r>
         <w:rPr>
           <w:rStyle w:val="Emphasis"/>
-          <w:rFonts w:cs="Times New Roman"/>
           <w:i w:val="0"/>
           <w:iCs w:val="0"/>
-          <w:highlight w:val="yellow"/>
-        </w:rPr>
-        <w:t xml:space="preserve">a </w:t>
+          <w:lang w:bidi="th-TH"/>
+        </w:rPr>
+        <w:t xml:space="preserve"> </w:t>
       </w:r>
       <w:r>
         <w:rPr>
           <w:rStyle w:val="Emphasis"/>
-          <w:rFonts w:cs="Times New Roman"/>
           <w:i w:val="0"/>
           <w:iCs w:val="0"/>
-          <w:highlight w:val="yellow"/>
-        </w:rPr>
-        <w:t>resonance design is more sensitive to small refractive index shift, yet the device still maintains a clear separation between amorphous and crystalline transmission after 1.5×10⁶ phase switching cycles.</w:t>
+          <w:lang w:bidi="th-TH"/>
+        </w:rPr>
+        <w:t>its</w:t>
+      </w:r>
+      <w:r>
+        <w:rPr>
+          <w:rStyle w:val="Emphasis"/>
+          <w:i w:val="0"/>
+          <w:iCs w:val="0"/>
+          <w:lang w:bidi="th-TH"/>
+        </w:rPr>
+        <w:t xml:space="preserve"> insertion loss </w:t>
+      </w:r>
+      <w:r>
+        <w:rPr>
+          <w:rStyle w:val="Emphasis"/>
+          <w:i w:val="0"/>
+          <w:iCs w:val="0"/>
+          <w:lang w:bidi="th-TH"/>
+        </w:rPr>
+        <w:t xml:space="preserve">(Fig. 8i) </w:t>
+      </w:r>
+      <w:r>
+        <w:rPr>
+          <w:rStyle w:val="Emphasis"/>
+          <w:i w:val="0"/>
+          <w:iCs w:val="0"/>
+          <w:lang w:bidi="th-TH"/>
+        </w:rPr>
+        <w:t>also shows the largest cumulative increase.</w:t>
+      </w:r>
+      <w:r>
+        <w:rPr>
+          <w:rStyle w:val="Emphasis"/>
+          <w:i w:val="0"/>
+          <w:iCs w:val="0"/>
+          <w:lang w:bidi="th-TH"/>
+        </w:rPr>
+        <w:t xml:space="preserve"> </w:t>
       </w:r>
     </w:p>
     <w:p>
@@ -26755,119 +27826,109 @@
         <w:pStyle w:val="10BodySubsequentParagraph"/>
         <w:rPr>
           <w:rStyle w:val="Emphasis"/>
-          <w:rFonts w:cs="Times New Roman"/>
           <w:i w:val="0"/>
           <w:iCs w:val="0"/>
-          <w:highlight w:val="yellow"/>
+          <w:lang w:bidi="th-TH"/>
         </w:rPr>
       </w:pPr>
       <w:r>
         <w:rPr>
           <w:rStyle w:val="Emphasis"/>
-          <w:rFonts w:cs="Times New Roman"/>
           <w:i w:val="0"/>
           <w:iCs w:val="0"/>
-          <w:highlight w:val="yellow"/>
-        </w:rPr>
-        <w:t>Figure</w:t>
+          <w:lang w:bidi="th-TH"/>
+        </w:rPr>
+        <w:t>These results highlight the expected trade-off between high initial optical performance and endurance robustness: increasing cavity complexity and Q-factor enhances on-resonance modulation but also amplifies the impact of endurance-induced index drift and loss in Sb</w:t>
       </w:r>
       <w:r>
         <w:rPr>
           <w:rStyle w:val="Emphasis"/>
-          <w:rFonts w:cs="Times New Roman"/>
           <w:i w:val="0"/>
           <w:iCs w:val="0"/>
-          <w:highlight w:val="yellow"/>
-        </w:rPr>
-        <w:t>s</w:t>
+          <w:vertAlign w:val="subscript"/>
+          <w:lang w:bidi="th-TH"/>
+        </w:rPr>
+        <w:t>2</w:t>
       </w:r>
       <w:r>
         <w:rPr>
           <w:rStyle w:val="Emphasis"/>
-          <w:rFonts w:cs="Times New Roman"/>
           <w:i w:val="0"/>
           <w:iCs w:val="0"/>
-          <w:highlight w:val="yellow"/>
-        </w:rPr>
-        <w:t xml:space="preserve"> </w:t>
+          <w:lang w:bidi="th-TH"/>
+        </w:rPr>
+        <w:t>Se</w:t>
       </w:r>
       <w:r>
         <w:rPr>
           <w:rStyle w:val="Emphasis"/>
-          <w:rFonts w:cs="Times New Roman"/>
           <w:i w:val="0"/>
           <w:iCs w:val="0"/>
-          <w:highlight w:val="yellow"/>
-        </w:rPr>
-        <w:t>8(d-f)</w:t>
+          <w:vertAlign w:val="subscript"/>
+          <w:lang w:bidi="th-TH"/>
+        </w:rPr>
+        <w:t>3</w:t>
       </w:r>
       <w:r>
         <w:rPr>
           <w:rStyle w:val="Emphasis"/>
-          <w:rFonts w:cs="Times New Roman"/>
           <w:i w:val="0"/>
           <w:iCs w:val="0"/>
-          <w:highlight w:val="yellow"/>
-        </w:rPr>
-        <w:t xml:space="preserve"> shows the transmittance contrast degradation</w:t>
+          <w:lang w:bidi="th-TH"/>
+        </w:rPr>
+        <w:t xml:space="preserve">. </w:t>
       </w:r>
       <w:r>
         <w:rPr>
           <w:rStyle w:val="Emphasis"/>
-          <w:rFonts w:cs="Times New Roman"/>
           <w:i w:val="0"/>
           <w:iCs w:val="0"/>
-          <w:highlight w:val="yellow"/>
-        </w:rPr>
-        <w:t xml:space="preserve">, </w:t>
+          <w:lang w:bidi="th-TH"/>
+        </w:rPr>
+        <w:t>A</w:t>
       </w:r>
       <w:r>
         <w:rPr>
           <w:rStyle w:val="Emphasis"/>
-          <w:rFonts w:cs="Times New Roman"/>
           <w:i w:val="0"/>
           <w:iCs w:val="0"/>
-          <w:highlight w:val="yellow"/>
-        </w:rPr>
-        <w:t>expressed as a percentage relative to the initial cycle (</w:t>
+          <w:lang w:bidi="th-TH"/>
+        </w:rPr>
+        <w:t xml:space="preserve"> simpler single-layer stack provide better long-term stability, whereas resonant designs require tighter control of material and thermal cycling conditions. Even so, </w:t>
       </w:r>
       <w:r>
         <w:rPr>
           <w:rStyle w:val="Emphasis"/>
-          <w:rFonts w:cs="Times New Roman"/>
-          <w:highlight w:val="yellow"/>
-        </w:rPr>
-        <w:t>C</w:t>
-      </w:r>
-      <w:r>
-        <w:rPr>
-          <w:rStyle w:val="Emphasis"/>
-          <w:rFonts w:cs="Times New Roman"/>
           <w:i w:val="0"/>
           <w:iCs w:val="0"/>
-          <w:highlight w:val="yellow"/>
-        </w:rPr>
-        <w:t xml:space="preserve"> = 0). Surprisingly, both single-layer</w:t>
+          <w:lang w:bidi="th-TH"/>
+        </w:rPr>
+        <w:t xml:space="preserve">both long-pass edge-filter designs still has a higher </w:t>
       </w:r>
       <w:r>
         <w:rPr>
           <w:rStyle w:val="Emphasis"/>
-          <w:rFonts w:cs="Times New Roman"/>
+          <w:lang w:bidi="th-TH"/>
+        </w:rPr>
+        <w:t>ΔT</w:t>
+      </w:r>
+      <w:r>
+        <w:rPr>
+          <w:rStyle w:val="Emphasis"/>
           <w:i w:val="0"/>
           <w:iCs w:val="0"/>
-          <w:highlight w:val="yellow"/>
-        </w:rPr>
-        <w:t xml:space="preserve"> (Fig. 8d)</w:t>
+          <w:lang w:bidi="th-TH"/>
+        </w:rPr>
+        <w:t xml:space="preserve"> </w:t>
       </w:r>
       <w:r>
         <w:rPr>
           <w:rStyle w:val="Emphasis"/>
-          <w:rFonts w:cs="Times New Roman"/>
           <w:i w:val="0"/>
           <w:iCs w:val="0"/>
-          <w:highlight w:val="yellow"/>
-        </w:rPr>
-        <w:t xml:space="preserve"> and two-layers designs </w:t>
+          <w:lang w:bidi="th-TH"/>
+        </w:rPr>
+        <w:t xml:space="preserve">after </w:t>
       </w:r>
       <w:r>
         <w:rPr>
@@ -26875,9 +27936,8 @@
           <w:rFonts w:cs="Times New Roman"/>
           <w:i w:val="0"/>
           <w:iCs w:val="0"/>
-          <w:highlight w:val="yellow"/>
-        </w:rPr>
-        <w:t xml:space="preserve">(Fig. 8e) </w:t>
+        </w:rPr>
+        <w:t>1.5</w:t>
       </w:r>
       <w:r>
         <w:rPr>
@@ -26885,9 +27945,8 @@
           <w:rFonts w:cs="Times New Roman"/>
           <w:i w:val="0"/>
           <w:iCs w:val="0"/>
-          <w:highlight w:val="yellow"/>
-        </w:rPr>
-        <w:t>show positive contrast degradation, especially as the simulations approach the end. This indicates that the modulating performance of these two designs improves with phase switching</w:t>
+        </w:rPr>
+        <w:t>×10⁶</w:t>
       </w:r>
       <w:r>
         <w:rPr>
@@ -26895,9 +27954,8 @@
           <w:rFonts w:cs="Times New Roman"/>
           <w:i w:val="0"/>
           <w:iCs w:val="0"/>
-          <w:highlight w:val="yellow"/>
-        </w:rPr>
-        <w:t xml:space="preserve"> cycles</w:t>
+        </w:rPr>
+        <w:t xml:space="preserve"> cycle</w:t>
       </w:r>
       <w:r>
         <w:rPr>
@@ -26905,30 +27963,38 @@
           <w:rFonts w:cs="Times New Roman"/>
           <w:i w:val="0"/>
           <w:iCs w:val="0"/>
-          <w:highlight w:val="yellow"/>
-        </w:rPr>
-        <w:t xml:space="preserve">. </w:t>
+        </w:rPr>
+        <w:t>s</w:t>
       </w:r>
       <w:r>
         <w:rPr>
           <w:rStyle w:val="Emphasis"/>
-          <w:rFonts w:cs="Times New Roman"/>
           <w:i w:val="0"/>
           <w:iCs w:val="0"/>
-          <w:highlight w:val="yellow"/>
-        </w:rPr>
-        <w:t xml:space="preserve">But this is opposite for edge-filter design, where the transmittance contrast degradation is in negative, i.e., the modulating power decreases with switching cycles. </w:t>
+          <w:lang w:bidi="th-TH"/>
+        </w:rPr>
+        <w:t xml:space="preserve"> </w:t>
       </w:r>
       <w:r>
         <w:rPr>
           <w:rStyle w:val="Emphasis"/>
-          <w:rFonts w:cs="Times New Roman"/>
           <w:i w:val="0"/>
           <w:iCs w:val="0"/>
-          <w:highlight w:val="yellow"/>
-        </w:rPr>
-        <w:t>The two-layers and edge-filter designs display much larger percentage degradations than the single-layer design, indicate that while resonant enhancement improves low-cycle performance, it also amplifies the impact of long-term drift in phase-change materials.</w:t>
-      </w:r>
+          <w:lang w:bidi="th-TH"/>
+        </w:rPr>
+        <w:t>than the single-layer design.</w:t>
+      </w:r>
+    </w:p>
+    <w:p>
+      <w:pPr>
+        <w:pStyle w:val="10BodySubsequentParagraph"/>
+        <w:rPr>
+          <w:rStyle w:val="Emphasis"/>
+          <w:i w:val="0"/>
+          <w:iCs w:val="0"/>
+          <w:lang w:bidi="th-TH"/>
+        </w:rPr>
+      </w:pPr>
     </w:p>
     <w:p>
       <w:pPr>
@@ -26959,10 +28025,10 @@
           <w:sz w:val="20"/>
         </w:rPr>
         <w:drawing>
-          <wp:inline distT="0" distB="0" distL="0" distR="0" wp14:anchorId="25D34839" wp14:editId="524B7AA1">
-            <wp:extent cx="4791710" cy="3571240"/>
-            <wp:effectExtent l="0" t="0" r="8890" b="0"/>
-            <wp:docPr id="1350596765" name="Picture 1"/>
+          <wp:inline distT="0" distB="0" distL="0" distR="0" wp14:anchorId="64D53C20" wp14:editId="742FE6AF">
+            <wp:extent cx="4791710" cy="3618901"/>
+            <wp:effectExtent l="0" t="0" r="8890" b="635"/>
+            <wp:docPr id="347325510" name="Picture 1"/>
             <wp:cNvGraphicFramePr>
               <a:graphicFrameLocks xmlns:a="http://schemas.openxmlformats.org/drawingml/2006/main" noChangeAspect="1"/>
             </wp:cNvGraphicFramePr>
@@ -26970,23 +28036,32 @@
               <a:graphicData uri="http://schemas.openxmlformats.org/drawingml/2006/picture">
                 <pic:pic xmlns:pic="http://schemas.openxmlformats.org/drawingml/2006/picture">
                   <pic:nvPicPr>
-                    <pic:cNvPr id="1350596765" name="Picture 1350596765"/>
+                    <pic:cNvPr id="347325510" name="Picture 347325510"/>
                     <pic:cNvPicPr/>
                   </pic:nvPicPr>
-                  <pic:blipFill>
+                  <pic:blipFill rotWithShape="1">
                     <a:blip r:embed="rId15"/>
+                    <a:srcRect t="868"/>
                     <a:stretch>
                       <a:fillRect/>
                     </a:stretch>
                   </pic:blipFill>
-                  <pic:spPr>
+                  <pic:spPr bwMode="auto">
                     <a:xfrm>
                       <a:off x="0" y="0"/>
-                      <a:ext cx="4791710" cy="3571240"/>
+                      <a:ext cx="4791710" cy="3618901"/>
                     </a:xfrm>
                     <a:prstGeom prst="rect">
                       <a:avLst/>
                     </a:prstGeom>
+                    <a:ln>
+                      <a:noFill/>
+                    </a:ln>
+                    <a:extLst>
+                      <a:ext uri="{53640926-AAD7-44D8-BBD7-CCE9431645EC}">
+                        <a14:shadowObscured xmlns:a14="http://schemas.microsoft.com/office/drawing/2010/main"/>
+                      </a:ext>
+                    </a:extLst>
                   </pic:spPr>
                 </pic:pic>
               </a:graphicData>
@@ -27008,6 +28083,7 @@
           <w:b/>
           <w:bCs/>
         </w:rPr>
+        <w:lastRenderedPageBreak/>
         <w:t xml:space="preserve">Fig. </w:t>
       </w:r>
       <w:r>
@@ -27050,245 +28126,17 @@
         </w:rPr>
         <w:t>. (a-c) The transmittance in ON mode (red) and OFF mode (blue) phases, (d-f) the transmittance contrast degradation, and (g-i) the ON mode insertion losses of each design.</w:t>
       </w:r>
+      <w:r>
+        <w:rPr>
+          <w:rFonts w:cs="Times New Roman"/>
+        </w:rPr>
+        <w:t xml:space="preserve"> Note the different y-axis scales.</w:t>
+      </w:r>
     </w:p>
     <w:p>
       <w:pPr>
         <w:pStyle w:val="10BodySubsequentParagraph"/>
-        <w:rPr>
-          <w:rStyle w:val="Emphasis"/>
-          <w:i w:val="0"/>
-          <w:iCs w:val="0"/>
-          <w:highlight w:val="yellow"/>
-        </w:rPr>
       </w:pPr>
-      <w:r>
-        <w:rPr>
-          <w:rStyle w:val="Emphasis"/>
-          <w:rFonts w:cs="Times New Roman"/>
-          <w:i w:val="0"/>
-          <w:iCs w:val="0"/>
-          <w:highlight w:val="yellow"/>
-        </w:rPr>
-        <w:lastRenderedPageBreak/>
-        <w:t xml:space="preserve">The insertion losses </w:t>
-      </w:r>
-      <w:r>
-        <w:rPr>
-          <w:rStyle w:val="Emphasis"/>
-          <w:rFonts w:cs="Times New Roman"/>
-          <w:i w:val="0"/>
-          <w:iCs w:val="0"/>
-          <w:highlight w:val="yellow"/>
-        </w:rPr>
-        <w:t>in</w:t>
-      </w:r>
-      <w:r>
-        <w:rPr>
-          <w:rStyle w:val="Emphasis"/>
-          <w:rFonts w:cs="Times New Roman"/>
-          <w:i w:val="0"/>
-          <w:iCs w:val="0"/>
-          <w:highlight w:val="yellow"/>
-        </w:rPr>
-        <w:t xml:space="preserve"> the amorphous phase </w:t>
-      </w:r>
-      <w:r>
-        <w:rPr>
-          <w:rStyle w:val="Emphasis"/>
-          <w:rFonts w:cs="Times New Roman"/>
-          <w:i w:val="0"/>
-          <w:iCs w:val="0"/>
-          <w:highlight w:val="yellow"/>
-        </w:rPr>
-        <w:t xml:space="preserve">(ON mode) </w:t>
-      </w:r>
-      <w:r>
-        <w:rPr>
-          <w:rStyle w:val="Emphasis"/>
-          <w:rFonts w:cs="Times New Roman"/>
-          <w:i w:val="0"/>
-          <w:iCs w:val="0"/>
-          <w:highlight w:val="yellow"/>
-        </w:rPr>
-        <w:t xml:space="preserve">of the three designs as a function of switching cycle number are shown in Fig. </w:t>
-      </w:r>
-      <w:r>
-        <w:rPr>
-          <w:rStyle w:val="Emphasis"/>
-          <w:rFonts w:cs="Times New Roman"/>
-          <w:i w:val="0"/>
-          <w:iCs w:val="0"/>
-          <w:highlight w:val="yellow"/>
-        </w:rPr>
-        <w:t>8(g-i)</w:t>
-      </w:r>
-      <w:r>
-        <w:rPr>
-          <w:rStyle w:val="Emphasis"/>
-          <w:rFonts w:cs="Times New Roman"/>
-          <w:i w:val="0"/>
-          <w:iCs w:val="0"/>
-          <w:highlight w:val="yellow"/>
-        </w:rPr>
-        <w:t xml:space="preserve">. The insertion losses increase gradually with cycling number for every </w:t>
-      </w:r>
-      <w:r>
-        <w:rPr>
-          <w:rStyle w:val="Emphasis"/>
-          <w:rFonts w:cs="Times New Roman"/>
-          <w:i w:val="0"/>
-          <w:iCs w:val="0"/>
-          <w:highlight w:val="yellow"/>
-        </w:rPr>
-        <w:t>design</w:t>
-      </w:r>
-      <w:r>
-        <w:rPr>
-          <w:rStyle w:val="Emphasis"/>
-          <w:rFonts w:cs="Times New Roman"/>
-          <w:i w:val="0"/>
-          <w:iCs w:val="0"/>
-          <w:highlight w:val="yellow"/>
-        </w:rPr>
-        <w:t>;</w:t>
-      </w:r>
-      <w:r>
-        <w:rPr>
-          <w:rStyle w:val="Emphasis"/>
-          <w:rFonts w:cs="Times New Roman"/>
-          <w:i w:val="0"/>
-          <w:iCs w:val="0"/>
-          <w:highlight w:val="yellow"/>
-        </w:rPr>
-        <w:t xml:space="preserve"> this reflects the small but cumulative rise in absorption and scattering within Sb</w:t>
-      </w:r>
-      <w:r>
-        <w:rPr>
-          <w:rStyle w:val="Emphasis"/>
-          <w:rFonts w:cs="Times New Roman"/>
-          <w:i w:val="0"/>
-          <w:iCs w:val="0"/>
-          <w:highlight w:val="yellow"/>
-          <w:vertAlign w:val="subscript"/>
-        </w:rPr>
-        <w:t>2</w:t>
-      </w:r>
-      <w:r>
-        <w:rPr>
-          <w:rStyle w:val="Emphasis"/>
-          <w:rFonts w:cs="Times New Roman"/>
-          <w:i w:val="0"/>
-          <w:iCs w:val="0"/>
-          <w:highlight w:val="yellow"/>
-        </w:rPr>
-        <w:t>Se</w:t>
-      </w:r>
-      <w:r>
-        <w:rPr>
-          <w:rStyle w:val="Emphasis"/>
-          <w:rFonts w:cs="Times New Roman"/>
-          <w:i w:val="0"/>
-          <w:iCs w:val="0"/>
-          <w:highlight w:val="yellow"/>
-          <w:vertAlign w:val="subscript"/>
-        </w:rPr>
-        <w:t>3</w:t>
-      </w:r>
-      <w:r>
-        <w:rPr>
-          <w:rStyle w:val="Emphasis"/>
-          <w:rFonts w:cs="Times New Roman"/>
-          <w:i w:val="0"/>
-          <w:iCs w:val="0"/>
-          <w:highlight w:val="yellow"/>
-        </w:rPr>
-        <w:t xml:space="preserve">. </w:t>
-      </w:r>
-      <w:r>
-        <w:rPr>
-          <w:rStyle w:val="Emphasis"/>
-          <w:rFonts w:cs="Times New Roman"/>
-          <w:i w:val="0"/>
-          <w:iCs w:val="0"/>
-          <w:highlight w:val="yellow"/>
-        </w:rPr>
-        <w:t>But the insertion losses are still</w:t>
-      </w:r>
-      <w:r>
-        <w:rPr>
-          <w:rFonts w:cs="Times New Roman"/>
-          <w:highlight w:val="yellow"/>
-        </w:rPr>
-        <w:t xml:space="preserve"> within acceptable limits.</w:t>
-      </w:r>
-    </w:p>
-    <w:p>
-      <w:pPr>
-        <w:pStyle w:val="10BodySubsequentParagraph"/>
-        <w:rPr>
-          <w:rStyle w:val="Emphasis"/>
-          <w:rFonts w:cs="Times New Roman"/>
-          <w:i w:val="0"/>
-          <w:iCs w:val="0"/>
-        </w:rPr>
-      </w:pPr>
-      <w:r>
-        <w:rPr>
-          <w:rStyle w:val="Emphasis"/>
-          <w:rFonts w:cs="Times New Roman"/>
-          <w:i w:val="0"/>
-          <w:iCs w:val="0"/>
-          <w:highlight w:val="yellow"/>
-        </w:rPr>
-        <w:t xml:space="preserve">Endurance simulations, confirm that the devices remain functional for up to 1.5×10⁶ phase switching cycles, with a gradual but design-dependent degradation of both key figure of merits. Even so, the long-pass edge-filter design still has the </w:t>
-      </w:r>
-      <w:r>
-        <w:rPr>
-          <w:rStyle w:val="Emphasis"/>
-          <w:rFonts w:cs="Times New Roman"/>
-          <w:i w:val="0"/>
-          <w:iCs w:val="0"/>
-          <w:highlight w:val="yellow"/>
-        </w:rPr>
-        <w:t>highest</w:t>
-      </w:r>
-      <w:r>
-        <w:rPr>
-          <w:rStyle w:val="Emphasis"/>
-          <w:rFonts w:cs="Times New Roman"/>
-          <w:i w:val="0"/>
-          <w:iCs w:val="0"/>
-          <w:highlight w:val="yellow"/>
-        </w:rPr>
-        <w:t xml:space="preserve"> </w:t>
-      </w:r>
-      <w:r>
-        <w:rPr>
-          <w:rStyle w:val="Emphasis"/>
-          <w:rFonts w:cs="Times New Roman"/>
-          <w:highlight w:val="yellow"/>
-        </w:rPr>
-        <w:t>ΔT</w:t>
-      </w:r>
-      <w:r>
-        <w:rPr>
-          <w:rStyle w:val="Emphasis"/>
-          <w:rFonts w:cs="Times New Roman"/>
-          <w:i w:val="0"/>
-          <w:iCs w:val="0"/>
-          <w:highlight w:val="yellow"/>
-        </w:rPr>
-        <w:t xml:space="preserve"> after </w:t>
-      </w:r>
-      <w:r>
-        <w:rPr>
-          <w:rStyle w:val="Emphasis"/>
-          <w:rFonts w:cs="Times New Roman"/>
-          <w:i w:val="0"/>
-          <w:iCs w:val="0"/>
-        </w:rPr>
-        <w:t>a million cycles.</w:t>
-      </w:r>
     </w:p>
     <w:p>
       <w:pPr>
@@ -27306,7 +28154,6 @@
           <w:rFonts w:ascii="Times New Roman" w:hAnsi="Times New Roman" w:cs="Times New Roman"/>
           <w:i/>
           <w:iCs w:val="0"/>
-          <w:highlight w:val="cyan"/>
         </w:rPr>
         <w:t>4.3</w:t>
       </w:r>
@@ -27316,7 +28163,6 @@
           <w:rFonts w:ascii="Times New Roman" w:hAnsi="Times New Roman" w:cs="Times New Roman"/>
           <w:i/>
           <w:iCs w:val="0"/>
-          <w:highlight w:val="cyan"/>
         </w:rPr>
         <w:t xml:space="preserve"> </w:t>
       </w:r>
@@ -27413,14 +28259,12 @@
         </w:rPr>
         <w:t xml:space="preserve"> </w:t>
       </w:r>
-      <w:proofErr w:type="gramStart"/>
-      <w:r>
-        <w:rPr>
-          <w:rFonts w:cs="Times New Roman"/>
-        </w:rPr>
-        <w:t>layers</w:t>
-      </w:r>
-      <w:proofErr w:type="gramEnd"/>
+      <w:r>
+        <w:rPr>
+          <w:rFonts w:cs="Times New Roman"/>
+        </w:rPr>
+        <w:t>layer</w:t>
+      </w:r>
       <w:r>
         <w:rPr>
           <w:rFonts w:cs="Times New Roman"/>
@@ -28189,22 +29033,13 @@
           <w:i w:val="0"/>
           <w:iCs w:val="0"/>
         </w:rPr>
-        <w:t xml:space="preserve">does not always be at the desired operating wavelength of 1064 nm. This is explained by the arbitrary selection of </w:t>
-      </w:r>
-      <w:r>
-        <w:rPr>
-          <w:rStyle w:val="Emphasis"/>
-          <w:rFonts w:cs="Times New Roman"/>
-          <w:i w:val="0"/>
-          <w:iCs w:val="0"/>
+        <w:t xml:space="preserve">does not always be at the desired operating wavelength of 1064 nm. This is explained by the arbitrary selection of reference wavelength in edge-filter designs. An optimization algorithm can be used to improve the optical performance at the desired wavelength, a simple merit function found in OpenFilters </w:t>
+      </w:r>
+      <w:r>
+        <w:rPr>
+          <w:rFonts w:cs="Times New Roman"/>
         </w:rPr>
         <w:lastRenderedPageBreak/>
-        <w:t xml:space="preserve">reference wavelength in edge-filter designs. An optimization algorithm can be used to improve the optical performance at the desired wavelength, a simple merit function found in OpenFilters </w:t>
-      </w:r>
-      <w:r>
-        <w:rPr>
-          <w:rFonts w:cs="Times New Roman"/>
-        </w:rPr>
         <w:fldChar w:fldCharType="begin"/>
       </w:r>
       <w:r>
@@ -29876,7 +30711,6 @@
       </w:r>
       <w:r>
         <w:rPr>
-          <w:rStyle w:val="01Title"/>
           <w:rFonts w:cs="Times New Roman"/>
         </w:rPr>
         <w:t xml:space="preserve"> </w:t>
@@ -29963,7 +30797,19 @@
         <w:rPr>
           <w:rFonts w:cs="Times New Roman"/>
         </w:rPr>
-        <w:t xml:space="preserve"> can be used as </w:t>
+        <w:t xml:space="preserve"> </w:t>
+      </w:r>
+      <w:r>
+        <w:rPr>
+          <w:rFonts w:cs="Times New Roman"/>
+        </w:rPr>
+        <w:t>is a suitable</w:t>
+      </w:r>
+      <w:r>
+        <w:rPr>
+          <w:rFonts w:cs="Times New Roman"/>
+        </w:rPr>
+        <w:t xml:space="preserve"> </w:t>
       </w:r>
       <w:r>
         <w:rPr>
@@ -29999,25 +30845,7 @@
         <w:rPr>
           <w:rFonts w:cs="Times New Roman"/>
         </w:rPr>
-        <w:t>1064</w:t>
-      </w:r>
-      <w:r>
-        <w:rPr>
-          <w:rFonts w:cs="Times New Roman"/>
-        </w:rPr>
-        <w:t>-</w:t>
-      </w:r>
-      <w:r>
-        <w:rPr>
-          <w:rFonts w:cs="Times New Roman"/>
-        </w:rPr>
-        <w:t>nm</w:t>
-      </w:r>
-      <w:r>
-        <w:rPr>
-          <w:rFonts w:cs="Times New Roman"/>
-        </w:rPr>
-        <w:t xml:space="preserve"> optical filte</w:t>
+        <w:t>optical filte</w:t>
       </w:r>
       <w:r>
         <w:rPr>
@@ -30029,6 +30857,12 @@
         <w:rPr>
           <w:rFonts w:cs="Times New Roman"/>
         </w:rPr>
+        <w:t xml:space="preserve"> operating around 1064 nm wavelengths</w:t>
+      </w:r>
+      <w:r>
+        <w:rPr>
+          <w:rFonts w:cs="Times New Roman"/>
+        </w:rPr>
         <w:t xml:space="preserve">. </w:t>
       </w:r>
       <w:r>
@@ -30074,30 +30908,7 @@
         <w:rPr>
           <w:rFonts w:cs="Times New Roman"/>
         </w:rPr>
-        <w:t xml:space="preserve"> and is overall 912.6 nm thick. </w:t>
-      </w:r>
-    </w:p>
-    <w:p>
-      <w:pPr>
-        <w:pStyle w:val="09BodyFirstParagraph"/>
-        <w:rPr>
-          <w:rFonts w:cs="Times New Roman"/>
-        </w:rPr>
-      </w:pPr>
-    </w:p>
-    <w:p>
-      <w:pPr>
-        <w:pStyle w:val="09BodyFirstParagraph"/>
-        <w:rPr>
-          <w:rFonts w:cs="Times New Roman"/>
-        </w:rPr>
-      </w:pPr>
-      <w:r>
-        <w:rPr>
-          <w:rFonts w:cs="Times New Roman"/>
-        </w:rPr>
-        <w:lastRenderedPageBreak/>
-        <w:t xml:space="preserve">The transmittance at 1064-nm in ON mode is 93.4% and 0.2% in OFF mode </w:t>
+        <w:t xml:space="preserve"> and is overall 912.6 nm thick. The transmittance at 1064-nm in ON mode is 93.4% and 0.2% in OFF mode </w:t>
       </w:r>
       <w:r>
         <w:rPr>
@@ -30151,7 +30962,25 @@
           <w:i w:val="0"/>
           <w:iCs w:val="0"/>
         </w:rPr>
-        <w:t xml:space="preserve"> around 200 nm</w:t>
+        <w:t xml:space="preserve"> </w:t>
+      </w:r>
+      <w:r>
+        <w:rPr>
+          <w:rStyle w:val="Emphasis"/>
+          <w:rFonts w:cs="Times New Roman"/>
+          <w:i w:val="0"/>
+          <w:iCs w:val="0"/>
+        </w:rPr>
+        <w:t xml:space="preserve">is </w:t>
+      </w:r>
+      <w:r>
+        <w:rPr>
+          <w:rStyle w:val="Emphasis"/>
+          <w:rFonts w:cs="Times New Roman"/>
+          <w:i w:val="0"/>
+          <w:iCs w:val="0"/>
+        </w:rPr>
+        <w:t>around 200 nm</w:t>
       </w:r>
       <w:r>
         <w:rPr>
@@ -30180,21 +31009,35 @@
           <w:rFonts w:cs="Times New Roman"/>
           <w:highlight w:val="yellow"/>
         </w:rPr>
-        <w:t xml:space="preserve">1.5×10⁶ phase switching cycles are </w:t>
+        <w:t xml:space="preserve">1.5×10⁶ phase </w:t>
       </w:r>
       <w:r>
         <w:rPr>
           <w:rFonts w:cs="Times New Roman"/>
           <w:highlight w:val="yellow"/>
         </w:rPr>
-        <w:t>with</w:t>
+        <w:t>changing</w:t>
       </w:r>
       <w:r>
         <w:rPr>
           <w:rFonts w:cs="Times New Roman"/>
           <w:highlight w:val="yellow"/>
         </w:rPr>
-        <w:t>in acceptable range.</w:t>
+        <w:t xml:space="preserve"> cycles are within acceptable range</w:t>
+      </w:r>
+      <w:r>
+        <w:rPr>
+          <w:rFonts w:cs="Times New Roman"/>
+          <w:highlight w:val="yellow"/>
+        </w:rPr>
+        <w:t>s</w:t>
+      </w:r>
+      <w:r>
+        <w:rPr>
+          <w:rFonts w:cs="Times New Roman"/>
+          <w:highlight w:val="yellow"/>
+        </w:rPr>
+        <w:t>.</w:t>
       </w:r>
       <w:r>
         <w:rPr>
@@ -30212,7 +31055,26 @@
         <w:rPr>
           <w:rFonts w:cs="Times New Roman"/>
         </w:rPr>
-        <w:t>multilayer nature of edge-filter design enables the transmittance value to be modulated gradually, and using optimization algorithm found in OpenFilters, the optical performances from 900 to 1200 have been increased.</w:t>
+        <w:t xml:space="preserve">multilayer nature of edge-filter design enables the transmittance value to be modulated </w:t>
+      </w:r>
+      <w:r>
+        <w:rPr>
+          <w:rFonts w:cs="Times New Roman"/>
+        </w:rPr>
+        <w:lastRenderedPageBreak/>
+        <w:t xml:space="preserve">gradually, and using optimization </w:t>
+      </w:r>
+      <w:r>
+        <w:rPr>
+          <w:rFonts w:cs="Times New Roman"/>
+        </w:rPr>
+        <w:t>algorithm in</w:t>
+      </w:r>
+      <w:r>
+        <w:rPr>
+          <w:rFonts w:cs="Times New Roman"/>
+        </w:rPr>
+        <w:t xml:space="preserve"> OpenFilters, the optical performances from 900 to 1200 have been increased.</w:t>
       </w:r>
     </w:p>
     <w:p>
@@ -30370,7 +31232,6 @@
         <w:rPr>
           <w:rFonts w:ascii="Times New Roman" w:hAnsi="Times New Roman" w:cs="Times New Roman"/>
           <w:bCs/>
-          <w:highlight w:val="yellow"/>
         </w:rPr>
         <w:t>Declaration of generative AI and AI-assisted technologies in the manuscript preparation process</w:t>
       </w:r>
@@ -30378,7 +31239,6 @@
         <w:rPr>
           <w:rFonts w:ascii="Times New Roman" w:hAnsi="Times New Roman" w:cs="Times New Roman"/>
           <w:bCs/>
-          <w:highlight w:val="yellow"/>
         </w:rPr>
         <w:t>.</w:t>
       </w:r>
@@ -30386,7 +31246,6 @@
         <w:rPr>
           <w:rFonts w:ascii="Times New Roman" w:hAnsi="Times New Roman" w:cs="Times New Roman"/>
           <w:bCs/>
-          <w:highlight w:val="yellow"/>
         </w:rPr>
         <w:t xml:space="preserve"> </w:t>
       </w:r>
@@ -30395,7 +31254,6 @@
           <w:rFonts w:ascii="Times New Roman" w:hAnsi="Times New Roman" w:cs="Times New Roman"/>
           <w:b w:val="0"/>
           <w:bCs/>
-          <w:highlight w:val="yellow"/>
         </w:rPr>
         <w:t xml:space="preserve">The authors used Gemini to check the logic and grammar of the manuscript, and Consensus </w:t>
       </w:r>
@@ -30404,7 +31262,6 @@
           <w:rFonts w:ascii="Times New Roman" w:hAnsi="Times New Roman" w:cs="Times New Roman"/>
           <w:b w:val="0"/>
           <w:bCs/>
-          <w:highlight w:val="yellow"/>
         </w:rPr>
         <w:t>was</w:t>
       </w:r>
@@ -30413,7 +31270,6 @@
           <w:rFonts w:ascii="Times New Roman" w:hAnsi="Times New Roman" w:cs="Times New Roman"/>
           <w:b w:val="0"/>
           <w:bCs/>
-          <w:highlight w:val="yellow"/>
         </w:rPr>
         <w:t xml:space="preserve"> used for the initial literature review. After using these tools, the authors reviewed and edited the content as needed and took full responsibility for the content of the published article.</w:t>
       </w:r>
@@ -30894,7 +31750,6 @@
         <w:ind w:left="720" w:hanging="720"/>
       </w:pPr>
       <w:r>
-        <w:lastRenderedPageBreak/>
         <w:t>[16]</w:t>
       </w:r>
       <w:r>
@@ -30938,6 +31793,7 @@
         <w:ind w:left="720" w:hanging="720"/>
       </w:pPr>
       <w:r>
+        <w:lastRenderedPageBreak/>
         <w:t>[17]</w:t>
       </w:r>
       <w:r>
@@ -34523,6 +35379,16 @@
       <w:color w:val="666666"/>
     </w:rPr>
   </w:style>
+  <w:style w:type="paragraph" w:styleId="Revision">
+    <w:name w:val="Revision"/>
+    <w:hidden/>
+    <w:uiPriority w:val="99"/>
+    <w:semiHidden/>
+    <w:rsid w:val="00364123"/>
+    <w:pPr>
+      <w:spacing w:after="0" w:line="240" w:lineRule="auto"/>
+    </w:pPr>
+  </w:style>
 </w:styles>
 </file>
 

</xml_diff>

<commit_message>
Grammar edit with Paperpal Preflight
</commit_message>
<xml_diff>
--- a/paper/[Opt. Express] Design and Simulation of a Broadband Tunable Transmittance Optical Filter Using Sb2Se3 Phase Change Material.docx
+++ b/paper/[Opt. Express] Design and Simulation of a Broadband Tunable Transmittance Optical Filter Using Sb2Se3 Phase Change Material.docx
@@ -9,130 +9,6 @@
           <w:rFonts w:ascii="Times New Roman" w:hAnsi="Times New Roman" w:cs="Times New Roman"/>
         </w:rPr>
       </w:pPr>
-      <w:r>
-        <w:rPr>
-          <w:rStyle w:val="Emphasis"/>
-          <w:rFonts w:cs="Times New Roman"/>
-          <w:i w:val="0"/>
-          <w:iCs w:val="0"/>
-          <w:noProof/>
-        </w:rPr>
-        <mc:AlternateContent>
-          <mc:Choice Requires="wps">
-            <w:drawing>
-              <wp:anchor distT="45720" distB="45720" distL="114300" distR="114300" simplePos="0" relativeHeight="251659264" behindDoc="0" locked="0" layoutInCell="1" allowOverlap="1" wp14:anchorId="47919A1C" wp14:editId="77C0DC2B">
-                <wp:simplePos x="0" y="0"/>
-                <wp:positionH relativeFrom="column">
-                  <wp:posOffset>-1414145</wp:posOffset>
-                </wp:positionH>
-                <wp:positionV relativeFrom="paragraph">
-                  <wp:posOffset>-1156970</wp:posOffset>
-                </wp:positionV>
-                <wp:extent cx="1517650" cy="971550"/>
-                <wp:effectExtent l="0" t="0" r="25400" b="19050"/>
-                <wp:wrapNone/>
-                <wp:docPr id="217" name="Text Box 2"/>
-                <wp:cNvGraphicFramePr>
-                  <a:graphicFrameLocks xmlns:a="http://schemas.openxmlformats.org/drawingml/2006/main"/>
-                </wp:cNvGraphicFramePr>
-                <a:graphic xmlns:a="http://schemas.openxmlformats.org/drawingml/2006/main">
-                  <a:graphicData uri="http://schemas.microsoft.com/office/word/2010/wordprocessingShape">
-                    <wps:wsp>
-                      <wps:cNvSpPr txBox="1">
-                        <a:spLocks noChangeArrowheads="1"/>
-                      </wps:cNvSpPr>
-                      <wps:spPr bwMode="auto">
-                        <a:xfrm>
-                          <a:off x="0" y="0"/>
-                          <a:ext cx="1517650" cy="971550"/>
-                        </a:xfrm>
-                        <a:prstGeom prst="rect">
-                          <a:avLst/>
-                        </a:prstGeom>
-                        <a:ln>
-                          <a:headEnd/>
-                          <a:tailEnd/>
-                        </a:ln>
-                      </wps:spPr>
-                      <wps:style>
-                        <a:lnRef idx="2">
-                          <a:schemeClr val="accent5"/>
-                        </a:lnRef>
-                        <a:fillRef idx="1">
-                          <a:schemeClr val="lt1"/>
-                        </a:fillRef>
-                        <a:effectRef idx="0">
-                          <a:schemeClr val="accent5"/>
-                        </a:effectRef>
-                        <a:fontRef idx="minor">
-                          <a:schemeClr val="dk1"/>
-                        </a:fontRef>
-                      </wps:style>
-                      <wps:txbx>
-                        <w:txbxContent>
-                          <w:p>
-                            <w:r>
-                              <w:t>To do:</w:t>
-                            </w:r>
-                          </w:p>
-                          <w:p>
-                            <w:r>
-                              <w:t>1. reduce to 15 pages</w:t>
-                            </w:r>
-                          </w:p>
-                          <w:p>
-                            <w:r>
-                              <w:t>2. Section 4.2</w:t>
-                            </w:r>
-                          </w:p>
-                        </w:txbxContent>
-                      </wps:txbx>
-                      <wps:bodyPr rot="0" vert="horz" wrap="square" lIns="91440" tIns="45720" rIns="91440" bIns="45720" anchor="t" anchorCtr="0">
-                        <a:noAutofit/>
-                      </wps:bodyPr>
-                    </wps:wsp>
-                  </a:graphicData>
-                </a:graphic>
-                <wp14:sizeRelH relativeFrom="margin">
-                  <wp14:pctWidth>0</wp14:pctWidth>
-                </wp14:sizeRelH>
-                <wp14:sizeRelV relativeFrom="margin">
-                  <wp14:pctHeight>0</wp14:pctHeight>
-                </wp14:sizeRelV>
-              </wp:anchor>
-            </w:drawing>
-          </mc:Choice>
-          <mc:Fallback>
-            <w:pict>
-              <v:shapetype w14:anchorId="47919A1C" id="_x0000_t202" coordsize="21600,21600" o:spt="202" path="m,l,21600r21600,l21600,xe">
-                <v:stroke joinstyle="miter"/>
-                <v:path gradientshapeok="t" o:connecttype="rect"/>
-              </v:shapetype>
-              <v:shape id="Text Box 2" o:spid="_x0000_s1026" type="#_x0000_t202" style="position:absolute;margin-left:-111.35pt;margin-top:-91.1pt;width:119.5pt;height:76.5pt;z-index:251659264;visibility:visible;mso-wrap-style:square;mso-width-percent:0;mso-height-percent:0;mso-wrap-distance-left:9pt;mso-wrap-distance-top:3.6pt;mso-wrap-distance-right:9pt;mso-wrap-distance-bottom:3.6pt;mso-position-horizontal:absolute;mso-position-horizontal-relative:text;mso-position-vertical:absolute;mso-position-vertical-relative:text;mso-width-percent:0;mso-height-percent:0;mso-width-relative:margin;mso-height-relative:margin;v-text-anchor:top" o:gfxdata="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" fillcolor="white [3201]" strokecolor="#4bacc6 [3208]" strokeweight="2pt">
-                <v:textbox>
-                  <w:txbxContent>
-                    <w:p>
-                      <w:r>
-                        <w:t>To do:</w:t>
-                      </w:r>
-                    </w:p>
-                    <w:p>
-                      <w:r>
-                        <w:t>1. reduce to 15 pages</w:t>
-                      </w:r>
-                    </w:p>
-                    <w:p>
-                      <w:r>
-                        <w:t>2. Section 4.2</w:t>
-                      </w:r>
-                    </w:p>
-                  </w:txbxContent>
-                </v:textbox>
-              </v:shape>
-            </w:pict>
-          </mc:Fallback>
-        </mc:AlternateContent>
-      </w:r>
       <w:r>
         <w:rPr>
           <w:rFonts w:ascii="Times New Roman" w:hAnsi="Times New Roman" w:cs="Times New Roman"/>
@@ -2414,13 +2290,7 @@
         <w:rPr>
           <w:rFonts w:cs="Times New Roman"/>
         </w:rPr>
-        <w:t>glass</w:t>
-      </w:r>
-      <w:r>
-        <w:rPr>
-          <w:rFonts w:cs="Times New Roman"/>
-        </w:rPr>
-        <w:t>es called</w:t>
+        <w:t>glasses called</w:t>
       </w:r>
       <w:r>
         <w:rPr>
@@ -5187,6 +5057,11 @@
           <w:rFonts w:cs="Times New Roman"/>
         </w:rPr>
         <w:fldChar w:fldCharType="end"/>
+      </w:r>
+      <w:r>
+        <w:rPr>
+          <w:rFonts w:cs="Times New Roman"/>
+        </w:rPr>
       </w:r>
       <w:r>
         <w:rPr>
@@ -10053,7 +9928,13 @@
         <w:rPr>
           <w:rFonts w:cs="Times New Roman"/>
         </w:rPr>
-        <w:t xml:space="preserve"> refractive index is higher than substrate (silica; SiO</w:t>
+        <w:t xml:space="preserve"> refractive index is higher than </w:t>
+      </w:r>
+      <w:r>
+        <w:rPr>
+          <w:rFonts w:cs="Times New Roman"/>
+        </w:rPr>
+        <w:t>substrate (silica; SiO</w:t>
       </w:r>
       <w:r>
         <w:rPr>
@@ -10281,13 +10162,7 @@
         <w:rPr>
           <w:rFonts w:cs="Times New Roman"/>
         </w:rPr>
-        <w:t>/</w:t>
-      </w:r>
-      <w:r>
-        <w:rPr>
-          <w:rFonts w:cs="Times New Roman"/>
-        </w:rPr>
-        <w:t>2)</w:t>
+        <w:t>/2)</w:t>
       </w:r>
       <w:r>
         <w:rPr>
@@ -10307,31 +10182,23 @@
         <w:rPr>
           <w:rFonts w:cs="Times New Roman"/>
         </w:rPr>
+        <w:t xml:space="preserve"> or an absentee layer</w:t>
+      </w:r>
+      <w:r>
+        <w:rPr>
+          <w:rFonts w:cs="Times New Roman"/>
+        </w:rPr>
+        <w:t>.</w:t>
+      </w:r>
+      <w:r>
+        <w:rPr>
+          <w:rFonts w:cs="Times New Roman"/>
+        </w:rPr>
         <w:t xml:space="preserve"> </w:t>
       </w:r>
       <w:r>
         <w:rPr>
           <w:rFonts w:cs="Times New Roman"/>
-          <w:highlight w:val="yellow"/>
-        </w:rPr>
-        <w:t>or an absentee layer</w:t>
-      </w:r>
-      <w:r>
-        <w:rPr>
-          <w:rFonts w:cs="Times New Roman"/>
-          <w:highlight w:val="yellow"/>
-        </w:rPr>
-        <w:t>.</w:t>
-      </w:r>
-      <w:r>
-        <w:rPr>
-          <w:rFonts w:cs="Times New Roman"/>
-        </w:rPr>
-        <w:t xml:space="preserve"> </w:t>
-      </w:r>
-      <w:r>
-        <w:rPr>
-          <w:rFonts w:cs="Times New Roman"/>
         </w:rPr>
         <w:t xml:space="preserve">As an example, at the reference wavelength </w:t>
       </w:r>
@@ -10398,13 +10265,7 @@
         <w:rPr>
           <w:rFonts w:cs="Times New Roman"/>
         </w:rPr>
-        <w:t xml:space="preserve"> = 1.46</w:t>
-      </w:r>
-      <w:r>
-        <w:rPr>
-          <w:rFonts w:cs="Times New Roman"/>
-        </w:rPr>
-        <w:t>)</w:t>
+        <w:t xml:space="preserve"> = 1.46)</w:t>
       </w:r>
       <w:r>
         <w:rPr>
@@ -17916,7 +17777,13 @@
         <w:rPr>
           <w:rFonts w:cs="Times New Roman"/>
         </w:rPr>
-        <w:t>In this work, we use transfer matrix method (TMM) of Fresnel equation to calculate the transmittance, absorptance and reflectance of every designs, the simulation</w:t>
+        <w:t xml:space="preserve">In this work, we use transfer matrix method (TMM) of </w:t>
+      </w:r>
+      <w:r>
+        <w:rPr>
+          <w:rFonts w:cs="Times New Roman"/>
+        </w:rPr>
+        <w:t>Fresnel equation to calculate the transmittance, absorptance and reflectance of every designs, the simulation</w:t>
       </w:r>
       <w:r>
         <w:rPr>
@@ -17965,40 +17832,284 @@
         <w:rPr>
           <w:rFonts w:cs="Times New Roman"/>
         </w:rPr>
+        <w:t>, although a simulation software such as COMSOL</w:t>
+      </w:r>
+      <w:r>
+        <w:rPr>
+          <w:rFonts w:cs="Times New Roman"/>
+        </w:rPr>
+        <w:t xml:space="preserve">, or OpenFilters </w:t>
+      </w:r>
+      <w:r>
+        <w:rPr>
+          <w:rFonts w:cs="Times New Roman"/>
+        </w:rPr>
+        <w:fldChar w:fldCharType="begin"/>
+      </w:r>
+      <w:r>
+        <w:rPr>
+          <w:rFonts w:cs="Times New Roman"/>
+        </w:rPr>
+        <w:instrText xml:space="preserve"> ADDIN EN.CITE &lt;EndNote&gt;&lt;Cite&gt;&lt;Author&gt;Larouche&lt;/Author&gt;&lt;Year&gt;2008&lt;/Year&gt;&lt;RecNum&gt;101&lt;/RecNum&gt;&lt;DisplayText&gt;[32]&lt;/DisplayText&gt;&lt;record&gt;&lt;rec-number&gt;101&lt;/rec-number&gt;&lt;foreign-keys&gt;&lt;key app="EN" db-id="v920pft06rp9dbex2ap500x99x5rrtswxzss" timestamp="1776935415"&gt;101&lt;/key&gt;&lt;/foreign-keys&gt;&lt;ref-type name="Journal Article"&gt;17&lt;/ref-type&gt;&lt;contributors&gt;&lt;authors&gt;&lt;author&gt;Larouche, Stéphane&lt;/author&gt;&lt;author&gt;Martinu, Ludvik&lt;/author&gt;&lt;/authors&gt;&lt;/contributors&gt;&lt;titles&gt;&lt;title&gt;OpenFilters: open-source software for the design, optimization, and synthesis of optical filters&lt;/title&gt;&lt;secondary-title&gt;Applied Optics&lt;/secondary-title&gt;&lt;alt-title&gt;Appl. Opt.&lt;/alt-title&gt;&lt;/titles&gt;&lt;periodical&gt;&lt;full-title&gt;Applied Optics&lt;/full-title&gt;&lt;abbr-1&gt;Appl. Opt.&lt;/abbr-1&gt;&lt;/periodical&gt;&lt;alt-periodical&gt;&lt;full-title&gt;Applied Optics&lt;/full-title&gt;&lt;abbr-1&gt;Appl. Opt.&lt;/abbr-1&gt;&lt;/alt-periodical&gt;&lt;pages&gt;C219-C230&lt;/pages&gt;&lt;volume&gt;47&lt;/volume&gt;&lt;number&gt;13&lt;/number&gt;&lt;keywords&gt;&lt;keyword&gt;Thin films&lt;/keyword&gt;&lt;keyword&gt;Interference coatings&lt;/keyword&gt;&lt;keyword&gt;Multilayer design&lt;/keyword&gt;&lt;keyword&gt;Refinement and synthesis methods&lt;/keyword&gt;&lt;keyword&gt;Theory and design&lt;/keyword&gt;&lt;keyword&gt;Effective medium theory&lt;/keyword&gt;&lt;keyword&gt;Fourier transforms&lt;/keyword&gt;&lt;keyword&gt;Interference filters&lt;/keyword&gt;&lt;keyword&gt;Optical filters&lt;/keyword&gt;&lt;keyword&gt;Refractive index&lt;/keyword&gt;&lt;keyword&gt;Synthesis methods&lt;/keyword&gt;&lt;/keywords&gt;&lt;dates&gt;&lt;year&gt;2008&lt;/year&gt;&lt;pub-dates&gt;&lt;date&gt;2008/05/01&lt;/date&gt;&lt;/pub-dates&gt;&lt;/dates&gt;&lt;publisher&gt;Optica Publishing Group&lt;/publisher&gt;&lt;urls&gt;&lt;related-urls&gt;&lt;url&gt;https://opg.optica.org/ao/abstract.cfm?URI=ao-47-13-C219&lt;/url&gt;&lt;/related-urls&gt;&lt;/urls&gt;&lt;electronic-resource-num&gt;10.1364/AO.47.00C219&lt;/electronic-resource-num&gt;&lt;/record&gt;&lt;/Cite&gt;&lt;/EndNote&gt;</w:instrText>
+      </w:r>
+      <w:r>
+        <w:rPr>
+          <w:rFonts w:cs="Times New Roman"/>
+        </w:rPr>
+        <w:fldChar w:fldCharType="separate"/>
+      </w:r>
+      <w:r>
+        <w:rPr>
+          <w:rFonts w:cs="Times New Roman"/>
+          <w:noProof/>
+        </w:rPr>
+        <w:t>[32]</w:t>
+      </w:r>
+      <w:r>
+        <w:rPr>
+          <w:rFonts w:cs="Times New Roman"/>
+        </w:rPr>
+        <w:fldChar w:fldCharType="end"/>
+      </w:r>
+      <w:r>
+        <w:rPr>
+          <w:rFonts w:cs="Times New Roman"/>
+        </w:rPr>
+        <w:t xml:space="preserve"> </w:t>
+      </w:r>
+      <w:r>
+        <w:rPr>
+          <w:rFonts w:cs="Times New Roman"/>
+        </w:rPr>
+        <w:t>can also be used</w:t>
+      </w:r>
+      <w:r>
+        <w:rPr>
+          <w:rFonts w:cs="Times New Roman"/>
+        </w:rPr>
+        <w:t xml:space="preserve">. </w:t>
+      </w:r>
+      <w:r>
+        <w:rPr>
+          <w:rFonts w:cs="Times New Roman"/>
+        </w:rPr>
+        <w:t>W</w:t>
+      </w:r>
+      <w:r>
+        <w:rPr>
+          <w:rFonts w:cs="Times New Roman"/>
+        </w:rPr>
+        <w:t>e use 3-mm thick silica (SiO</w:t>
+      </w:r>
+      <w:r>
+        <w:rPr>
+          <w:rFonts w:cs="Times New Roman"/>
+          <w:vertAlign w:val="subscript"/>
+        </w:rPr>
+        <w:t>2</w:t>
+      </w:r>
+      <w:r>
+        <w:rPr>
+          <w:rFonts w:cs="Times New Roman"/>
+        </w:rPr>
+        <w:t>) as substrate (</w:t>
+      </w:r>
+      <w:r>
+        <w:rPr>
+          <w:rFonts w:cs="Times New Roman"/>
+          <w:i/>
+          <w:iCs/>
+        </w:rPr>
+        <w:t>n</w:t>
+      </w:r>
+      <w:r>
+        <w:rPr>
+          <w:rFonts w:cs="Times New Roman"/>
+          <w:i/>
+          <w:iCs/>
+          <w:vertAlign w:val="subscript"/>
+        </w:rPr>
+        <w:t>s</w:t>
+      </w:r>
+      <w:r>
+        <w:rPr>
+          <w:rFonts w:cs="Times New Roman"/>
+        </w:rPr>
+        <w:t xml:space="preserve"> = 1.47) </w:t>
+      </w:r>
+      <w:r>
+        <w:rPr>
+          <w:rFonts w:cs="Times New Roman"/>
+        </w:rPr>
+        <w:fldChar w:fldCharType="begin"/>
+      </w:r>
+      <w:r>
+        <w:rPr>
+          <w:rFonts w:cs="Times New Roman"/>
+        </w:rPr>
+        <w:instrText xml:space="preserve"> ADDIN EN.CITE &lt;EndNote&gt;&lt;Cite&gt;&lt;Author&gt;Franta&lt;/Author&gt;&lt;Year&gt;2016&lt;/Year&gt;&lt;RecNum&gt;97&lt;/RecNum&gt;&lt;DisplayText&gt;[26]&lt;/DisplayText&gt;&lt;record&gt;&lt;rec-number&gt;97&lt;/rec-number&gt;&lt;foreign-keys&gt;&lt;key app="EN" db-id="v920pft06rp9dbex2ap500x99x5rrtswxzss" timestamp="1776660410"&gt;97&lt;/key&gt;&lt;/foreign-keys&gt;&lt;ref-type name="Book"&gt;6&lt;/ref-type&gt;&lt;contributors&gt;&lt;authors&gt;&lt;author&gt;Franta, Daniel&lt;/author&gt;&lt;author&gt;Nečas, David&lt;/author&gt;&lt;author&gt;Ohlídal, Ivan&lt;/author&gt;&lt;author&gt;Giglia, Angelo&lt;/author&gt;&lt;/authors&gt;&lt;/contributors&gt;&lt;titles&gt;&lt;title&gt;Optical characterization of SiO2 thin films using universal dispersion model over wide spectral range&lt;/title&gt;&lt;secondary-title&gt;SPIE Photonics Europe&lt;/secondary-title&gt;&lt;/titles&gt;&lt;volume&gt;9890&lt;/volume&gt;&lt;section&gt;EPE&lt;/section&gt;&lt;dates&gt;&lt;year&gt;2016&lt;/year&gt;&lt;/dates&gt;&lt;publisher&gt;SPIE&lt;/publisher&gt;&lt;urls&gt;&lt;related-urls&gt;&lt;url&gt;https://doi.org/10.1117/12.2227580&lt;/url&gt;&lt;/related-urls&gt;&lt;/urls&gt;&lt;/record&gt;&lt;/Cite&gt;&lt;/EndNote&gt;</w:instrText>
+      </w:r>
+      <w:r>
+        <w:rPr>
+          <w:rFonts w:cs="Times New Roman"/>
+        </w:rPr>
+        <w:fldChar w:fldCharType="separate"/>
+      </w:r>
+      <w:r>
+        <w:rPr>
+          <w:rFonts w:cs="Times New Roman"/>
+          <w:noProof/>
+        </w:rPr>
+        <w:t>[26]</w:t>
+      </w:r>
+      <w:r>
+        <w:rPr>
+          <w:rFonts w:cs="Times New Roman"/>
+        </w:rPr>
+        <w:fldChar w:fldCharType="end"/>
+      </w:r>
+      <w:r>
+        <w:rPr>
+          <w:rFonts w:cs="Times New Roman"/>
+        </w:rPr>
+        <w:t xml:space="preserve">, and </w:t>
+      </w:r>
+      <w:r>
+        <w:rPr>
+          <w:rFonts w:cs="Times New Roman"/>
+        </w:rPr>
+        <w:t xml:space="preserve">also </w:t>
+      </w:r>
+      <w:r>
+        <w:rPr>
+          <w:rFonts w:cs="Times New Roman"/>
+        </w:rPr>
+        <w:t xml:space="preserve">calculate the backside reflection from substrate-air layer on the other side. The high-index layers (H) are Si </w:t>
+      </w:r>
+      <w:r>
+        <w:rPr>
+          <w:rFonts w:cs="Times New Roman"/>
+        </w:rPr>
+        <w:fldChar w:fldCharType="begin"/>
+      </w:r>
+      <w:r>
+        <w:rPr>
+          <w:rFonts w:cs="Times New Roman"/>
+        </w:rPr>
+        <w:instrText xml:space="preserve"> ADDIN EN.CITE &lt;EndNote&gt;&lt;Cite&gt;&lt;Author&gt;Karaman&lt;/Author&gt;&lt;Year&gt;2025&lt;/Year&gt;&lt;RecNum&gt;94&lt;/RecNum&gt;&lt;DisplayText&gt;[33]&lt;/DisplayText&gt;&lt;record&gt;&lt;rec-number&gt;94&lt;/rec-number&gt;&lt;foreign-keys&gt;&lt;key app="EN" db-id="v920pft06rp9dbex2ap500x99x5rrtswxzss" timestamp="1776336380"&gt;94&lt;/key&gt;&lt;/foreign-keys&gt;&lt;ref-type name="Journal Article"&gt;17&lt;/ref-type&gt;&lt;contributors&gt;&lt;authors&gt;&lt;author&gt;Karaman, Omer Can&lt;/author&gt;&lt;author&gt;Naidu, Gopal Narmada&lt;/author&gt;&lt;author&gt;Bowman, Alan R.&lt;/author&gt;&lt;author&gt;Dayi, Elif Nur&lt;/author&gt;&lt;author&gt;Tagliabue, Giulia&lt;/author&gt;&lt;/authors&gt;&lt;/contributors&gt;&lt;titles&gt;&lt;title&gt;Decoupling Optical and Thermal Dynamics in Dielectric Metasurfaces for Self-Encoded Photonic Control&lt;/title&gt;&lt;secondary-title&gt;Laser &amp;amp; Photonics Reviews&lt;/secondary-title&gt;&lt;/titles&gt;&lt;periodical&gt;&lt;full-title&gt;Laser &amp;amp; Photonics Reviews&lt;/full-title&gt;&lt;/periodical&gt;&lt;pages&gt;e01014&lt;/pages&gt;&lt;volume&gt;19&lt;/volume&gt;&lt;number&gt;24&lt;/number&gt;&lt;dates&gt;&lt;year&gt;2025&lt;/year&gt;&lt;/dates&gt;&lt;isbn&gt;1863-8880&lt;/isbn&gt;&lt;urls&gt;&lt;related-urls&gt;&lt;url&gt;https://onlinelibrary.wiley.com/doi/abs/10.1002/lpor.202501014&lt;/url&gt;&lt;/related-urls&gt;&lt;/urls&gt;&lt;electronic-resource-num&gt;https://doi.org/10.1002/lpor.202501014&lt;/electronic-resource-num&gt;&lt;/record&gt;&lt;/Cite&gt;&lt;/EndNote&gt;</w:instrText>
+      </w:r>
+      <w:r>
+        <w:rPr>
+          <w:rFonts w:cs="Times New Roman"/>
+        </w:rPr>
+        <w:fldChar w:fldCharType="separate"/>
+      </w:r>
+      <w:r>
+        <w:rPr>
+          <w:rFonts w:cs="Times New Roman"/>
+          <w:noProof/>
+        </w:rPr>
+        <w:t>[33]</w:t>
+      </w:r>
+      <w:r>
+        <w:rPr>
+          <w:rFonts w:cs="Times New Roman"/>
+        </w:rPr>
+        <w:fldChar w:fldCharType="end"/>
+      </w:r>
+      <w:r>
+        <w:rPr>
+          <w:rFonts w:cs="Times New Roman"/>
+        </w:rPr>
+        <w:t>, TiO</w:t>
+      </w:r>
+      <w:r>
+        <w:rPr>
+          <w:rFonts w:cs="Times New Roman"/>
+          <w:vertAlign w:val="subscript"/>
+        </w:rPr>
+        <w:t>2</w:t>
+      </w:r>
+      <w:r>
+        <w:rPr>
+          <w:rFonts w:cs="Times New Roman"/>
+        </w:rPr>
+        <w:t xml:space="preserve"> </w:t>
+      </w:r>
+      <w:r>
+        <w:rPr>
+          <w:rFonts w:cs="Times New Roman"/>
+        </w:rPr>
+        <w:fldChar w:fldCharType="begin"/>
+      </w:r>
+      <w:r>
+        <w:rPr>
+          <w:rFonts w:cs="Times New Roman"/>
+        </w:rPr>
+        <w:instrText xml:space="preserve"> ADDIN EN.CITE &lt;EndNote&gt;&lt;Cite&gt;&lt;Author&gt;Zhukovsky&lt;/Author&gt;&lt;Year&gt;2015&lt;/Year&gt;&lt;RecNum&gt;90&lt;/RecNum&gt;&lt;DisplayText&gt;[28]&lt;/DisplayText&gt;&lt;record&gt;&lt;rec-number&gt;90&lt;/rec-number&gt;&lt;foreign-keys&gt;&lt;key app="EN" db-id="v920pft06rp9dbex2ap500x99x5rrtswxzss" timestamp="1775120793"&gt;90&lt;/key&gt;&lt;/foreign-keys&gt;&lt;ref-type name="Journal Article"&gt;17&lt;/ref-type&gt;&lt;contributors&gt;&lt;authors&gt;&lt;author&gt;Zhukovsky, Sergei V.&lt;/author&gt;&lt;author&gt;Andryieuski, Andrei&lt;/author&gt;&lt;author&gt;Takayama, Osamu&lt;/author&gt;&lt;author&gt;Shkondin, Evgeniy&lt;/author&gt;&lt;author&gt;Malureanu, Radu&lt;/author&gt;&lt;author&gt;Jensen, Flemming&lt;/author&gt;&lt;author&gt;Lavrinenko, Andrei V.&lt;/author&gt;&lt;/authors&gt;&lt;/contributors&gt;&lt;titles&gt;&lt;title&gt;Experimental Demonstration of Effective Medium Approximation Breakdown in Deeply Subwavelength All-Dielectric Multilayers&lt;/title&gt;&lt;secondary-title&gt;Physical Review Letters&lt;/secondary-title&gt;&lt;/titles&gt;&lt;periodical&gt;&lt;full-title&gt;Physical Review Letters&lt;/full-title&gt;&lt;/periodical&gt;&lt;pages&gt;177402&lt;/pages&gt;&lt;volume&gt;115&lt;/volume&gt;&lt;number&gt;17&lt;/number&gt;&lt;dates&gt;&lt;year&gt;2015&lt;/year&gt;&lt;pub-dates&gt;&lt;date&gt;10/23/&lt;/date&gt;&lt;/pub-dates&gt;&lt;/dates&gt;&lt;publisher&gt;American Physical Society&lt;/publisher&gt;&lt;urls&gt;&lt;related-urls&gt;&lt;url&gt;https://link.aps.org/doi/10.1103/PhysRevLett.115.177402&lt;/url&gt;&lt;/related-urls&gt;&lt;/urls&gt;&lt;electronic-resource-num&gt;10.1103/PhysRevLett.115.177402&lt;/electronic-resource-num&gt;&lt;/record&gt;&lt;/Cite&gt;&lt;/EndNote&gt;</w:instrText>
+      </w:r>
+      <w:r>
+        <w:rPr>
+          <w:rFonts w:cs="Times New Roman"/>
+        </w:rPr>
+        <w:fldChar w:fldCharType="separate"/>
+      </w:r>
+      <w:r>
+        <w:rPr>
+          <w:rFonts w:cs="Times New Roman"/>
+          <w:noProof/>
+        </w:rPr>
+        <w:t>[28]</w:t>
+      </w:r>
+      <w:r>
+        <w:rPr>
+          <w:rFonts w:cs="Times New Roman"/>
+        </w:rPr>
+        <w:fldChar w:fldCharType="end"/>
+      </w:r>
+      <w:r>
+        <w:rPr>
+          <w:rFonts w:cs="Times New Roman"/>
+        </w:rPr>
         <w:t xml:space="preserve">, </w:t>
       </w:r>
       <w:r>
         <w:rPr>
           <w:rFonts w:cs="Times New Roman"/>
         </w:rPr>
-        <w:t xml:space="preserve">although a simulation software </w:t>
-      </w:r>
-      <w:r>
-        <w:rPr>
-          <w:rFonts w:cs="Times New Roman"/>
-          <w:highlight w:val="yellow"/>
-        </w:rPr>
-        <w:t>s</w:t>
-      </w:r>
-      <w:r>
-        <w:rPr>
-          <w:rFonts w:cs="Times New Roman"/>
-          <w:highlight w:val="yellow"/>
-        </w:rPr>
-        <w:t>uch as COMSOL</w:t>
-      </w:r>
-      <w:r>
-        <w:rPr>
-          <w:rFonts w:cs="Times New Roman"/>
-          <w:highlight w:val="yellow"/>
-        </w:rPr>
-        <w:t>, or</w:t>
-      </w:r>
-      <w:r>
-        <w:rPr>
-          <w:rFonts w:cs="Times New Roman"/>
-        </w:rPr>
-        <w:t xml:space="preserve"> OpenFilters </w:t>
+        <w:t>and</w:t>
+      </w:r>
+      <w:r>
+        <w:rPr>
+          <w:rFonts w:cs="Times New Roman"/>
+        </w:rPr>
+        <w:t xml:space="preserve"> Si</w:t>
+      </w:r>
+      <w:r>
+        <w:rPr>
+          <w:rFonts w:cs="Times New Roman"/>
+          <w:vertAlign w:val="subscript"/>
+        </w:rPr>
+        <w:t>3</w:t>
+      </w:r>
+      <w:r>
+        <w:rPr>
+          <w:rFonts w:cs="Times New Roman"/>
+        </w:rPr>
+        <w:t>N</w:t>
+      </w:r>
+      <w:r>
+        <w:rPr>
+          <w:rFonts w:cs="Times New Roman"/>
+          <w:vertAlign w:val="subscript"/>
+        </w:rPr>
+        <w:t>4</w:t>
+      </w:r>
+      <w:r>
+        <w:rPr>
+          <w:rFonts w:cs="Times New Roman"/>
+        </w:rPr>
+        <w:t xml:space="preserve"> </w:t>
       </w:r>
       <w:r>
         <w:rPr>
@@ -18010,7 +18121,7 @@
         <w:rPr>
           <w:rFonts w:cs="Times New Roman"/>
         </w:rPr>
-        <w:instrText xml:space="preserve"> ADDIN EN.CITE &lt;EndNote&gt;&lt;Cite&gt;&lt;Author&gt;Larouche&lt;/Author&gt;&lt;Year&gt;2008&lt;/Year&gt;&lt;RecNum&gt;101&lt;/RecNum&gt;&lt;DisplayText&gt;[32]&lt;/DisplayText&gt;&lt;record&gt;&lt;rec-number&gt;101&lt;/rec-number&gt;&lt;foreign-keys&gt;&lt;key app="EN" db-id="v920pft06rp9dbex2ap500x99x5rrtswxzss" timestamp="1776935415"&gt;101&lt;/key&gt;&lt;/foreign-keys&gt;&lt;ref-type name="Journal Article"&gt;17&lt;/ref-type&gt;&lt;contributors&gt;&lt;authors&gt;&lt;author&gt;Larouche, Stéphane&lt;/author&gt;&lt;author&gt;Martinu, Ludvik&lt;/author&gt;&lt;/authors&gt;&lt;/contributors&gt;&lt;titles&gt;&lt;title&gt;OpenFilters: open-source software for the design, optimization, and synthesis of optical filters&lt;/title&gt;&lt;secondary-title&gt;Applied Optics&lt;/secondary-title&gt;&lt;alt-title&gt;Appl. Opt.&lt;/alt-title&gt;&lt;/titles&gt;&lt;periodical&gt;&lt;full-title&gt;Applied Optics&lt;/full-title&gt;&lt;abbr-1&gt;Appl. Opt.&lt;/abbr-1&gt;&lt;/periodical&gt;&lt;alt-periodical&gt;&lt;full-title&gt;Applied Optics&lt;/full-title&gt;&lt;abbr-1&gt;Appl. Opt.&lt;/abbr-1&gt;&lt;/alt-periodical&gt;&lt;pages&gt;C219-C230&lt;/pages&gt;&lt;volume&gt;47&lt;/volume&gt;&lt;number&gt;13&lt;/number&gt;&lt;keywords&gt;&lt;keyword&gt;Thin films&lt;/keyword&gt;&lt;keyword&gt;Interference coatings&lt;/keyword&gt;&lt;keyword&gt;Multilayer design&lt;/keyword&gt;&lt;keyword&gt;Refinement and synthesis methods&lt;/keyword&gt;&lt;keyword&gt;Theory and design&lt;/keyword&gt;&lt;keyword&gt;Effective medium theory&lt;/keyword&gt;&lt;keyword&gt;Fourier transforms&lt;/keyword&gt;&lt;keyword&gt;Interference filters&lt;/keyword&gt;&lt;keyword&gt;Optical filters&lt;/keyword&gt;&lt;keyword&gt;Refractive index&lt;/keyword&gt;&lt;keyword&gt;Synthesis methods&lt;/keyword&gt;&lt;/keywords&gt;&lt;dates&gt;&lt;year&gt;2008&lt;/year&gt;&lt;pub-dates&gt;&lt;date&gt;2008/05/01&lt;/date&gt;&lt;/pub-dates&gt;&lt;/dates&gt;&lt;publisher&gt;Optica Publishing Group&lt;/publisher&gt;&lt;urls&gt;&lt;related-urls&gt;&lt;url&gt;https://opg.optica.org/ao/abstract.cfm?URI=ao-47-13-C219&lt;/url&gt;&lt;/related-urls&gt;&lt;/urls&gt;&lt;electronic-resource-num&gt;10.1364/AO.47.00C219&lt;/electronic-resource-num&gt;&lt;/record&gt;&lt;/Cite&gt;&lt;/EndNote&gt;</w:instrText>
+        <w:instrText xml:space="preserve"> ADDIN EN.CITE &lt;EndNote&gt;&lt;Cite&gt;&lt;Author&gt;Beliaev&lt;/Author&gt;&lt;Year&gt;2022&lt;/Year&gt;&lt;RecNum&gt;70&lt;/RecNum&gt;&lt;DisplayText&gt;[31]&lt;/DisplayText&gt;&lt;record&gt;&lt;rec-number&gt;70&lt;/rec-number&gt;&lt;foreign-keys&gt;&lt;key app="EN" db-id="v920pft06rp9dbex2ap500x99x5rrtswxzss" timestamp="1768215795" guid="3f7419e0-798c-4593-84cf-4bf61aaacb06"&gt;70&lt;/key&gt;&lt;/foreign-keys&gt;&lt;ref-type name="Journal Article"&gt;17&lt;/ref-type&gt;&lt;contributors&gt;&lt;authors&gt;&lt;author&gt;Beliaev, Leonid Yu&lt;/author&gt;&lt;author&gt;Shkondin, Evgeniy&lt;/author&gt;&lt;author&gt;Lavrinenko, Andrei V.&lt;/author&gt;&lt;author&gt;Takayama, Osamu&lt;/author&gt;&lt;/authors&gt;&lt;/contributors&gt;&lt;titles&gt;&lt;title&gt;Optical, structural and composition properties of silicon nitride films deposited by reactive radio-frequency sputtering, low pressure and plasma-enhanced chemical vapor deposition&lt;/title&gt;&lt;secondary-title&gt;Thin Solid Films&lt;/secondary-title&gt;&lt;/titles&gt;&lt;periodical&gt;&lt;full-title&gt;Thin Solid Films&lt;/full-title&gt;&lt;/periodical&gt;&lt;pages&gt;139568&lt;/pages&gt;&lt;volume&gt;763&lt;/volume&gt;&lt;keywords&gt;&lt;keyword&gt;Silicon nitride&lt;/keyword&gt;&lt;keyword&gt;Ellipsometry&lt;/keyword&gt;&lt;keyword&gt;Chemical vapor deposition&lt;/keyword&gt;&lt;keyword&gt;Sputtering&lt;/keyword&gt;&lt;keyword&gt;Optical characterization&lt;/keyword&gt;&lt;keyword&gt;Thin film&lt;/keyword&gt;&lt;/keywords&gt;&lt;dates&gt;&lt;year&gt;2022&lt;/year&gt;&lt;pub-dates&gt;&lt;date&gt;2022/12/01/&lt;/date&gt;&lt;/pub-dates&gt;&lt;/dates&gt;&lt;isbn&gt;0040-6090&lt;/isbn&gt;&lt;urls&gt;&lt;related-urls&gt;&lt;url&gt;https://www.sciencedirect.com/science/article/pii/S0040609022004710&lt;/url&gt;&lt;/related-urls&gt;&lt;/urls&gt;&lt;electronic-resource-num&gt;https://doi.org/10.1016/j.tsf.2022.139568&lt;/electronic-resource-num&gt;&lt;/record&gt;&lt;/Cite&gt;&lt;/EndNote&gt;</w:instrText>
       </w:r>
       <w:r>
         <w:rPr>
@@ -18023,7 +18134,7 @@
           <w:rFonts w:cs="Times New Roman"/>
           <w:noProof/>
         </w:rPr>
-        <w:t>[32]</w:t>
+        <w:t>[31]</w:t>
       </w:r>
       <w:r>
         <w:rPr>
@@ -18035,290 +18146,19 @@
         <w:rPr>
           <w:rFonts w:cs="Times New Roman"/>
         </w:rPr>
-        <w:t xml:space="preserve"> </w:t>
-      </w:r>
-      <w:r>
-        <w:rPr>
-          <w:rFonts w:cs="Times New Roman"/>
-        </w:rPr>
-        <w:t>can also be used</w:t>
-      </w:r>
-      <w:r>
-        <w:rPr>
-          <w:rFonts w:cs="Times New Roman"/>
-        </w:rPr>
-        <w:t>.</w:t>
-      </w:r>
-      <w:r>
-        <w:rPr>
-          <w:rFonts w:cs="Times New Roman"/>
-        </w:rPr>
-        <w:t xml:space="preserve"> </w:t>
-      </w:r>
-      <w:r>
-        <w:rPr>
-          <w:rFonts w:cs="Times New Roman"/>
-        </w:rPr>
-        <w:t>W</w:t>
-      </w:r>
-      <w:r>
-        <w:rPr>
-          <w:rFonts w:cs="Times New Roman"/>
-        </w:rPr>
-        <w:t>e use 3-mm thick silica (SiO</w:t>
-      </w:r>
-      <w:r>
-        <w:rPr>
-          <w:rFonts w:cs="Times New Roman"/>
-          <w:vertAlign w:val="subscript"/>
-        </w:rPr>
-        <w:t>2</w:t>
-      </w:r>
-      <w:r>
-        <w:rPr>
-          <w:rFonts w:cs="Times New Roman"/>
-        </w:rPr>
-        <w:t>) as substrate (</w:t>
-      </w:r>
-      <w:r>
-        <w:rPr>
-          <w:rFonts w:cs="Times New Roman"/>
-          <w:i/>
-          <w:iCs/>
-        </w:rPr>
-        <w:t>n</w:t>
-      </w:r>
-      <w:r>
-        <w:rPr>
-          <w:rFonts w:cs="Times New Roman"/>
-          <w:i/>
-          <w:iCs/>
-          <w:vertAlign w:val="subscript"/>
-        </w:rPr>
-        <w:t>s</w:t>
-      </w:r>
-      <w:r>
-        <w:rPr>
-          <w:rFonts w:cs="Times New Roman"/>
-        </w:rPr>
-        <w:t xml:space="preserve"> = 1.47) </w:t>
-      </w:r>
-      <w:r>
-        <w:rPr>
-          <w:rFonts w:cs="Times New Roman"/>
-        </w:rPr>
-        <w:fldChar w:fldCharType="begin"/>
-      </w:r>
-      <w:r>
-        <w:rPr>
-          <w:rFonts w:cs="Times New Roman"/>
-        </w:rPr>
-        <w:instrText xml:space="preserve"> ADDIN EN.CITE &lt;EndNote&gt;&lt;Cite&gt;&lt;Author&gt;Franta&lt;/Author&gt;&lt;Year&gt;2016&lt;/Year&gt;&lt;RecNum&gt;97&lt;/RecNum&gt;&lt;DisplayText&gt;[26]&lt;/DisplayText&gt;&lt;record&gt;&lt;rec-number&gt;97&lt;/rec-number&gt;&lt;foreign-keys&gt;&lt;key app="EN" db-id="v920pft06rp9dbex2ap500x99x5rrtswxzss" timestamp="1776660410"&gt;97&lt;/key&gt;&lt;/foreign-keys&gt;&lt;ref-type name="Book"&gt;6&lt;/ref-type&gt;&lt;contributors&gt;&lt;authors&gt;&lt;author&gt;Franta, Daniel&lt;/author&gt;&lt;author&gt;Nečas, David&lt;/author&gt;&lt;author&gt;Ohlídal, Ivan&lt;/author&gt;&lt;author&gt;Giglia, Angelo&lt;/author&gt;&lt;/authors&gt;&lt;/contributors&gt;&lt;titles&gt;&lt;title&gt;Optical characterization of SiO2 thin films using universal dispersion model over wide spectral range&lt;/title&gt;&lt;secondary-title&gt;SPIE Photonics Europe&lt;/secondary-title&gt;&lt;/titles&gt;&lt;volume&gt;9890&lt;/volume&gt;&lt;section&gt;EPE&lt;/section&gt;&lt;dates&gt;&lt;year&gt;2016&lt;/year&gt;&lt;/dates&gt;&lt;publisher&gt;SPIE&lt;/publisher&gt;&lt;urls&gt;&lt;related-urls&gt;&lt;url&gt;https://doi.org/10.1117/12.2227580&lt;/url&gt;&lt;/related-urls&gt;&lt;/urls&gt;&lt;/record&gt;&lt;/Cite&gt;&lt;/EndNote&gt;</w:instrText>
-      </w:r>
-      <w:r>
-        <w:rPr>
-          <w:rFonts w:cs="Times New Roman"/>
-        </w:rPr>
-        <w:fldChar w:fldCharType="separate"/>
-      </w:r>
-      <w:r>
-        <w:rPr>
-          <w:rFonts w:cs="Times New Roman"/>
-          <w:noProof/>
-        </w:rPr>
-        <w:t>[26]</w:t>
-      </w:r>
-      <w:r>
-        <w:rPr>
-          <w:rFonts w:cs="Times New Roman"/>
-        </w:rPr>
-        <w:fldChar w:fldCharType="end"/>
-      </w:r>
-      <w:r>
-        <w:rPr>
-          <w:rFonts w:cs="Times New Roman"/>
-        </w:rPr>
-        <w:t xml:space="preserve">, and </w:t>
-      </w:r>
-      <w:r>
-        <w:rPr>
-          <w:rFonts w:cs="Times New Roman"/>
-        </w:rPr>
-        <w:t xml:space="preserve">also </w:t>
-      </w:r>
-      <w:r>
-        <w:rPr>
-          <w:rFonts w:cs="Times New Roman"/>
-        </w:rPr>
-        <w:t xml:space="preserve">calculate the backside reflection from substrate-air layer on the other side. The high-index layers (H) are Si </w:t>
-      </w:r>
-      <w:r>
-        <w:rPr>
-          <w:rFonts w:cs="Times New Roman"/>
-        </w:rPr>
-        <w:fldChar w:fldCharType="begin"/>
-      </w:r>
-      <w:r>
-        <w:rPr>
-          <w:rFonts w:cs="Times New Roman"/>
-        </w:rPr>
-        <w:instrText xml:space="preserve"> ADDIN EN.CITE &lt;EndNote&gt;&lt;Cite&gt;&lt;Author&gt;Karaman&lt;/Author&gt;&lt;Year&gt;2025&lt;/Year&gt;&lt;RecNum&gt;94&lt;/RecNum&gt;&lt;DisplayText&gt;[33]&lt;/DisplayText&gt;&lt;record&gt;&lt;rec-number&gt;94&lt;/rec-number&gt;&lt;foreign-keys&gt;&lt;key app="EN" db-id="v920pft06rp9dbex2ap500x99x5rrtswxzss" timestamp="1776336380"&gt;94&lt;/key&gt;&lt;/foreign-keys&gt;&lt;ref-type name="Journal Article"&gt;17&lt;/ref-type&gt;&lt;contributors&gt;&lt;authors&gt;&lt;author&gt;Karaman, Omer Can&lt;/author&gt;&lt;author&gt;Naidu, Gopal Narmada&lt;/author&gt;&lt;author&gt;Bowman, Alan R.&lt;/author&gt;&lt;author&gt;Dayi, Elif Nur&lt;/author&gt;&lt;author&gt;Tagliabue, Giulia&lt;/author&gt;&lt;/authors&gt;&lt;/contributors&gt;&lt;titles&gt;&lt;title&gt;Decoupling Optical and Thermal Dynamics in Dielectric Metasurfaces for Self-Encoded Photonic Control&lt;/title&gt;&lt;secondary-title&gt;Laser &amp;amp; Photonics Reviews&lt;/secondary-title&gt;&lt;/titles&gt;&lt;periodical&gt;&lt;full-title&gt;Laser &amp;amp; Photonics Reviews&lt;/full-title&gt;&lt;/periodical&gt;&lt;pages&gt;e01014&lt;/pages&gt;&lt;volume&gt;19&lt;/volume&gt;&lt;number&gt;24&lt;/number&gt;&lt;dates&gt;&lt;year&gt;2025&lt;/year&gt;&lt;/dates&gt;&lt;isbn&gt;1863-8880&lt;/isbn&gt;&lt;urls&gt;&lt;related-urls&gt;&lt;url&gt;https://onlinelibrary.wiley.com/doi/abs/10.1002/lpor.202501014&lt;/url&gt;&lt;/related-urls&gt;&lt;/urls&gt;&lt;electronic-resource-num&gt;https://doi.org/10.1002/lpor.202501014&lt;/electronic-resource-num&gt;&lt;/record&gt;&lt;/Cite&gt;&lt;/EndNote&gt;</w:instrText>
-      </w:r>
-      <w:r>
-        <w:rPr>
-          <w:rFonts w:cs="Times New Roman"/>
-        </w:rPr>
-        <w:fldChar w:fldCharType="separate"/>
-      </w:r>
-      <w:r>
-        <w:rPr>
-          <w:rFonts w:cs="Times New Roman"/>
-          <w:noProof/>
-        </w:rPr>
-        <w:t>[33]</w:t>
-      </w:r>
-      <w:r>
-        <w:rPr>
-          <w:rFonts w:cs="Times New Roman"/>
-        </w:rPr>
-        <w:fldChar w:fldCharType="end"/>
-      </w:r>
-      <w:r>
-        <w:rPr>
-          <w:rFonts w:cs="Times New Roman"/>
-        </w:rPr>
-        <w:t>, TiO</w:t>
-      </w:r>
-      <w:r>
-        <w:rPr>
-          <w:rFonts w:cs="Times New Roman"/>
-          <w:vertAlign w:val="subscript"/>
-        </w:rPr>
-        <w:t>2</w:t>
-      </w:r>
-      <w:r>
-        <w:rPr>
-          <w:rFonts w:cs="Times New Roman"/>
-        </w:rPr>
-        <w:t xml:space="preserve"> </w:t>
-      </w:r>
-      <w:r>
-        <w:rPr>
-          <w:rFonts w:cs="Times New Roman"/>
-        </w:rPr>
-        <w:fldChar w:fldCharType="begin"/>
-      </w:r>
-      <w:r>
-        <w:rPr>
-          <w:rFonts w:cs="Times New Roman"/>
-        </w:rPr>
-        <w:instrText xml:space="preserve"> ADDIN EN.CITE &lt;EndNote&gt;&lt;Cite&gt;&lt;Author&gt;Zhukovsky&lt;/Author&gt;&lt;Year&gt;2015&lt;/Year&gt;&lt;RecNum&gt;90&lt;/RecNum&gt;&lt;DisplayText&gt;[28]&lt;/DisplayText&gt;&lt;record&gt;&lt;rec-number&gt;90&lt;/rec-number&gt;&lt;foreign-keys&gt;&lt;key app="EN" db-id="v920pft06rp9dbex2ap500x99x5rrtswxzss" timestamp="1775120793"&gt;90&lt;/key&gt;&lt;/foreign-keys&gt;&lt;ref-type name="Journal Article"&gt;17&lt;/ref-type&gt;&lt;contributors&gt;&lt;authors&gt;&lt;author&gt;Zhukovsky, Sergei V.&lt;/author&gt;&lt;author&gt;Andryieuski, Andrei&lt;/author&gt;&lt;author&gt;Takayama, Osamu&lt;/author&gt;&lt;author&gt;Shkondin, Evgeniy&lt;/author&gt;&lt;author&gt;Malureanu, Radu&lt;/author&gt;&lt;author&gt;Jensen, Flemming&lt;/author&gt;&lt;author&gt;Lavrinenko, Andrei V.&lt;/author&gt;&lt;/authors&gt;&lt;/contributors&gt;&lt;titles&gt;&lt;title&gt;Experimental Demonstration of Effective Medium Approximation Breakdown in Deeply Subwavelength All-Dielectric Multilayers&lt;/title&gt;&lt;secondary-title&gt;Physical Review Letters&lt;/secondary-title&gt;&lt;/titles&gt;&lt;periodical&gt;&lt;full-title&gt;Physical Review Letters&lt;/full-title&gt;&lt;/periodical&gt;&lt;pages&gt;177402&lt;/pages&gt;&lt;volume&gt;115&lt;/volume&gt;&lt;number&gt;17&lt;/number&gt;&lt;dates&gt;&lt;year&gt;2015&lt;/year&gt;&lt;pub-dates&gt;&lt;date&gt;10/23/&lt;/date&gt;&lt;/pub-dates&gt;&lt;/dates&gt;&lt;publisher&gt;American Physical Society&lt;/publisher&gt;&lt;urls&gt;&lt;related-urls&gt;&lt;url&gt;https://link.aps.org/doi/10.1103/PhysRevLett.115.177402&lt;/url&gt;&lt;/related-urls&gt;&lt;/urls&gt;&lt;electronic-resource-num&gt;10.1103/PhysRevLett.115.177402&lt;/electronic-resource-num&gt;&lt;/record&gt;&lt;/Cite&gt;&lt;/EndNote&gt;</w:instrText>
-      </w:r>
-      <w:r>
-        <w:rPr>
-          <w:rFonts w:cs="Times New Roman"/>
-        </w:rPr>
-        <w:fldChar w:fldCharType="separate"/>
-      </w:r>
-      <w:r>
-        <w:rPr>
-          <w:rFonts w:cs="Times New Roman"/>
-          <w:noProof/>
-        </w:rPr>
-        <w:t>[28]</w:t>
-      </w:r>
-      <w:r>
-        <w:rPr>
-          <w:rFonts w:cs="Times New Roman"/>
-        </w:rPr>
-        <w:fldChar w:fldCharType="end"/>
-      </w:r>
-      <w:r>
-        <w:rPr>
-          <w:rFonts w:cs="Times New Roman"/>
-        </w:rPr>
-        <w:t xml:space="preserve">, </w:t>
-      </w:r>
-      <w:r>
-        <w:rPr>
-          <w:rFonts w:cs="Times New Roman"/>
-        </w:rPr>
-        <w:t>and</w:t>
-      </w:r>
-      <w:r>
-        <w:rPr>
-          <w:rFonts w:cs="Times New Roman"/>
-        </w:rPr>
-        <w:t xml:space="preserve"> Si</w:t>
-      </w:r>
-      <w:r>
-        <w:rPr>
-          <w:rFonts w:cs="Times New Roman"/>
-          <w:vertAlign w:val="subscript"/>
-        </w:rPr>
-        <w:t>3</w:t>
-      </w:r>
-      <w:r>
-        <w:rPr>
-          <w:rFonts w:cs="Times New Roman"/>
-        </w:rPr>
-        <w:t>N</w:t>
-      </w:r>
-      <w:r>
-        <w:rPr>
-          <w:rFonts w:cs="Times New Roman"/>
-          <w:vertAlign w:val="subscript"/>
-        </w:rPr>
-        <w:t>4</w:t>
-      </w:r>
-      <w:r>
-        <w:rPr>
-          <w:rFonts w:cs="Times New Roman"/>
-        </w:rPr>
-        <w:t xml:space="preserve"> </w:t>
-      </w:r>
-      <w:r>
-        <w:rPr>
-          <w:rFonts w:cs="Times New Roman"/>
-        </w:rPr>
-        <w:fldChar w:fldCharType="begin"/>
-      </w:r>
-      <w:r>
-        <w:rPr>
-          <w:rFonts w:cs="Times New Roman"/>
-        </w:rPr>
-        <w:instrText xml:space="preserve"> ADDIN EN.CITE &lt;EndNote&gt;&lt;Cite&gt;&lt;Author&gt;Beliaev&lt;/Author&gt;&lt;Year&gt;2022&lt;/Year&gt;&lt;RecNum&gt;70&lt;/RecNum&gt;&lt;DisplayText&gt;[31]&lt;/DisplayText&gt;&lt;record&gt;&lt;rec-number&gt;70&lt;/rec-number&gt;&lt;foreign-keys&gt;&lt;key app="EN" db-id="v920pft06rp9dbex2ap500x99x5rrtswxzss" timestamp="1768215795" guid="3f7419e0-798c-4593-84cf-4bf61aaacb06"&gt;70&lt;/key&gt;&lt;/foreign-keys&gt;&lt;ref-type name="Journal Article"&gt;17&lt;/ref-type&gt;&lt;contributors&gt;&lt;authors&gt;&lt;author&gt;Beliaev, Leonid Yu&lt;/author&gt;&lt;author&gt;Shkondin, Evgeniy&lt;/author&gt;&lt;author&gt;Lavrinenko, Andrei V.&lt;/author&gt;&lt;author&gt;Takayama, Osamu&lt;/author&gt;&lt;/authors&gt;&lt;/contributors&gt;&lt;titles&gt;&lt;title&gt;Optical, structural and composition properties of silicon nitride films deposited by reactive radio-frequency sputtering, low pressure and plasma-enhanced chemical vapor deposition&lt;/title&gt;&lt;secondary-title&gt;Thin Solid Films&lt;/secondary-title&gt;&lt;/titles&gt;&lt;periodical&gt;&lt;full-title&gt;Thin Solid Films&lt;/full-title&gt;&lt;/periodical&gt;&lt;pages&gt;139568&lt;/pages&gt;&lt;volume&gt;763&lt;/volume&gt;&lt;keywords&gt;&lt;keyword&gt;Silicon nitride&lt;/keyword&gt;&lt;keyword&gt;Ellipsometry&lt;/keyword&gt;&lt;keyword&gt;Chemical vapor deposition&lt;/keyword&gt;&lt;keyword&gt;Sputtering&lt;/keyword&gt;&lt;keyword&gt;Optical characterization&lt;/keyword&gt;&lt;keyword&gt;Thin film&lt;/keyword&gt;&lt;/keywords&gt;&lt;dates&gt;&lt;year&gt;2022&lt;/year&gt;&lt;pub-dates&gt;&lt;date&gt;2022/12/01/&lt;/date&gt;&lt;/pub-dates&gt;&lt;/dates&gt;&lt;isbn&gt;0040-6090&lt;/isbn&gt;&lt;urls&gt;&lt;related-urls&gt;&lt;url&gt;https://www.sciencedirect.com/science/article/pii/S0040609022004710&lt;/url&gt;&lt;/related-urls&gt;&lt;/urls&gt;&lt;electronic-resource-num&gt;https://doi.org/10.1016/j.tsf.2022.139568&lt;/electronic-resource-num&gt;&lt;/record&gt;&lt;/Cite&gt;&lt;/EndNote&gt;</w:instrText>
-      </w:r>
-      <w:r>
-        <w:rPr>
-          <w:rFonts w:cs="Times New Roman"/>
-        </w:rPr>
-        <w:fldChar w:fldCharType="separate"/>
-      </w:r>
-      <w:r>
-        <w:rPr>
-          <w:rFonts w:cs="Times New Roman"/>
-          <w:noProof/>
-        </w:rPr>
-        <w:t>[31]</w:t>
-      </w:r>
-      <w:r>
-        <w:rPr>
-          <w:rFonts w:cs="Times New Roman"/>
-        </w:rPr>
-        <w:fldChar w:fldCharType="end"/>
-      </w:r>
-      <w:r>
-        <w:rPr>
-          <w:rFonts w:cs="Times New Roman"/>
-        </w:rPr>
         <w:t>, t</w:t>
       </w:r>
       <w:r>
         <w:rPr>
           <w:rFonts w:cs="Times New Roman"/>
         </w:rPr>
-        <w:t>heir refractive indices at 1064 nm are 3.56, 2.31, and 2.00, respectively. The low-index layers (L) are Al</w:t>
+        <w:t>heir refractive</w:t>
+      </w:r>
+      <w:r>
+        <w:rPr>
+          <w:rFonts w:cs="Times New Roman"/>
+        </w:rPr>
+        <w:t xml:space="preserve"> indices at 1064 nm are 3.56, 2.31, and 2.00, respectively. The low-index layers (L) are Al</w:t>
       </w:r>
       <w:r>
         <w:rPr>
@@ -24896,14 +24736,12 @@
               <w:rPr>
                 <w:rFonts w:cs="Times New Roman"/>
                 <w:szCs w:val="16"/>
-                <w:highlight w:val="yellow"/>
               </w:rPr>
             </w:pPr>
             <w:r>
               <w:rPr>
                 <w:rFonts w:cs="Times New Roman"/>
                 <w:szCs w:val="16"/>
-                <w:highlight w:val="yellow"/>
               </w:rPr>
               <w:t>0.9</w:t>
             </w:r>
@@ -25231,14 +25069,12 @@
               <w:rPr>
                 <w:rFonts w:cs="Times New Roman"/>
                 <w:szCs w:val="16"/>
-                <w:highlight w:val="yellow"/>
               </w:rPr>
             </w:pPr>
             <w:r>
               <w:rPr>
                 <w:rFonts w:cs="Times New Roman"/>
                 <w:szCs w:val="16"/>
-                <w:highlight w:val="yellow"/>
               </w:rPr>
               <w:t>0.2</w:t>
             </w:r>
@@ -27062,7 +26898,6 @@
           <w:rFonts w:ascii="Times New Roman" w:hAnsi="Times New Roman" w:cs="Times New Roman"/>
           <w:i/>
           <w:iCs w:val="0"/>
-          <w:highlight w:val="cyan"/>
         </w:rPr>
         <w:lastRenderedPageBreak/>
         <w:t>4.2 Endurance simulation of 1064-nm optical filters(</w:t>
@@ -27070,7 +26905,6 @@
       <w:r>
         <w:rPr>
           <w:rFonts w:ascii="Times New Roman" w:hAnsi="Times New Roman" w:cs="Times New Roman"/>
-          <w:highlight w:val="cyan"/>
         </w:rPr>
         <w:t xml:space="preserve"> </w:t>
       </w:r>
@@ -27080,7 +26914,6 @@
           <w:rFonts w:ascii="Times New Roman" w:hAnsi="Times New Roman" w:cs="Times New Roman"/>
           <w:i/>
           <w:iCs w:val="0"/>
-          <w:highlight w:val="cyan"/>
         </w:rPr>
         <w:t>check endurance of edge-filter.)</w:t>
       </w:r>
@@ -27102,16 +26935,7 @@
           <w:i w:val="0"/>
           <w:iCs w:val="0"/>
         </w:rPr>
-        <w:t>Endur</w:t>
-      </w:r>
-      <w:r>
-        <w:rPr>
-          <w:rStyle w:val="Emphasis"/>
-          <w:rFonts w:cs="Times New Roman"/>
-          <w:i w:val="0"/>
-          <w:iCs w:val="0"/>
-        </w:rPr>
-        <w:t xml:space="preserve">ance testing </w:t>
+        <w:t xml:space="preserve">Endurance testing </w:t>
       </w:r>
       <w:r>
         <w:rPr>
@@ -27185,25 +27009,7 @@
           <w:i w:val="0"/>
           <w:iCs w:val="0"/>
         </w:rPr>
-        <w:t>1.5</w:t>
-      </w:r>
-      <w:r>
-        <w:rPr>
-          <w:rStyle w:val="Emphasis"/>
-          <w:rFonts w:cs="Times New Roman"/>
-          <w:i w:val="0"/>
-          <w:iCs w:val="0"/>
-        </w:rPr>
-        <w:t>×10⁶</w:t>
-      </w:r>
-      <w:r>
-        <w:rPr>
-          <w:rStyle w:val="Emphasis"/>
-          <w:rFonts w:cs="Times New Roman"/>
-          <w:i w:val="0"/>
-          <w:iCs w:val="0"/>
-        </w:rPr>
-        <w:t xml:space="preserve"> phase switching cycles, with design-dependent degradation of their transmission metrics. For the single-layer device, the amorphous phase transmittance</w:t>
+        <w:t>1.5×10⁶ phase switching cycles, with design-dependent degradation of their transmission metrics. For the single-layer device, the amorphous phase transmittance</w:t>
       </w:r>
       <w:r>
         <w:rPr>
@@ -27554,16 +27360,7 @@
           <w:iCs w:val="0"/>
           <w:lang w:bidi="th-TH"/>
         </w:rPr>
-        <w:t xml:space="preserve">than the single-layer design, </w:t>
-      </w:r>
-      <w:r>
-        <w:rPr>
-          <w:rStyle w:val="Emphasis"/>
-          <w:i w:val="0"/>
-          <w:iCs w:val="0"/>
-          <w:lang w:bidi="th-TH"/>
-        </w:rPr>
-        <w:t>which reflects the higher sensitivity of resonant edge to small changes in Sb</w:t>
+        <w:t>than the single-layer design, which reflects the higher sensitivity of resonant edge to small changes in Sb</w:t>
       </w:r>
       <w:r>
         <w:rPr>
@@ -27601,7 +27398,7 @@
           <w:iCs w:val="0"/>
           <w:lang w:bidi="th-TH"/>
         </w:rPr>
-        <w:t xml:space="preserve"> refractive index.</w:t>
+        <w:t xml:space="preserve"> refractive index. The insertion loss of amorphous phase </w:t>
       </w:r>
       <w:r>
         <w:rPr>
@@ -27610,7 +27407,7 @@
           <w:iCs w:val="0"/>
           <w:lang w:bidi="th-TH"/>
         </w:rPr>
-        <w:t xml:space="preserve"> The insertion loss of amorphous phase </w:t>
+        <w:t xml:space="preserve">(Fig. 8h) </w:t>
       </w:r>
       <w:r>
         <w:rPr>
@@ -27619,7 +27416,7 @@
           <w:iCs w:val="0"/>
           <w:lang w:bidi="th-TH"/>
         </w:rPr>
-        <w:t xml:space="preserve">(Fig. 8h) </w:t>
+        <w:t xml:space="preserve">also increase more rapidly, </w:t>
       </w:r>
       <w:r>
         <w:rPr>
@@ -27628,7 +27425,7 @@
           <w:iCs w:val="0"/>
           <w:lang w:bidi="th-TH"/>
         </w:rPr>
-        <w:t xml:space="preserve">also increase more rapidly, </w:t>
+        <w:t>which consists of</w:t>
       </w:r>
       <w:r>
         <w:rPr>
@@ -27637,7 +27434,7 @@
           <w:iCs w:val="0"/>
           <w:lang w:bidi="th-TH"/>
         </w:rPr>
-        <w:t>which consists of</w:t>
+        <w:t xml:space="preserve"> a stronger field confinement and longer effective optical path within the lossy material</w:t>
       </w:r>
       <w:r>
         <w:rPr>
@@ -27646,17 +27443,7 @@
           <w:iCs w:val="0"/>
           <w:lang w:bidi="th-TH"/>
         </w:rPr>
-        <w:t xml:space="preserve"> a </w:t>
-      </w:r>
-      <w:r>
-        <w:rPr>
-          <w:rStyle w:val="Emphasis"/>
-          <w:i w:val="0"/>
-          <w:iCs w:val="0"/>
-          <w:highlight w:val="yellow"/>
-          <w:lang w:bidi="th-TH"/>
-        </w:rPr>
-        <w:t>stronger field confinement and longer effective optical path within the lossy material</w:t>
+        <w:t xml:space="preserve">. </w:t>
       </w:r>
       <w:r>
         <w:rPr>
@@ -27665,7 +27452,7 @@
           <w:iCs w:val="0"/>
           <w:lang w:bidi="th-TH"/>
         </w:rPr>
-        <w:t xml:space="preserve">. </w:t>
+        <w:t>The</w:t>
       </w:r>
       <w:r>
         <w:rPr>
@@ -27674,7 +27461,7 @@
           <w:iCs w:val="0"/>
           <w:lang w:bidi="th-TH"/>
         </w:rPr>
-        <w:t>The</w:t>
+        <w:t xml:space="preserve"> 5-unit</w:t>
       </w:r>
       <w:r>
         <w:rPr>
@@ -27683,7 +27470,7 @@
           <w:iCs w:val="0"/>
           <w:lang w:bidi="th-TH"/>
         </w:rPr>
-        <w:t xml:space="preserve"> 5-unit-cells </w:t>
+        <w:t xml:space="preserve">-cells </w:t>
       </w:r>
       <w:r>
         <w:rPr>
@@ -27955,16 +27742,7 @@
           <w:i w:val="0"/>
           <w:iCs w:val="0"/>
         </w:rPr>
-        <w:t xml:space="preserve"> cycle</w:t>
-      </w:r>
-      <w:r>
-        <w:rPr>
-          <w:rStyle w:val="Emphasis"/>
-          <w:rFonts w:cs="Times New Roman"/>
-          <w:i w:val="0"/>
-          <w:iCs w:val="0"/>
-        </w:rPr>
-        <w:t>s</w:t>
+        <w:t xml:space="preserve"> cycles</w:t>
       </w:r>
       <w:r>
         <w:rPr>
@@ -30986,19 +30764,11 @@
         <w:rPr>
           <w:rFonts w:cs="Times New Roman"/>
         </w:rPr>
-        <w:t xml:space="preserve">. </w:t>
-      </w:r>
-      <w:r>
-        <w:rPr>
-          <w:rFonts w:cs="Times New Roman"/>
-          <w:highlight w:val="yellow"/>
-        </w:rPr>
-        <w:t>The transmittance contrast degradation and insertion loss after simulating</w:t>
-      </w:r>
-      <w:r>
-        <w:rPr>
-          <w:rFonts w:cs="Times New Roman"/>
-          <w:highlight w:val="yellow"/>
+        <w:t>. The transmittance contrast degradation and insertion loss after simulating</w:t>
+      </w:r>
+      <w:r>
+        <w:rPr>
+          <w:rFonts w:cs="Times New Roman"/>
           <w:cs/>
           <w:lang w:bidi="th-TH"/>
         </w:rPr>
@@ -31007,49 +30777,44 @@
       <w:r>
         <w:rPr>
           <w:rFonts w:cs="Times New Roman"/>
-          <w:highlight w:val="yellow"/>
         </w:rPr>
         <w:t xml:space="preserve">1.5×10⁶ phase </w:t>
       </w:r>
       <w:r>
         <w:rPr>
           <w:rFonts w:cs="Times New Roman"/>
-          <w:highlight w:val="yellow"/>
         </w:rPr>
         <w:t>changing</w:t>
       </w:r>
       <w:r>
         <w:rPr>
           <w:rFonts w:cs="Times New Roman"/>
-          <w:highlight w:val="yellow"/>
         </w:rPr>
         <w:t xml:space="preserve"> cycles are within acceptable range</w:t>
       </w:r>
       <w:r>
         <w:rPr>
           <w:rFonts w:cs="Times New Roman"/>
-          <w:highlight w:val="yellow"/>
         </w:rPr>
         <w:t>s</w:t>
       </w:r>
       <w:r>
         <w:rPr>
           <w:rFonts w:cs="Times New Roman"/>
-          <w:highlight w:val="yellow"/>
-        </w:rPr>
-        <w:t>.</w:t>
+        </w:rPr>
+        <w:t xml:space="preserve">. </w:t>
+      </w:r>
+      <w:r>
+        <w:rPr>
+          <w:rFonts w:cs="Times New Roman"/>
+        </w:rPr>
+        <w:t>The</w:t>
       </w:r>
       <w:r>
         <w:rPr>
           <w:rFonts w:cs="Times New Roman"/>
         </w:rPr>
         <w:t xml:space="preserve"> </w:t>
-      </w:r>
-      <w:r>
-        <w:rPr>
-          <w:rFonts w:cs="Times New Roman"/>
-        </w:rPr>
-        <w:t xml:space="preserve">The </w:t>
       </w:r>
       <w:r>
         <w:rPr>
@@ -34316,6 +34081,7 @@
   <w:style w:type="character" w:default="1" w:styleId="DefaultParagraphFont">
     <w:name w:val="Default Paragraph Font"/>
     <w:uiPriority w:val="1"/>
+    <w:semiHidden/>
     <w:unhideWhenUsed/>
   </w:style>
   <w:style w:type="table" w:default="1" w:styleId="TableNormal">

</xml_diff>

<commit_message>
Correcting Fig. 3 & Fig. 4
</commit_message>
<xml_diff>
--- a/paper/[Opt. Express] Design and Simulation of a Broadband Tunable Transmittance Optical Filter Using Sb2Se3 Phase Change Material.docx
+++ b/paper/[Opt. Express] Design and Simulation of a Broadband Tunable Transmittance Optical Filter Using Sb2Se3 Phase Change Material.docx
@@ -428,17 +428,10 @@
       <w:pPr>
         <w:pStyle w:val="03AuthorAffiliation"/>
         <w:rPr>
-          <w:rFonts w:hint="cs"/>
-          <w:cs/>
           <w:lang w:bidi="th-TH"/>
-          <w:rPrChange w:id="6" w:author="Chettanat Padungatthakij" w:date="2026-07-07T10:52:00Z" w16du:dateUtc="2026-07-07T03:52:00Z">
-            <w:rPr>
-              <w:rFonts w:cs="Times New Roman"/>
-            </w:rPr>
-          </w:rPrChange>
         </w:rPr>
       </w:pPr>
-      <w:ins w:id="7" w:author="Chettanat Padungatthakij" w:date="2026-07-07T10:52:00Z" w16du:dateUtc="2026-07-07T03:52:00Z">
+      <w:ins w:id="6" w:author="Chettanat Padungatthakij" w:date="2026-07-07T10:52:00Z" w16du:dateUtc="2026-07-07T03:52:00Z">
         <w:r>
           <w:rPr>
             <w:rFonts w:hint="cs"/>
@@ -472,7 +465,7 @@
       <w:pPr>
         <w:pStyle w:val="03AuthorAffiliation"/>
       </w:pPr>
-      <w:bookmarkStart w:id="8" w:name="_Hlk173847279"/>
+      <w:bookmarkStart w:id="7" w:name="_Hlk173847279"/>
       <w:r>
         <w:rPr>
           <w:rFonts w:cs="Arial"/>
@@ -480,7 +473,7 @@
         </w:rPr>
         <w:t>†</w:t>
       </w:r>
-      <w:bookmarkEnd w:id="8"/>
+      <w:bookmarkEnd w:id="7"/>
       <w:r>
         <w:t>These authors contributed equally.</w:t>
       </w:r>
@@ -2650,7 +2643,14 @@
         <w:rPr>
           <w:rFonts w:cs="Times New Roman"/>
         </w:rPr>
-        <w:t xml:space="preserve">t also has a relatively large refractive index contrast </w:t>
+        <w:t xml:space="preserve">t also has a </w:t>
+      </w:r>
+      <w:r>
+        <w:rPr>
+          <w:rFonts w:cs="Times New Roman"/>
+        </w:rPr>
+        <w:lastRenderedPageBreak/>
+        <w:t xml:space="preserve">relatively large refractive index contrast </w:t>
       </w:r>
       <w:r>
         <w:rPr>
@@ -2689,14 +2689,7 @@
         <w:rPr>
           <w:rFonts w:cs="Times New Roman"/>
         </w:rPr>
-        <w:t xml:space="preserve"> in </w:t>
-      </w:r>
-      <w:r>
-        <w:rPr>
-          <w:rFonts w:cs="Times New Roman"/>
-        </w:rPr>
-        <w:lastRenderedPageBreak/>
-        <w:t>the insulating phase (cold state)</w:t>
+        <w:t xml:space="preserve"> in the insulating phase (cold state)</w:t>
       </w:r>
       <w:r>
         <w:rPr>
@@ -6342,6 +6335,7 @@
         <w:rPr>
           <w:rFonts w:cs="Times New Roman"/>
         </w:rPr>
+        <w:lastRenderedPageBreak/>
         <w:tab/>
       </w:r>
       <m:oMath>
@@ -6533,7 +6527,6 @@
         <w:rPr>
           <w:rFonts w:cs="Times New Roman"/>
         </w:rPr>
-        <w:lastRenderedPageBreak/>
         <w:t xml:space="preserve">where </w:t>
       </w:r>
       <w:r>
@@ -7397,7 +7390,6 @@
       <w:pPr>
         <w:pStyle w:val="12FigureCaptionLong"/>
         <w:rPr>
-          <w:rFonts w:hint="cs"/>
           <w:cs/>
           <w:lang w:bidi="th-TH"/>
         </w:rPr>
@@ -7660,7 +7652,15 @@
           <w:rFonts w:eastAsia="MS Mincho" w:cs="Times New Roman"/>
           <w:color w:val="000000"/>
         </w:rPr>
-        <w:t xml:space="preserve">the ON and OFF modes. </w:t>
+        <w:t xml:space="preserve">the </w:t>
+      </w:r>
+      <w:r>
+        <w:rPr>
+          <w:rFonts w:eastAsia="MS Mincho" w:cs="Times New Roman"/>
+          <w:color w:val="000000"/>
+        </w:rPr>
+        <w:lastRenderedPageBreak/>
+        <w:t xml:space="preserve">ON and OFF modes. </w:t>
       </w:r>
       <w:r>
         <w:rPr>
@@ -7690,14 +7690,7 @@
         <w:rPr>
           <w:rFonts w:cs="Times New Roman"/>
         </w:rPr>
-        <w:t xml:space="preserve">film layer </w:t>
-      </w:r>
-      <w:r>
-        <w:rPr>
-          <w:rFonts w:cs="Times New Roman"/>
-        </w:rPr>
-        <w:lastRenderedPageBreak/>
-        <w:t xml:space="preserve">deposited on </w:t>
+        <w:t xml:space="preserve">film layer deposited on </w:t>
       </w:r>
       <w:r>
         <w:rPr>
@@ -10527,7 +10520,7 @@
                 </m:sSub>
               </m:e>
             </m:d>
-            <w:bookmarkStart w:id="9" w:name="_Hlk234148607"/>
+            <w:bookmarkStart w:id="8" w:name="_Hlk234148607"/>
             <m:r>
               <m:rPr>
                 <m:sty m:val="p"/>
@@ -10538,7 +10531,7 @@
               </w:rPr>
               <m:t>-</m:t>
             </m:r>
-            <w:bookmarkEnd w:id="9"/>
+            <w:bookmarkEnd w:id="8"/>
             <m:d>
               <m:dPr>
                 <m:ctrlPr>
@@ -11286,7 +11279,15 @@
           <w:rFonts w:eastAsia="MS Mincho" w:cs="Times New Roman"/>
           <w:color w:val="000000"/>
         </w:rPr>
-        <w:t>s its phase by π radian when reflected from a lower to a higher refractive index medium. The reflected light at the air-film interface</w:t>
+        <w:t xml:space="preserve">s its phase by π radian when reflected from a lower to a higher refractive index medium. The reflected light at the air-film </w:t>
+      </w:r>
+      <w:r>
+        <w:rPr>
+          <w:rFonts w:eastAsia="MS Mincho" w:cs="Times New Roman"/>
+          <w:color w:val="000000"/>
+        </w:rPr>
+        <w:lastRenderedPageBreak/>
+        <w:t>interface</w:t>
       </w:r>
       <w:r>
         <w:rPr>
@@ -11408,7 +11409,6 @@
         <w:rPr>
           <w:rFonts w:cs="Times New Roman"/>
         </w:rPr>
-        <w:lastRenderedPageBreak/>
         <w:t xml:space="preserve">These two conditions limit </w:t>
       </w:r>
       <w:r>
@@ -13804,7 +13804,14 @@
         <w:rPr>
           <w:rFonts w:cs="Times New Roman"/>
         </w:rPr>
-        <w:t xml:space="preserve"> is the effective reflectance index of only </w:t>
+        <w:t xml:space="preserve"> is the effective reflectance </w:t>
+      </w:r>
+      <w:r>
+        <w:rPr>
+          <w:rFonts w:cs="Times New Roman"/>
+        </w:rPr>
+        <w:lastRenderedPageBreak/>
+        <w:t xml:space="preserve">index of only </w:t>
       </w:r>
       <w:r>
         <w:rPr>
@@ -13989,7 +13996,6 @@
         <w:rPr>
           <w:rFonts w:cs="Times New Roman"/>
         </w:rPr>
-        <w:lastRenderedPageBreak/>
         <w:tab/>
       </w:r>
       <m:oMath>
@@ -17270,11 +17276,19 @@
         </w:rPr>
         <w:t xml:space="preserve"> </w:t>
       </w:r>
-      <w:r>
-        <w:rPr>
-          <w:rFonts w:cs="Times New Roman"/>
-        </w:rPr>
-        <w:t>refractive ind</w:t>
+      <w:proofErr w:type="gramStart"/>
+      <w:r>
+        <w:rPr>
+          <w:rFonts w:cs="Times New Roman"/>
+        </w:rPr>
+        <w:t>refractive</w:t>
+      </w:r>
+      <w:proofErr w:type="gramEnd"/>
+      <w:r>
+        <w:rPr>
+          <w:rFonts w:cs="Times New Roman"/>
+        </w:rPr>
+        <w:t xml:space="preserve"> ind</w:t>
       </w:r>
       <w:r>
         <w:rPr>

</xml_diff>

<commit_message>
Correct figure 3, 4
Rejected from Opt. Express
</commit_message>
<xml_diff>
--- a/paper/[Opt. Express] Design and Simulation of a Broadband Tunable Transmittance Optical Filter Using Sb2Se3 Phase Change Material.docx
+++ b/paper/[Opt. Express] Design and Simulation of a Broadband Tunable Transmittance Optical Filter Using Sb2Se3 Phase Change Material.docx
@@ -25931,7 +25931,36 @@
                 <w:bCs w:val="0"/>
                 <w:szCs w:val="16"/>
               </w:rPr>
-              <w:t>SbSe</w:t>
+              <w:t>Sb</w:t>
+            </w:r>
+            <w:r>
+              <w:rPr>
+                <w:rFonts w:cs="Times New Roman"/>
+                <w:b w:val="0"/>
+                <w:bCs w:val="0"/>
+                <w:szCs w:val="16"/>
+                <w:vertAlign w:val="subscript"/>
+              </w:rPr>
+              <w:t>2</w:t>
+            </w:r>
+            <w:r>
+              <w:rPr>
+                <w:rFonts w:cs="Times New Roman"/>
+                <w:b w:val="0"/>
+                <w:bCs w:val="0"/>
+                <w:szCs w:val="16"/>
+              </w:rPr>
+              <w:t>Se</w:t>
+            </w:r>
+            <w:r>
+              <w:rPr>
+                <w:rFonts w:cs="Times New Roman"/>
+                <w:b w:val="0"/>
+                <w:bCs w:val="0"/>
+                <w:szCs w:val="16"/>
+                <w:vertAlign w:val="subscript"/>
+              </w:rPr>
+              <w:t>3</w:t>
             </w:r>
             <w:r>
               <w:rPr>
@@ -29582,10 +29611,16 @@
           <w:iCs/>
           <w:vertAlign w:val="subscript"/>
         </w:rPr>
-        <w:t xml:space="preserve">VO2, metallic </w:t>
-      </w:r>
-      <w:r>
-        <w:t xml:space="preserve"> =1.4580).</w:t>
+        <w:t>VO2, metallic</w:t>
+      </w:r>
+      <w:r>
+        <w:t xml:space="preserve"> =</w:t>
+      </w:r>
+      <w:r>
+        <w:t xml:space="preserve"> </w:t>
+      </w:r>
+      <w:r>
+        <w:t>1.4580).</w:t>
       </w:r>
       <w:r>
         <w:t xml:space="preserve"> These are illustrated in Fig. 6,</w:t>

</xml_diff>